<commit_message>
Record the verified platform run in the docs, report and deck
</commit_message>
<xml_diff>
--- a/deliverables/FraudLens_Final_Report.docx
+++ b/deliverables/FraudLens_Final_Report.docx
@@ -102,7 +102,7 @@
           <w:sz w:val="22"/>
           <w:szCs w:val="22"/>
         </w:rPr>
-        <w:t xml:space="preserve">17 October 2026</w:t>
+        <w:t xml:space="preserve">20 October 2026</w:t>
       </w:r>
     </w:p>
     <w:p>
@@ -11023,11 +11023,599 @@
     </w:p>
     <w:p>
       <w:pPr>
+        <w:spacing w:after="80" w:before="160"/>
+      </w:pPr>
+      <w:r>
+        <w:rPr>
+          <w:i/>
+          <w:iCs/>
+          <w:color w:val="444444"/>
+          <w:sz w:val="19"/>
+          <w:szCs w:val="19"/>
+        </w:rPr>
+        <w:t xml:space="preserve">Table 13. Same questions, two engines (median of five runs; platform workflow run 39430878611, sample data on a GitHub runner).</w:t>
+      </w:r>
+    </w:p>
+    <w:tbl>
+      <w:tblPr>
+        <w:tblW w:type="dxa" w:w="9360"/>
+        <w:tblBorders>
+          <w:top w:val="single" w:color="auto" w:sz="4"/>
+          <w:left w:val="single" w:color="auto" w:sz="4"/>
+          <w:bottom w:val="single" w:color="auto" w:sz="4"/>
+          <w:right w:val="single" w:color="auto" w:sz="4"/>
+          <w:insideH w:val="single" w:color="auto" w:sz="4"/>
+          <w:insideV w:val="single" w:color="auto" w:sz="4"/>
+        </w:tblBorders>
+      </w:tblPr>
+      <w:tblGrid>
+        <w:gridCol w:w="5040"/>
+        <w:gridCol w:w="1440"/>
+        <w:gridCol w:w="1440"/>
+        <w:gridCol w:w="1440"/>
+      </w:tblGrid>
+      <w:tr>
+        <w:trPr>
+          <w:tblHeader/>
+        </w:trPr>
+        <w:tc>
+          <w:tcPr>
+            <w:tcW w:type="dxa" w:w="5040"/>
+            <w:shd w:fill="DCE6F1" w:color="auto" w:val="clear"/>
+            <w:tcMar>
+              <w:top w:type="dxa" w:w="50"/>
+              <w:left w:type="dxa" w:w="80"/>
+              <w:bottom w:type="dxa" w:w="50"/>
+              <w:right w:type="dxa" w:w="80"/>
+            </w:tcMar>
+          </w:tcPr>
+          <w:p>
+            <w:pPr>
+              <w:spacing w:after="0" w:line="240"/>
+              <w:jc w:val="left"/>
+            </w:pPr>
+            <w:r>
+              <w:rPr>
+                <w:b/>
+                <w:bCs/>
+                <w:sz w:val="18"/>
+                <w:szCs w:val="18"/>
+              </w:rPr>
+              <w:t xml:space="preserve">Question</w:t>
+            </w:r>
+          </w:p>
+        </w:tc>
+        <w:tc>
+          <w:tcPr>
+            <w:tcW w:type="dxa" w:w="1440"/>
+            <w:shd w:fill="DCE6F1" w:color="auto" w:val="clear"/>
+            <w:tcMar>
+              <w:top w:type="dxa" w:w="50"/>
+              <w:left w:type="dxa" w:w="80"/>
+              <w:bottom w:type="dxa" w:w="50"/>
+              <w:right w:type="dxa" w:w="80"/>
+            </w:tcMar>
+          </w:tcPr>
+          <w:p>
+            <w:pPr>
+              <w:spacing w:after="0" w:line="240"/>
+              <w:jc w:val="left"/>
+            </w:pPr>
+            <w:r>
+              <w:rPr>
+                <w:b/>
+                <w:bCs/>
+                <w:sz w:val="18"/>
+                <w:szCs w:val="18"/>
+              </w:rPr>
+              <w:t xml:space="preserve">Trino (ms)</w:t>
+            </w:r>
+          </w:p>
+        </w:tc>
+        <w:tc>
+          <w:tcPr>
+            <w:tcW w:type="dxa" w:w="1440"/>
+            <w:shd w:fill="DCE6F1" w:color="auto" w:val="clear"/>
+            <w:tcMar>
+              <w:top w:type="dxa" w:w="50"/>
+              <w:left w:type="dxa" w:w="80"/>
+              <w:bottom w:type="dxa" w:w="50"/>
+              <w:right w:type="dxa" w:w="80"/>
+            </w:tcMar>
+          </w:tcPr>
+          <w:p>
+            <w:pPr>
+              <w:spacing w:after="0" w:line="240"/>
+              <w:jc w:val="left"/>
+            </w:pPr>
+            <w:r>
+              <w:rPr>
+                <w:b/>
+                <w:bCs/>
+                <w:sz w:val="18"/>
+                <w:szCs w:val="18"/>
+              </w:rPr>
+              <w:t xml:space="preserve">ClickHouse (ms)</w:t>
+            </w:r>
+          </w:p>
+        </w:tc>
+        <w:tc>
+          <w:tcPr>
+            <w:tcW w:type="dxa" w:w="1440"/>
+            <w:shd w:fill="DCE6F1" w:color="auto" w:val="clear"/>
+            <w:tcMar>
+              <w:top w:type="dxa" w:w="50"/>
+              <w:left w:type="dxa" w:w="80"/>
+              <w:bottom w:type="dxa" w:w="50"/>
+              <w:right w:type="dxa" w:w="80"/>
+            </w:tcMar>
+          </w:tcPr>
+          <w:p>
+            <w:pPr>
+              <w:spacing w:after="0" w:line="240"/>
+              <w:jc w:val="left"/>
+            </w:pPr>
+            <w:r>
+              <w:rPr>
+                <w:b/>
+                <w:bCs/>
+                <w:sz w:val="18"/>
+                <w:szCs w:val="18"/>
+              </w:rPr>
+              <w:t xml:space="preserve">Answers agree</w:t>
+            </w:r>
+          </w:p>
+        </w:tc>
+      </w:tr>
+      <w:tr>
+        <w:tc>
+          <w:tcPr>
+            <w:tcW w:type="dxa" w:w="5040"/>
+            <w:tcMar>
+              <w:top w:type="dxa" w:w="50"/>
+              <w:left w:type="dxa" w:w="80"/>
+              <w:bottom w:type="dxa" w:w="50"/>
+              <w:right w:type="dxa" w:w="80"/>
+            </w:tcMar>
+          </w:tcPr>
+          <w:p>
+            <w:pPr>
+              <w:spacing w:after="0" w:line="240"/>
+              <w:jc w:val="left"/>
+            </w:pPr>
+            <w:r>
+              <w:rPr>
+                <w:b w:val="false"/>
+                <w:bCs w:val="false"/>
+                <w:sz w:val="18"/>
+                <w:szCs w:val="18"/>
+              </w:rPr>
+              <w:t xml:space="preserve">Daily caught, false and missed alerts</w:t>
+            </w:r>
+          </w:p>
+        </w:tc>
+        <w:tc>
+          <w:tcPr>
+            <w:tcW w:type="dxa" w:w="1440"/>
+            <w:tcMar>
+              <w:top w:type="dxa" w:w="50"/>
+              <w:left w:type="dxa" w:w="80"/>
+              <w:bottom w:type="dxa" w:w="50"/>
+              <w:right w:type="dxa" w:w="80"/>
+            </w:tcMar>
+          </w:tcPr>
+          <w:p>
+            <w:pPr>
+              <w:spacing w:after="0" w:line="240"/>
+              <w:jc w:val="right"/>
+            </w:pPr>
+            <w:r>
+              <w:rPr>
+                <w:b w:val="false"/>
+                <w:bCs w:val="false"/>
+                <w:sz w:val="18"/>
+                <w:szCs w:val="18"/>
+              </w:rPr>
+              <w:t xml:space="preserve">292.6</w:t>
+            </w:r>
+          </w:p>
+        </w:tc>
+        <w:tc>
+          <w:tcPr>
+            <w:tcW w:type="dxa" w:w="1440"/>
+            <w:tcMar>
+              <w:top w:type="dxa" w:w="50"/>
+              <w:left w:type="dxa" w:w="80"/>
+              <w:bottom w:type="dxa" w:w="50"/>
+              <w:right w:type="dxa" w:w="80"/>
+            </w:tcMar>
+          </w:tcPr>
+          <w:p>
+            <w:pPr>
+              <w:spacing w:after="0" w:line="240"/>
+              <w:jc w:val="right"/>
+            </w:pPr>
+            <w:r>
+              <w:rPr>
+                <w:b w:val="false"/>
+                <w:bCs w:val="false"/>
+                <w:sz w:val="18"/>
+                <w:szCs w:val="18"/>
+              </w:rPr>
+              <w:t xml:space="preserve">14.8</w:t>
+            </w:r>
+          </w:p>
+        </w:tc>
+        <w:tc>
+          <w:tcPr>
+            <w:tcW w:type="dxa" w:w="1440"/>
+            <w:tcMar>
+              <w:top w:type="dxa" w:w="50"/>
+              <w:left w:type="dxa" w:w="80"/>
+              <w:bottom w:type="dxa" w:w="50"/>
+              <w:right w:type="dxa" w:w="80"/>
+            </w:tcMar>
+          </w:tcPr>
+          <w:p>
+            <w:pPr>
+              <w:spacing w:after="0" w:line="240"/>
+              <w:jc w:val="left"/>
+            </w:pPr>
+            <w:r>
+              <w:rPr>
+                <w:b w:val="false"/>
+                <w:bCs w:val="false"/>
+                <w:sz w:val="18"/>
+                <w:szCs w:val="18"/>
+              </w:rPr>
+              <w:t xml:space="preserve">Yes</w:t>
+            </w:r>
+          </w:p>
+        </w:tc>
+      </w:tr>
+      <w:tr>
+        <w:tc>
+          <w:tcPr>
+            <w:tcW w:type="dxa" w:w="5040"/>
+            <w:tcMar>
+              <w:top w:type="dxa" w:w="50"/>
+              <w:left w:type="dxa" w:w="80"/>
+              <w:bottom w:type="dxa" w:w="50"/>
+              <w:right w:type="dxa" w:w="80"/>
+            </w:tcMar>
+          </w:tcPr>
+          <w:p>
+            <w:pPr>
+              <w:spacing w:after="0" w:line="240"/>
+              <w:jc w:val="left"/>
+            </w:pPr>
+            <w:r>
+              <w:rPr>
+                <w:b w:val="false"/>
+                <w:bCs w:val="false"/>
+                <w:sz w:val="18"/>
+                <w:szCs w:val="18"/>
+              </w:rPr>
+              <w:t xml:space="preserve">Fraud and alerts by category and hour</w:t>
+            </w:r>
+          </w:p>
+        </w:tc>
+        <w:tc>
+          <w:tcPr>
+            <w:tcW w:type="dxa" w:w="1440"/>
+            <w:tcMar>
+              <w:top w:type="dxa" w:w="50"/>
+              <w:left w:type="dxa" w:w="80"/>
+              <w:bottom w:type="dxa" w:w="50"/>
+              <w:right w:type="dxa" w:w="80"/>
+            </w:tcMar>
+          </w:tcPr>
+          <w:p>
+            <w:pPr>
+              <w:spacing w:after="0" w:line="240"/>
+              <w:jc w:val="right"/>
+            </w:pPr>
+            <w:r>
+              <w:rPr>
+                <w:b w:val="false"/>
+                <w:bCs w:val="false"/>
+                <w:sz w:val="18"/>
+                <w:szCs w:val="18"/>
+              </w:rPr>
+              <w:t xml:space="preserve">225.6</w:t>
+            </w:r>
+          </w:p>
+        </w:tc>
+        <w:tc>
+          <w:tcPr>
+            <w:tcW w:type="dxa" w:w="1440"/>
+            <w:tcMar>
+              <w:top w:type="dxa" w:w="50"/>
+              <w:left w:type="dxa" w:w="80"/>
+              <w:bottom w:type="dxa" w:w="50"/>
+              <w:right w:type="dxa" w:w="80"/>
+            </w:tcMar>
+          </w:tcPr>
+          <w:p>
+            <w:pPr>
+              <w:spacing w:after="0" w:line="240"/>
+              <w:jc w:val="right"/>
+            </w:pPr>
+            <w:r>
+              <w:rPr>
+                <w:b w:val="false"/>
+                <w:bCs w:val="false"/>
+                <w:sz w:val="18"/>
+                <w:szCs w:val="18"/>
+              </w:rPr>
+              <w:t xml:space="preserve">16.3</w:t>
+            </w:r>
+          </w:p>
+        </w:tc>
+        <w:tc>
+          <w:tcPr>
+            <w:tcW w:type="dxa" w:w="1440"/>
+            <w:tcMar>
+              <w:top w:type="dxa" w:w="50"/>
+              <w:left w:type="dxa" w:w="80"/>
+              <w:bottom w:type="dxa" w:w="50"/>
+              <w:right w:type="dxa" w:w="80"/>
+            </w:tcMar>
+          </w:tcPr>
+          <w:p>
+            <w:pPr>
+              <w:spacing w:after="0" w:line="240"/>
+              <w:jc w:val="left"/>
+            </w:pPr>
+            <w:r>
+              <w:rPr>
+                <w:b w:val="false"/>
+                <w:bCs w:val="false"/>
+                <w:sz w:val="18"/>
+                <w:szCs w:val="18"/>
+              </w:rPr>
+              <w:t xml:space="preserve">Yes</w:t>
+            </w:r>
+          </w:p>
+        </w:tc>
+      </w:tr>
+      <w:tr>
+        <w:tc>
+          <w:tcPr>
+            <w:tcW w:type="dxa" w:w="5040"/>
+            <w:tcMar>
+              <w:top w:type="dxa" w:w="50"/>
+              <w:left w:type="dxa" w:w="80"/>
+              <w:bottom w:type="dxa" w:w="50"/>
+              <w:right w:type="dxa" w:w="80"/>
+            </w:tcMar>
+          </w:tcPr>
+          <w:p>
+            <w:pPr>
+              <w:spacing w:after="0" w:line="240"/>
+              <w:jc w:val="left"/>
+            </w:pPr>
+            <w:r>
+              <w:rPr>
+                <w:b w:val="false"/>
+                <w:bCs w:val="false"/>
+                <w:sz w:val="18"/>
+                <w:szCs w:val="18"/>
+              </w:rPr>
+              <w:t xml:space="preserve">Merchants with the most missed fraud</w:t>
+            </w:r>
+          </w:p>
+        </w:tc>
+        <w:tc>
+          <w:tcPr>
+            <w:tcW w:type="dxa" w:w="1440"/>
+            <w:tcMar>
+              <w:top w:type="dxa" w:w="50"/>
+              <w:left w:type="dxa" w:w="80"/>
+              <w:bottom w:type="dxa" w:w="50"/>
+              <w:right w:type="dxa" w:w="80"/>
+            </w:tcMar>
+          </w:tcPr>
+          <w:p>
+            <w:pPr>
+              <w:spacing w:after="0" w:line="240"/>
+              <w:jc w:val="right"/>
+            </w:pPr>
+            <w:r>
+              <w:rPr>
+                <w:b w:val="false"/>
+                <w:bCs w:val="false"/>
+                <w:sz w:val="18"/>
+                <w:szCs w:val="18"/>
+              </w:rPr>
+              <w:t xml:space="preserve">212</w:t>
+            </w:r>
+          </w:p>
+        </w:tc>
+        <w:tc>
+          <w:tcPr>
+            <w:tcW w:type="dxa" w:w="1440"/>
+            <w:tcMar>
+              <w:top w:type="dxa" w:w="50"/>
+              <w:left w:type="dxa" w:w="80"/>
+              <w:bottom w:type="dxa" w:w="50"/>
+              <w:right w:type="dxa" w:w="80"/>
+            </w:tcMar>
+          </w:tcPr>
+          <w:p>
+            <w:pPr>
+              <w:spacing w:after="0" w:line="240"/>
+              <w:jc w:val="right"/>
+            </w:pPr>
+            <w:r>
+              <w:rPr>
+                <w:b w:val="false"/>
+                <w:bCs w:val="false"/>
+                <w:sz w:val="18"/>
+                <w:szCs w:val="18"/>
+              </w:rPr>
+              <w:t xml:space="preserve">10.6</w:t>
+            </w:r>
+          </w:p>
+        </w:tc>
+        <w:tc>
+          <w:tcPr>
+            <w:tcW w:type="dxa" w:w="1440"/>
+            <w:tcMar>
+              <w:top w:type="dxa" w:w="50"/>
+              <w:left w:type="dxa" w:w="80"/>
+              <w:bottom w:type="dxa" w:w="50"/>
+              <w:right w:type="dxa" w:w="80"/>
+            </w:tcMar>
+          </w:tcPr>
+          <w:p>
+            <w:pPr>
+              <w:spacing w:after="0" w:line="240"/>
+              <w:jc w:val="left"/>
+            </w:pPr>
+            <w:r>
+              <w:rPr>
+                <w:b w:val="false"/>
+                <w:bCs w:val="false"/>
+                <w:sz w:val="18"/>
+                <w:szCs w:val="18"/>
+              </w:rPr>
+              <w:t xml:space="preserve">Yes</w:t>
+            </w:r>
+          </w:p>
+        </w:tc>
+      </w:tr>
+      <w:tr>
+        <w:tc>
+          <w:tcPr>
+            <w:tcW w:type="dxa" w:w="5040"/>
+            <w:tcMar>
+              <w:top w:type="dxa" w:w="50"/>
+              <w:left w:type="dxa" w:w="80"/>
+              <w:bottom w:type="dxa" w:w="50"/>
+              <w:right w:type="dxa" w:w="80"/>
+            </w:tcMar>
+          </w:tcPr>
+          <w:p>
+            <w:pPr>
+              <w:spacing w:after="0" w:line="240"/>
+              <w:jc w:val="left"/>
+            </w:pPr>
+            <w:r>
+              <w:rPr>
+                <w:b w:val="false"/>
+                <w:bCs w:val="false"/>
+                <w:sz w:val="18"/>
+                <w:szCs w:val="18"/>
+              </w:rPr>
+              <w:t xml:space="preserve">Alert precision by state</w:t>
+            </w:r>
+          </w:p>
+        </w:tc>
+        <w:tc>
+          <w:tcPr>
+            <w:tcW w:type="dxa" w:w="1440"/>
+            <w:tcMar>
+              <w:top w:type="dxa" w:w="50"/>
+              <w:left w:type="dxa" w:w="80"/>
+              <w:bottom w:type="dxa" w:w="50"/>
+              <w:right w:type="dxa" w:w="80"/>
+            </w:tcMar>
+          </w:tcPr>
+          <w:p>
+            <w:pPr>
+              <w:spacing w:after="0" w:line="240"/>
+              <w:jc w:val="right"/>
+            </w:pPr>
+            <w:r>
+              <w:rPr>
+                <w:b w:val="false"/>
+                <w:bCs w:val="false"/>
+                <w:sz w:val="18"/>
+                <w:szCs w:val="18"/>
+              </w:rPr>
+              <w:t xml:space="preserve">232.3</w:t>
+            </w:r>
+          </w:p>
+        </w:tc>
+        <w:tc>
+          <w:tcPr>
+            <w:tcW w:type="dxa" w:w="1440"/>
+            <w:tcMar>
+              <w:top w:type="dxa" w:w="50"/>
+              <w:left w:type="dxa" w:w="80"/>
+              <w:bottom w:type="dxa" w:w="50"/>
+              <w:right w:type="dxa" w:w="80"/>
+            </w:tcMar>
+          </w:tcPr>
+          <w:p>
+            <w:pPr>
+              <w:spacing w:after="0" w:line="240"/>
+              <w:jc w:val="right"/>
+            </w:pPr>
+            <w:r>
+              <w:rPr>
+                <w:b w:val="false"/>
+                <w:bCs w:val="false"/>
+                <w:sz w:val="18"/>
+                <w:szCs w:val="18"/>
+              </w:rPr>
+              <w:t xml:space="preserve">9.9</w:t>
+            </w:r>
+          </w:p>
+        </w:tc>
+        <w:tc>
+          <w:tcPr>
+            <w:tcW w:type="dxa" w:w="1440"/>
+            <w:tcMar>
+              <w:top w:type="dxa" w:w="50"/>
+              <w:left w:type="dxa" w:w="80"/>
+              <w:bottom w:type="dxa" w:w="50"/>
+              <w:right w:type="dxa" w:w="80"/>
+            </w:tcMar>
+          </w:tcPr>
+          <w:p>
+            <w:pPr>
+              <w:spacing w:after="0" w:line="240"/>
+              <w:jc w:val="left"/>
+            </w:pPr>
+            <w:r>
+              <w:rPr>
+                <w:b w:val="false"/>
+                <w:bCs w:val="false"/>
+                <w:sz w:val="18"/>
+                <w:szCs w:val="18"/>
+              </w:rPr>
+              <w:t xml:space="preserve">Yes</w:t>
+            </w:r>
+          </w:p>
+        </w:tc>
+      </w:tr>
+    </w:tbl>
+    <w:p>
+      <w:pPr>
+        <w:spacing w:after="120"/>
+      </w:pPr>
+    </w:p>
+    <w:p>
+      <w:pPr>
         <w:pStyle w:val="Heading2"/>
         <w:spacing w:after="120" w:before="260"/>
       </w:pPr>
       <w:r>
-        <w:t xml:space="preserve">8.4 Deployment</w:t>
+        <w:t xml:space="preserve">8.4 The platform, verified end to end</w:t>
+      </w:r>
+    </w:p>
+    <w:p>
+      <w:pPr>
+        <w:spacing w:after="140" w:line="276"/>
+      </w:pPr>
+      <w:r>
+        <w:rPr>
+          <w:sz w:val="22"/>
+          <w:szCs w:val="22"/>
+        </w:rPr>
+        <w:t xml:space="preserve">The platform workflow starts every service on a GitHub runner, runs the whole lifecycle on synthetic sample data through NiFi, the lake, the crawler, Trino and ClickHouse, then checks each component. Run 39430878611 (commit a5c7b0d) passed 14 of 14 smoke checks; its governance job catalogued 13 tables and views in OpenMetadata 1.13.4, tagged 29 PII columns and recorded 9 lineage edges from raw to gold.</w:t>
       </w:r>
     </w:p>
     <w:p>
@@ -11042,7 +11630,1260 @@
           <w:sz w:val="19"/>
           <w:szCs w:val="19"/>
         </w:rPr>
-        <w:t xml:space="preserve">Table 13. Deployment targets.</w:t>
+        <w:t xml:space="preserve">Table 14. Platform smoke checks (platform workflow).</w:t>
+      </w:r>
+    </w:p>
+    <w:tbl>
+      <w:tblPr>
+        <w:tblW w:type="dxa" w:w="9360"/>
+        <w:tblBorders>
+          <w:top w:val="single" w:color="auto" w:sz="4"/>
+          <w:left w:val="single" w:color="auto" w:sz="4"/>
+          <w:bottom w:val="single" w:color="auto" w:sz="4"/>
+          <w:right w:val="single" w:color="auto" w:sz="4"/>
+          <w:insideH w:val="single" w:color="auto" w:sz="4"/>
+          <w:insideV w:val="single" w:color="auto" w:sz="4"/>
+        </w:tblBorders>
+      </w:tblPr>
+      <w:tblGrid>
+        <w:gridCol w:w="1440"/>
+        <w:gridCol w:w="6480"/>
+        <w:gridCol w:w="1440"/>
+      </w:tblGrid>
+      <w:tr>
+        <w:trPr>
+          <w:tblHeader/>
+        </w:trPr>
+        <w:tc>
+          <w:tcPr>
+            <w:tcW w:type="dxa" w:w="1440"/>
+            <w:shd w:fill="DCE6F1" w:color="auto" w:val="clear"/>
+            <w:tcMar>
+              <w:top w:type="dxa" w:w="50"/>
+              <w:left w:type="dxa" w:w="80"/>
+              <w:bottom w:type="dxa" w:w="50"/>
+              <w:right w:type="dxa" w:w="80"/>
+            </w:tcMar>
+          </w:tcPr>
+          <w:p>
+            <w:pPr>
+              <w:spacing w:after="0" w:line="240"/>
+              <w:jc w:val="left"/>
+            </w:pPr>
+            <w:r>
+              <w:rPr>
+                <w:b/>
+                <w:bCs/>
+                <w:sz w:val="18"/>
+                <w:szCs w:val="18"/>
+              </w:rPr>
+              <w:t xml:space="preserve">Component</w:t>
+            </w:r>
+          </w:p>
+        </w:tc>
+        <w:tc>
+          <w:tcPr>
+            <w:tcW w:type="dxa" w:w="6480"/>
+            <w:shd w:fill="DCE6F1" w:color="auto" w:val="clear"/>
+            <w:tcMar>
+              <w:top w:type="dxa" w:w="50"/>
+              <w:left w:type="dxa" w:w="80"/>
+              <w:bottom w:type="dxa" w:w="50"/>
+              <w:right w:type="dxa" w:w="80"/>
+            </w:tcMar>
+          </w:tcPr>
+          <w:p>
+            <w:pPr>
+              <w:spacing w:after="0" w:line="240"/>
+              <w:jc w:val="left"/>
+            </w:pPr>
+            <w:r>
+              <w:rPr>
+                <w:b/>
+                <w:bCs/>
+                <w:sz w:val="18"/>
+                <w:szCs w:val="18"/>
+              </w:rPr>
+              <w:t xml:space="preserve">Check</w:t>
+            </w:r>
+          </w:p>
+        </w:tc>
+        <w:tc>
+          <w:tcPr>
+            <w:tcW w:type="dxa" w:w="1440"/>
+            <w:shd w:fill="DCE6F1" w:color="auto" w:val="clear"/>
+            <w:tcMar>
+              <w:top w:type="dxa" w:w="50"/>
+              <w:left w:type="dxa" w:w="80"/>
+              <w:bottom w:type="dxa" w:w="50"/>
+              <w:right w:type="dxa" w:w="80"/>
+            </w:tcMar>
+          </w:tcPr>
+          <w:p>
+            <w:pPr>
+              <w:spacing w:after="0" w:line="240"/>
+              <w:jc w:val="left"/>
+            </w:pPr>
+            <w:r>
+              <w:rPr>
+                <w:b/>
+                <w:bCs/>
+                <w:sz w:val="18"/>
+                <w:szCs w:val="18"/>
+              </w:rPr>
+              <w:t xml:space="preserve">Result</w:t>
+            </w:r>
+          </w:p>
+        </w:tc>
+      </w:tr>
+      <w:tr>
+        <w:tc>
+          <w:tcPr>
+            <w:tcW w:type="dxa" w:w="1440"/>
+            <w:tcMar>
+              <w:top w:type="dxa" w:w="50"/>
+              <w:left w:type="dxa" w:w="80"/>
+              <w:bottom w:type="dxa" w:w="50"/>
+              <w:right w:type="dxa" w:w="80"/>
+            </w:tcMar>
+          </w:tcPr>
+          <w:p>
+            <w:pPr>
+              <w:spacing w:after="0" w:line="240"/>
+              <w:jc w:val="left"/>
+            </w:pPr>
+            <w:r>
+              <w:rPr>
+                <w:b w:val="false"/>
+                <w:bCs w:val="false"/>
+                <w:sz w:val="18"/>
+                <w:szCs w:val="18"/>
+              </w:rPr>
+              <w:t xml:space="preserve">lake</w:t>
+            </w:r>
+          </w:p>
+        </w:tc>
+        <w:tc>
+          <w:tcPr>
+            <w:tcW w:type="dxa" w:w="6480"/>
+            <w:tcMar>
+              <w:top w:type="dxa" w:w="50"/>
+              <w:left w:type="dxa" w:w="80"/>
+              <w:bottom w:type="dxa" w:w="50"/>
+              <w:right w:type="dxa" w:w="80"/>
+            </w:tcMar>
+          </w:tcPr>
+          <w:p>
+            <w:pPr>
+              <w:spacing w:after="0" w:line="240"/>
+              <w:jc w:val="left"/>
+            </w:pPr>
+            <w:r>
+              <w:rPr>
+                <w:b w:val="false"/>
+                <w:bCs w:val="false"/>
+                <w:sz w:val="18"/>
+                <w:szCs w:val="18"/>
+              </w:rPr>
+              <w:t xml:space="preserve">three layer buckets exist</w:t>
+            </w:r>
+          </w:p>
+        </w:tc>
+        <w:tc>
+          <w:tcPr>
+            <w:tcW w:type="dxa" w:w="1440"/>
+            <w:tcMar>
+              <w:top w:type="dxa" w:w="50"/>
+              <w:left w:type="dxa" w:w="80"/>
+              <w:bottom w:type="dxa" w:w="50"/>
+              <w:right w:type="dxa" w:w="80"/>
+            </w:tcMar>
+          </w:tcPr>
+          <w:p>
+            <w:pPr>
+              <w:spacing w:after="0" w:line="240"/>
+              <w:jc w:val="left"/>
+            </w:pPr>
+            <w:r>
+              <w:rPr>
+                <w:b w:val="false"/>
+                <w:bCs w:val="false"/>
+                <w:sz w:val="18"/>
+                <w:szCs w:val="18"/>
+              </w:rPr>
+              <w:t xml:space="preserve">Pass</w:t>
+            </w:r>
+          </w:p>
+        </w:tc>
+      </w:tr>
+      <w:tr>
+        <w:tc>
+          <w:tcPr>
+            <w:tcW w:type="dxa" w:w="1440"/>
+            <w:tcMar>
+              <w:top w:type="dxa" w:w="50"/>
+              <w:left w:type="dxa" w:w="80"/>
+              <w:bottom w:type="dxa" w:w="50"/>
+              <w:right w:type="dxa" w:w="80"/>
+            </w:tcMar>
+          </w:tcPr>
+          <w:p>
+            <w:pPr>
+              <w:spacing w:after="0" w:line="240"/>
+              <w:jc w:val="left"/>
+            </w:pPr>
+            <w:r>
+              <w:rPr>
+                <w:b w:val="false"/>
+                <w:bCs w:val="false"/>
+                <w:sz w:val="18"/>
+                <w:szCs w:val="18"/>
+              </w:rPr>
+              <w:t xml:space="preserve">lake</w:t>
+            </w:r>
+          </w:p>
+        </w:tc>
+        <w:tc>
+          <w:tcPr>
+            <w:tcW w:type="dxa" w:w="6480"/>
+            <w:tcMar>
+              <w:top w:type="dxa" w:w="50"/>
+              <w:left w:type="dxa" w:w="80"/>
+              <w:bottom w:type="dxa" w:w="50"/>
+              <w:right w:type="dxa" w:w="80"/>
+            </w:tcMar>
+          </w:tcPr>
+          <w:p>
+            <w:pPr>
+              <w:spacing w:after="0" w:line="240"/>
+              <w:jc w:val="left"/>
+            </w:pPr>
+            <w:r>
+              <w:rPr>
+                <w:b w:val="false"/>
+                <w:bCs w:val="false"/>
+                <w:sz w:val="18"/>
+                <w:szCs w:val="18"/>
+              </w:rPr>
+              <w:t xml:space="preserve">raw CSVs, silver and gold tables are in the lake</w:t>
+            </w:r>
+          </w:p>
+        </w:tc>
+        <w:tc>
+          <w:tcPr>
+            <w:tcW w:type="dxa" w:w="1440"/>
+            <w:tcMar>
+              <w:top w:type="dxa" w:w="50"/>
+              <w:left w:type="dxa" w:w="80"/>
+              <w:bottom w:type="dxa" w:w="50"/>
+              <w:right w:type="dxa" w:w="80"/>
+            </w:tcMar>
+          </w:tcPr>
+          <w:p>
+            <w:pPr>
+              <w:spacing w:after="0" w:line="240"/>
+              <w:jc w:val="left"/>
+            </w:pPr>
+            <w:r>
+              <w:rPr>
+                <w:b w:val="false"/>
+                <w:bCs w:val="false"/>
+                <w:sz w:val="18"/>
+                <w:szCs w:val="18"/>
+              </w:rPr>
+              <w:t xml:space="preserve">Pass</w:t>
+            </w:r>
+          </w:p>
+        </w:tc>
+      </w:tr>
+      <w:tr>
+        <w:tc>
+          <w:tcPr>
+            <w:tcW w:type="dxa" w:w="1440"/>
+            <w:tcMar>
+              <w:top w:type="dxa" w:w="50"/>
+              <w:left w:type="dxa" w:w="80"/>
+              <w:bottom w:type="dxa" w:w="50"/>
+              <w:right w:type="dxa" w:w="80"/>
+            </w:tcMar>
+          </w:tcPr>
+          <w:p>
+            <w:pPr>
+              <w:spacing w:after="0" w:line="240"/>
+              <w:jc w:val="left"/>
+            </w:pPr>
+            <w:r>
+              <w:rPr>
+                <w:b w:val="false"/>
+                <w:bCs w:val="false"/>
+                <w:sz w:val="18"/>
+                <w:szCs w:val="18"/>
+              </w:rPr>
+              <w:t xml:space="preserve">lake</w:t>
+            </w:r>
+          </w:p>
+        </w:tc>
+        <w:tc>
+          <w:tcPr>
+            <w:tcW w:type="dxa" w:w="6480"/>
+            <w:tcMar>
+              <w:top w:type="dxa" w:w="50"/>
+              <w:left w:type="dxa" w:w="80"/>
+              <w:bottom w:type="dxa" w:w="50"/>
+              <w:right w:type="dxa" w:w="80"/>
+            </w:tcMar>
+          </w:tcPr>
+          <w:p>
+            <w:pPr>
+              <w:spacing w:after="0" w:line="240"/>
+              <w:jc w:val="left"/>
+            </w:pPr>
+            <w:r>
+              <w:rPr>
+                <w:b w:val="false"/>
+                <w:bCs w:val="false"/>
+                <w:sz w:val="18"/>
+                <w:szCs w:val="18"/>
+              </w:rPr>
+              <w:t xml:space="preserve">analyst account cannot read the raw layer (least privilege)</w:t>
+            </w:r>
+          </w:p>
+        </w:tc>
+        <w:tc>
+          <w:tcPr>
+            <w:tcW w:type="dxa" w:w="1440"/>
+            <w:tcMar>
+              <w:top w:type="dxa" w:w="50"/>
+              <w:left w:type="dxa" w:w="80"/>
+              <w:bottom w:type="dxa" w:w="50"/>
+              <w:right w:type="dxa" w:w="80"/>
+            </w:tcMar>
+          </w:tcPr>
+          <w:p>
+            <w:pPr>
+              <w:spacing w:after="0" w:line="240"/>
+              <w:jc w:val="left"/>
+            </w:pPr>
+            <w:r>
+              <w:rPr>
+                <w:b w:val="false"/>
+                <w:bCs w:val="false"/>
+                <w:sz w:val="18"/>
+                <w:szCs w:val="18"/>
+              </w:rPr>
+              <w:t xml:space="preserve">Pass</w:t>
+            </w:r>
+          </w:p>
+        </w:tc>
+      </w:tr>
+      <w:tr>
+        <w:tc>
+          <w:tcPr>
+            <w:tcW w:type="dxa" w:w="1440"/>
+            <w:tcMar>
+              <w:top w:type="dxa" w:w="50"/>
+              <w:left w:type="dxa" w:w="80"/>
+              <w:bottom w:type="dxa" w:w="50"/>
+              <w:right w:type="dxa" w:w="80"/>
+            </w:tcMar>
+          </w:tcPr>
+          <w:p>
+            <w:pPr>
+              <w:spacing w:after="0" w:line="240"/>
+              <w:jc w:val="left"/>
+            </w:pPr>
+            <w:r>
+              <w:rPr>
+                <w:b w:val="false"/>
+                <w:bCs w:val="false"/>
+                <w:sz w:val="18"/>
+                <w:szCs w:val="18"/>
+              </w:rPr>
+              <w:t xml:space="preserve">ingest</w:t>
+            </w:r>
+          </w:p>
+        </w:tc>
+        <w:tc>
+          <w:tcPr>
+            <w:tcW w:type="dxa" w:w="6480"/>
+            <w:tcMar>
+              <w:top w:type="dxa" w:w="50"/>
+              <w:left w:type="dxa" w:w="80"/>
+              <w:bottom w:type="dxa" w:w="50"/>
+              <w:right w:type="dxa" w:w="80"/>
+            </w:tcMar>
+          </w:tcPr>
+          <w:p>
+            <w:pPr>
+              <w:spacing w:after="0" w:line="240"/>
+              <w:jc w:val="left"/>
+            </w:pPr>
+            <w:r>
+              <w:rPr>
+                <w:b w:val="false"/>
+                <w:bCs w:val="false"/>
+                <w:sz w:val="18"/>
+                <w:szCs w:val="18"/>
+              </w:rPr>
+              <w:t xml:space="preserve">NiFi flow is running and wrote an ingest record per file</w:t>
+            </w:r>
+          </w:p>
+        </w:tc>
+        <w:tc>
+          <w:tcPr>
+            <w:tcW w:type="dxa" w:w="1440"/>
+            <w:tcMar>
+              <w:top w:type="dxa" w:w="50"/>
+              <w:left w:type="dxa" w:w="80"/>
+              <w:bottom w:type="dxa" w:w="50"/>
+              <w:right w:type="dxa" w:w="80"/>
+            </w:tcMar>
+          </w:tcPr>
+          <w:p>
+            <w:pPr>
+              <w:spacing w:after="0" w:line="240"/>
+              <w:jc w:val="left"/>
+            </w:pPr>
+            <w:r>
+              <w:rPr>
+                <w:b w:val="false"/>
+                <w:bCs w:val="false"/>
+                <w:sz w:val="18"/>
+                <w:szCs w:val="18"/>
+              </w:rPr>
+              <w:t xml:space="preserve">Pass</w:t>
+            </w:r>
+          </w:p>
+        </w:tc>
+      </w:tr>
+      <w:tr>
+        <w:tc>
+          <w:tcPr>
+            <w:tcW w:type="dxa" w:w="1440"/>
+            <w:tcMar>
+              <w:top w:type="dxa" w:w="50"/>
+              <w:left w:type="dxa" w:w="80"/>
+              <w:bottom w:type="dxa" w:w="50"/>
+              <w:right w:type="dxa" w:w="80"/>
+            </w:tcMar>
+          </w:tcPr>
+          <w:p>
+            <w:pPr>
+              <w:spacing w:after="0" w:line="240"/>
+              <w:jc w:val="left"/>
+            </w:pPr>
+            <w:r>
+              <w:rPr>
+                <w:b w:val="false"/>
+                <w:bCs w:val="false"/>
+                <w:sz w:val="18"/>
+                <w:szCs w:val="18"/>
+              </w:rPr>
+              <w:t xml:space="preserve">catalog</w:t>
+            </w:r>
+          </w:p>
+        </w:tc>
+        <w:tc>
+          <w:tcPr>
+            <w:tcW w:type="dxa" w:w="6480"/>
+            <w:tcMar>
+              <w:top w:type="dxa" w:w="50"/>
+              <w:left w:type="dxa" w:w="80"/>
+              <w:bottom w:type="dxa" w:w="50"/>
+              <w:right w:type="dxa" w:w="80"/>
+            </w:tcMar>
+          </w:tcPr>
+          <w:p>
+            <w:pPr>
+              <w:spacing w:after="0" w:line="240"/>
+              <w:jc w:val="left"/>
+            </w:pPr>
+            <w:r>
+              <w:rPr>
+                <w:b w:val="false"/>
+                <w:bCs w:val="false"/>
+                <w:sz w:val="18"/>
+                <w:szCs w:val="18"/>
+              </w:rPr>
+              <w:t xml:space="preserve">crawler registered the lake tables in the Hive Metastore</w:t>
+            </w:r>
+          </w:p>
+        </w:tc>
+        <w:tc>
+          <w:tcPr>
+            <w:tcW w:type="dxa" w:w="1440"/>
+            <w:tcMar>
+              <w:top w:type="dxa" w:w="50"/>
+              <w:left w:type="dxa" w:w="80"/>
+              <w:bottom w:type="dxa" w:w="50"/>
+              <w:right w:type="dxa" w:w="80"/>
+            </w:tcMar>
+          </w:tcPr>
+          <w:p>
+            <w:pPr>
+              <w:spacing w:after="0" w:line="240"/>
+              <w:jc w:val="left"/>
+            </w:pPr>
+            <w:r>
+              <w:rPr>
+                <w:b w:val="false"/>
+                <w:bCs w:val="false"/>
+                <w:sz w:val="18"/>
+                <w:szCs w:val="18"/>
+              </w:rPr>
+              <w:t xml:space="preserve">Pass</w:t>
+            </w:r>
+          </w:p>
+        </w:tc>
+      </w:tr>
+      <w:tr>
+        <w:tc>
+          <w:tcPr>
+            <w:tcW w:type="dxa" w:w="1440"/>
+            <w:tcMar>
+              <w:top w:type="dxa" w:w="50"/>
+              <w:left w:type="dxa" w:w="80"/>
+              <w:bottom w:type="dxa" w:w="50"/>
+              <w:right w:type="dxa" w:w="80"/>
+            </w:tcMar>
+          </w:tcPr>
+          <w:p>
+            <w:pPr>
+              <w:spacing w:after="0" w:line="240"/>
+              <w:jc w:val="left"/>
+            </w:pPr>
+            <w:r>
+              <w:rPr>
+                <w:b w:val="false"/>
+                <w:bCs w:val="false"/>
+                <w:sz w:val="18"/>
+                <w:szCs w:val="18"/>
+              </w:rPr>
+              <w:t xml:space="preserve">trino</w:t>
+            </w:r>
+          </w:p>
+        </w:tc>
+        <w:tc>
+          <w:tcPr>
+            <w:tcW w:type="dxa" w:w="6480"/>
+            <w:tcMar>
+              <w:top w:type="dxa" w:w="50"/>
+              <w:left w:type="dxa" w:w="80"/>
+              <w:bottom w:type="dxa" w:w="50"/>
+              <w:right w:type="dxa" w:w="80"/>
+            </w:tcMar>
+          </w:tcPr>
+          <w:p>
+            <w:pPr>
+              <w:spacing w:after="0" w:line="240"/>
+              <w:jc w:val="left"/>
+            </w:pPr>
+            <w:r>
+              <w:rPr>
+                <w:b w:val="false"/>
+                <w:bCs w:val="false"/>
+                <w:sz w:val="18"/>
+                <w:szCs w:val="18"/>
+              </w:rPr>
+              <w:t xml:space="preserve">gold row count matches what the pipeline published</w:t>
+            </w:r>
+          </w:p>
+        </w:tc>
+        <w:tc>
+          <w:tcPr>
+            <w:tcW w:type="dxa" w:w="1440"/>
+            <w:tcMar>
+              <w:top w:type="dxa" w:w="50"/>
+              <w:left w:type="dxa" w:w="80"/>
+              <w:bottom w:type="dxa" w:w="50"/>
+              <w:right w:type="dxa" w:w="80"/>
+            </w:tcMar>
+          </w:tcPr>
+          <w:p>
+            <w:pPr>
+              <w:spacing w:after="0" w:line="240"/>
+              <w:jc w:val="left"/>
+            </w:pPr>
+            <w:r>
+              <w:rPr>
+                <w:b w:val="false"/>
+                <w:bCs w:val="false"/>
+                <w:sz w:val="18"/>
+                <w:szCs w:val="18"/>
+              </w:rPr>
+              <w:t xml:space="preserve">Pass</w:t>
+            </w:r>
+          </w:p>
+        </w:tc>
+      </w:tr>
+      <w:tr>
+        <w:tc>
+          <w:tcPr>
+            <w:tcW w:type="dxa" w:w="1440"/>
+            <w:tcMar>
+              <w:top w:type="dxa" w:w="50"/>
+              <w:left w:type="dxa" w:w="80"/>
+              <w:bottom w:type="dxa" w:w="50"/>
+              <w:right w:type="dxa" w:w="80"/>
+            </w:tcMar>
+          </w:tcPr>
+          <w:p>
+            <w:pPr>
+              <w:spacing w:after="0" w:line="240"/>
+              <w:jc w:val="left"/>
+            </w:pPr>
+            <w:r>
+              <w:rPr>
+                <w:b w:val="false"/>
+                <w:bCs w:val="false"/>
+                <w:sz w:val="18"/>
+                <w:szCs w:val="18"/>
+              </w:rPr>
+              <w:t xml:space="preserve">governance</w:t>
+            </w:r>
+          </w:p>
+        </w:tc>
+        <w:tc>
+          <w:tcPr>
+            <w:tcW w:type="dxa" w:w="6480"/>
+            <w:tcMar>
+              <w:top w:type="dxa" w:w="50"/>
+              <w:left w:type="dxa" w:w="80"/>
+              <w:bottom w:type="dxa" w:w="50"/>
+              <w:right w:type="dxa" w:w="80"/>
+            </w:tcMar>
+          </w:tcPr>
+          <w:p>
+            <w:pPr>
+              <w:spacing w:after="0" w:line="240"/>
+              <w:jc w:val="left"/>
+            </w:pPr>
+            <w:r>
+              <w:rPr>
+                <w:b w:val="false"/>
+                <w:bCs w:val="false"/>
+                <w:sz w:val="18"/>
+                <w:szCs w:val="18"/>
+              </w:rPr>
+              <w:t xml:space="preserve">Trino masks PII and hides `job` from the analyst role</w:t>
+            </w:r>
+          </w:p>
+        </w:tc>
+        <w:tc>
+          <w:tcPr>
+            <w:tcW w:type="dxa" w:w="1440"/>
+            <w:tcMar>
+              <w:top w:type="dxa" w:w="50"/>
+              <w:left w:type="dxa" w:w="80"/>
+              <w:bottom w:type="dxa" w:w="50"/>
+              <w:right w:type="dxa" w:w="80"/>
+            </w:tcMar>
+          </w:tcPr>
+          <w:p>
+            <w:pPr>
+              <w:spacing w:after="0" w:line="240"/>
+              <w:jc w:val="left"/>
+            </w:pPr>
+            <w:r>
+              <w:rPr>
+                <w:b w:val="false"/>
+                <w:bCs w:val="false"/>
+                <w:sz w:val="18"/>
+                <w:szCs w:val="18"/>
+              </w:rPr>
+              <w:t xml:space="preserve">Pass</w:t>
+            </w:r>
+          </w:p>
+        </w:tc>
+      </w:tr>
+      <w:tr>
+        <w:tc>
+          <w:tcPr>
+            <w:tcW w:type="dxa" w:w="1440"/>
+            <w:tcMar>
+              <w:top w:type="dxa" w:w="50"/>
+              <w:left w:type="dxa" w:w="80"/>
+              <w:bottom w:type="dxa" w:w="50"/>
+              <w:right w:type="dxa" w:w="80"/>
+            </w:tcMar>
+          </w:tcPr>
+          <w:p>
+            <w:pPr>
+              <w:spacing w:after="0" w:line="240"/>
+              <w:jc w:val="left"/>
+            </w:pPr>
+            <w:r>
+              <w:rPr>
+                <w:b w:val="false"/>
+                <w:bCs w:val="false"/>
+                <w:sz w:val="18"/>
+                <w:szCs w:val="18"/>
+              </w:rPr>
+              <w:t xml:space="preserve">governance</w:t>
+            </w:r>
+          </w:p>
+        </w:tc>
+        <w:tc>
+          <w:tcPr>
+            <w:tcW w:type="dxa" w:w="6480"/>
+            <w:tcMar>
+              <w:top w:type="dxa" w:w="50"/>
+              <w:left w:type="dxa" w:w="80"/>
+              <w:bottom w:type="dxa" w:w="50"/>
+              <w:right w:type="dxa" w:w="80"/>
+            </w:tcMar>
+          </w:tcPr>
+          <w:p>
+            <w:pPr>
+              <w:spacing w:after="0" w:line="240"/>
+              <w:jc w:val="left"/>
+            </w:pPr>
+            <w:r>
+              <w:rPr>
+                <w:b w:val="false"/>
+                <w:bCs w:val="false"/>
+                <w:sz w:val="18"/>
+                <w:szCs w:val="18"/>
+              </w:rPr>
+              <w:t xml:space="preserve">BI role cannot read the raw layer</w:t>
+            </w:r>
+          </w:p>
+        </w:tc>
+        <w:tc>
+          <w:tcPr>
+            <w:tcW w:type="dxa" w:w="1440"/>
+            <w:tcMar>
+              <w:top w:type="dxa" w:w="50"/>
+              <w:left w:type="dxa" w:w="80"/>
+              <w:bottom w:type="dxa" w:w="50"/>
+              <w:right w:type="dxa" w:w="80"/>
+            </w:tcMar>
+          </w:tcPr>
+          <w:p>
+            <w:pPr>
+              <w:spacing w:after="0" w:line="240"/>
+              <w:jc w:val="left"/>
+            </w:pPr>
+            <w:r>
+              <w:rPr>
+                <w:b w:val="false"/>
+                <w:bCs w:val="false"/>
+                <w:sz w:val="18"/>
+                <w:szCs w:val="18"/>
+              </w:rPr>
+              <w:t xml:space="preserve">Pass</w:t>
+            </w:r>
+          </w:p>
+        </w:tc>
+      </w:tr>
+      <w:tr>
+        <w:tc>
+          <w:tcPr>
+            <w:tcW w:type="dxa" w:w="1440"/>
+            <w:tcMar>
+              <w:top w:type="dxa" w:w="50"/>
+              <w:left w:type="dxa" w:w="80"/>
+              <w:bottom w:type="dxa" w:w="50"/>
+              <w:right w:type="dxa" w:w="80"/>
+            </w:tcMar>
+          </w:tcPr>
+          <w:p>
+            <w:pPr>
+              <w:spacing w:after="0" w:line="240"/>
+              <w:jc w:val="left"/>
+            </w:pPr>
+            <w:r>
+              <w:rPr>
+                <w:b w:val="false"/>
+                <w:bCs w:val="false"/>
+                <w:sz w:val="18"/>
+                <w:szCs w:val="18"/>
+              </w:rPr>
+              <w:t xml:space="preserve">olap</w:t>
+            </w:r>
+          </w:p>
+        </w:tc>
+        <w:tc>
+          <w:tcPr>
+            <w:tcW w:type="dxa" w:w="6480"/>
+            <w:tcMar>
+              <w:top w:type="dxa" w:w="50"/>
+              <w:left w:type="dxa" w:w="80"/>
+              <w:bottom w:type="dxa" w:w="50"/>
+              <w:right w:type="dxa" w:w="80"/>
+            </w:tcMar>
+          </w:tcPr>
+          <w:p>
+            <w:pPr>
+              <w:spacing w:after="0" w:line="240"/>
+              <w:jc w:val="left"/>
+            </w:pPr>
+            <w:r>
+              <w:rPr>
+                <w:b w:val="false"/>
+                <w:bCs w:val="false"/>
+                <w:sz w:val="18"/>
+                <w:szCs w:val="18"/>
+              </w:rPr>
+              <w:t xml:space="preserve">ClickHouse loaded gold and agrees with Trino</w:t>
+            </w:r>
+          </w:p>
+        </w:tc>
+        <w:tc>
+          <w:tcPr>
+            <w:tcW w:type="dxa" w:w="1440"/>
+            <w:tcMar>
+              <w:top w:type="dxa" w:w="50"/>
+              <w:left w:type="dxa" w:w="80"/>
+              <w:bottom w:type="dxa" w:w="50"/>
+              <w:right w:type="dxa" w:w="80"/>
+            </w:tcMar>
+          </w:tcPr>
+          <w:p>
+            <w:pPr>
+              <w:spacing w:after="0" w:line="240"/>
+              <w:jc w:val="left"/>
+            </w:pPr>
+            <w:r>
+              <w:rPr>
+                <w:b w:val="false"/>
+                <w:bCs w:val="false"/>
+                <w:sz w:val="18"/>
+                <w:szCs w:val="18"/>
+              </w:rPr>
+              <w:t xml:space="preserve">Pass</w:t>
+            </w:r>
+          </w:p>
+        </w:tc>
+      </w:tr>
+      <w:tr>
+        <w:tc>
+          <w:tcPr>
+            <w:tcW w:type="dxa" w:w="1440"/>
+            <w:tcMar>
+              <w:top w:type="dxa" w:w="50"/>
+              <w:left w:type="dxa" w:w="80"/>
+              <w:bottom w:type="dxa" w:w="50"/>
+              <w:right w:type="dxa" w:w="80"/>
+            </w:tcMar>
+          </w:tcPr>
+          <w:p>
+            <w:pPr>
+              <w:spacing w:after="0" w:line="240"/>
+              <w:jc w:val="left"/>
+            </w:pPr>
+            <w:r>
+              <w:rPr>
+                <w:b w:val="false"/>
+                <w:bCs w:val="false"/>
+                <w:sz w:val="18"/>
+                <w:szCs w:val="18"/>
+              </w:rPr>
+              <w:t xml:space="preserve">mlflow</w:t>
+            </w:r>
+          </w:p>
+        </w:tc>
+        <w:tc>
+          <w:tcPr>
+            <w:tcW w:type="dxa" w:w="6480"/>
+            <w:tcMar>
+              <w:top w:type="dxa" w:w="50"/>
+              <w:left w:type="dxa" w:w="80"/>
+              <w:bottom w:type="dxa" w:w="50"/>
+              <w:right w:type="dxa" w:w="80"/>
+            </w:tcMar>
+          </w:tcPr>
+          <w:p>
+            <w:pPr>
+              <w:spacing w:after="0" w:line="240"/>
+              <w:jc w:val="left"/>
+            </w:pPr>
+            <w:r>
+              <w:rPr>
+                <w:b w:val="false"/>
+                <w:bCs w:val="false"/>
+                <w:sz w:val="18"/>
+                <w:szCs w:val="18"/>
+              </w:rPr>
+              <w:t xml:space="preserve">MLflow server has the run and the registered champion</w:t>
+            </w:r>
+          </w:p>
+        </w:tc>
+        <w:tc>
+          <w:tcPr>
+            <w:tcW w:type="dxa" w:w="1440"/>
+            <w:tcMar>
+              <w:top w:type="dxa" w:w="50"/>
+              <w:left w:type="dxa" w:w="80"/>
+              <w:bottom w:type="dxa" w:w="50"/>
+              <w:right w:type="dxa" w:w="80"/>
+            </w:tcMar>
+          </w:tcPr>
+          <w:p>
+            <w:pPr>
+              <w:spacing w:after="0" w:line="240"/>
+              <w:jc w:val="left"/>
+            </w:pPr>
+            <w:r>
+              <w:rPr>
+                <w:b w:val="false"/>
+                <w:bCs w:val="false"/>
+                <w:sz w:val="18"/>
+                <w:szCs w:val="18"/>
+              </w:rPr>
+              <w:t xml:space="preserve">Pass</w:t>
+            </w:r>
+          </w:p>
+        </w:tc>
+      </w:tr>
+      <w:tr>
+        <w:tc>
+          <w:tcPr>
+            <w:tcW w:type="dxa" w:w="1440"/>
+            <w:tcMar>
+              <w:top w:type="dxa" w:w="50"/>
+              <w:left w:type="dxa" w:w="80"/>
+              <w:bottom w:type="dxa" w:w="50"/>
+              <w:right w:type="dxa" w:w="80"/>
+            </w:tcMar>
+          </w:tcPr>
+          <w:p>
+            <w:pPr>
+              <w:spacing w:after="0" w:line="240"/>
+              <w:jc w:val="left"/>
+            </w:pPr>
+            <w:r>
+              <w:rPr>
+                <w:b w:val="false"/>
+                <w:bCs w:val="false"/>
+                <w:sz w:val="18"/>
+                <w:szCs w:val="18"/>
+              </w:rPr>
+              <w:t xml:space="preserve">api</w:t>
+            </w:r>
+          </w:p>
+        </w:tc>
+        <w:tc>
+          <w:tcPr>
+            <w:tcW w:type="dxa" w:w="6480"/>
+            <w:tcMar>
+              <w:top w:type="dxa" w:w="50"/>
+              <w:left w:type="dxa" w:w="80"/>
+              <w:bottom w:type="dxa" w:w="50"/>
+              <w:right w:type="dxa" w:w="80"/>
+            </w:tcMar>
+          </w:tcPr>
+          <w:p>
+            <w:pPr>
+              <w:spacing w:after="0" w:line="240"/>
+              <w:jc w:val="left"/>
+            </w:pPr>
+            <w:r>
+              <w:rPr>
+                <w:b w:val="false"/>
+                <w:bCs w:val="false"/>
+                <w:sz w:val="18"/>
+                <w:szCs w:val="18"/>
+              </w:rPr>
+              <w:t xml:space="preserve">scoring API is healthy and scores a transaction</w:t>
+            </w:r>
+          </w:p>
+        </w:tc>
+        <w:tc>
+          <w:tcPr>
+            <w:tcW w:type="dxa" w:w="1440"/>
+            <w:tcMar>
+              <w:top w:type="dxa" w:w="50"/>
+              <w:left w:type="dxa" w:w="80"/>
+              <w:bottom w:type="dxa" w:w="50"/>
+              <w:right w:type="dxa" w:w="80"/>
+            </w:tcMar>
+          </w:tcPr>
+          <w:p>
+            <w:pPr>
+              <w:spacing w:after="0" w:line="240"/>
+              <w:jc w:val="left"/>
+            </w:pPr>
+            <w:r>
+              <w:rPr>
+                <w:b w:val="false"/>
+                <w:bCs w:val="false"/>
+                <w:sz w:val="18"/>
+                <w:szCs w:val="18"/>
+              </w:rPr>
+              <w:t xml:space="preserve">Pass</w:t>
+            </w:r>
+          </w:p>
+        </w:tc>
+      </w:tr>
+      <w:tr>
+        <w:tc>
+          <w:tcPr>
+            <w:tcW w:type="dxa" w:w="1440"/>
+            <w:tcMar>
+              <w:top w:type="dxa" w:w="50"/>
+              <w:left w:type="dxa" w:w="80"/>
+              <w:bottom w:type="dxa" w:w="50"/>
+              <w:right w:type="dxa" w:w="80"/>
+            </w:tcMar>
+          </w:tcPr>
+          <w:p>
+            <w:pPr>
+              <w:spacing w:after="0" w:line="240"/>
+              <w:jc w:val="left"/>
+            </w:pPr>
+            <w:r>
+              <w:rPr>
+                <w:b w:val="false"/>
+                <w:bCs w:val="false"/>
+                <w:sz w:val="18"/>
+                <w:szCs w:val="18"/>
+              </w:rPr>
+              <w:t xml:space="preserve">monitoring</w:t>
+            </w:r>
+          </w:p>
+        </w:tc>
+        <w:tc>
+          <w:tcPr>
+            <w:tcW w:type="dxa" w:w="6480"/>
+            <w:tcMar>
+              <w:top w:type="dxa" w:w="50"/>
+              <w:left w:type="dxa" w:w="80"/>
+              <w:bottom w:type="dxa" w:w="50"/>
+              <w:right w:type="dxa" w:w="80"/>
+            </w:tcMar>
+          </w:tcPr>
+          <w:p>
+            <w:pPr>
+              <w:spacing w:after="0" w:line="240"/>
+              <w:jc w:val="left"/>
+            </w:pPr>
+            <w:r>
+              <w:rPr>
+                <w:b w:val="false"/>
+                <w:bCs w:val="false"/>
+                <w:sz w:val="18"/>
+                <w:szCs w:val="18"/>
+              </w:rPr>
+              <w:t xml:space="preserve">Prometheus scrapes the API</w:t>
+            </w:r>
+          </w:p>
+        </w:tc>
+        <w:tc>
+          <w:tcPr>
+            <w:tcW w:type="dxa" w:w="1440"/>
+            <w:tcMar>
+              <w:top w:type="dxa" w:w="50"/>
+              <w:left w:type="dxa" w:w="80"/>
+              <w:bottom w:type="dxa" w:w="50"/>
+              <w:right w:type="dxa" w:w="80"/>
+            </w:tcMar>
+          </w:tcPr>
+          <w:p>
+            <w:pPr>
+              <w:spacing w:after="0" w:line="240"/>
+              <w:jc w:val="left"/>
+            </w:pPr>
+            <w:r>
+              <w:rPr>
+                <w:b w:val="false"/>
+                <w:bCs w:val="false"/>
+                <w:sz w:val="18"/>
+                <w:szCs w:val="18"/>
+              </w:rPr>
+              <w:t xml:space="preserve">Pass</w:t>
+            </w:r>
+          </w:p>
+        </w:tc>
+      </w:tr>
+      <w:tr>
+        <w:tc>
+          <w:tcPr>
+            <w:tcW w:type="dxa" w:w="1440"/>
+            <w:tcMar>
+              <w:top w:type="dxa" w:w="50"/>
+              <w:left w:type="dxa" w:w="80"/>
+              <w:bottom w:type="dxa" w:w="50"/>
+              <w:right w:type="dxa" w:w="80"/>
+            </w:tcMar>
+          </w:tcPr>
+          <w:p>
+            <w:pPr>
+              <w:spacing w:after="0" w:line="240"/>
+              <w:jc w:val="left"/>
+            </w:pPr>
+            <w:r>
+              <w:rPr>
+                <w:b w:val="false"/>
+                <w:bCs w:val="false"/>
+                <w:sz w:val="18"/>
+                <w:szCs w:val="18"/>
+              </w:rPr>
+              <w:t xml:space="preserve">monitoring</w:t>
+            </w:r>
+          </w:p>
+        </w:tc>
+        <w:tc>
+          <w:tcPr>
+            <w:tcW w:type="dxa" w:w="6480"/>
+            <w:tcMar>
+              <w:top w:type="dxa" w:w="50"/>
+              <w:left w:type="dxa" w:w="80"/>
+              <w:bottom w:type="dxa" w:w="50"/>
+              <w:right w:type="dxa" w:w="80"/>
+            </w:tcMar>
+          </w:tcPr>
+          <w:p>
+            <w:pPr>
+              <w:spacing w:after="0" w:line="240"/>
+              <w:jc w:val="left"/>
+            </w:pPr>
+            <w:r>
+              <w:rPr>
+                <w:b w:val="false"/>
+                <w:bCs w:val="false"/>
+                <w:sz w:val="18"/>
+                <w:szCs w:val="18"/>
+              </w:rPr>
+              <w:t xml:space="preserve">Grafana datasources (Prometheus, ClickHouse) are healthy</w:t>
+            </w:r>
+          </w:p>
+        </w:tc>
+        <w:tc>
+          <w:tcPr>
+            <w:tcW w:type="dxa" w:w="1440"/>
+            <w:tcMar>
+              <w:top w:type="dxa" w:w="50"/>
+              <w:left w:type="dxa" w:w="80"/>
+              <w:bottom w:type="dxa" w:w="50"/>
+              <w:right w:type="dxa" w:w="80"/>
+            </w:tcMar>
+          </w:tcPr>
+          <w:p>
+            <w:pPr>
+              <w:spacing w:after="0" w:line="240"/>
+              <w:jc w:val="left"/>
+            </w:pPr>
+            <w:r>
+              <w:rPr>
+                <w:b w:val="false"/>
+                <w:bCs w:val="false"/>
+                <w:sz w:val="18"/>
+                <w:szCs w:val="18"/>
+              </w:rPr>
+              <w:t xml:space="preserve">Pass</w:t>
+            </w:r>
+          </w:p>
+        </w:tc>
+      </w:tr>
+      <w:tr>
+        <w:tc>
+          <w:tcPr>
+            <w:tcW w:type="dxa" w:w="1440"/>
+            <w:tcMar>
+              <w:top w:type="dxa" w:w="50"/>
+              <w:left w:type="dxa" w:w="80"/>
+              <w:bottom w:type="dxa" w:w="50"/>
+              <w:right w:type="dxa" w:w="80"/>
+            </w:tcMar>
+          </w:tcPr>
+          <w:p>
+            <w:pPr>
+              <w:spacing w:after="0" w:line="240"/>
+              <w:jc w:val="left"/>
+            </w:pPr>
+            <w:r>
+              <w:rPr>
+                <w:b w:val="false"/>
+                <w:bCs w:val="false"/>
+                <w:sz w:val="18"/>
+                <w:szCs w:val="18"/>
+              </w:rPr>
+              <w:t xml:space="preserve">bi</w:t>
+            </w:r>
+          </w:p>
+        </w:tc>
+        <w:tc>
+          <w:tcPr>
+            <w:tcW w:type="dxa" w:w="6480"/>
+            <w:tcMar>
+              <w:top w:type="dxa" w:w="50"/>
+              <w:left w:type="dxa" w:w="80"/>
+              <w:bottom w:type="dxa" w:w="50"/>
+              <w:right w:type="dxa" w:w="80"/>
+            </w:tcMar>
+          </w:tcPr>
+          <w:p>
+            <w:pPr>
+              <w:spacing w:after="0" w:line="240"/>
+              <w:jc w:val="left"/>
+            </w:pPr>
+            <w:r>
+              <w:rPr>
+                <w:b w:val="false"/>
+                <w:bCs w:val="false"/>
+                <w:sz w:val="18"/>
+                <w:szCs w:val="18"/>
+              </w:rPr>
+              <w:t xml:space="preserve">Superset is up with the FraudLens dashboard</w:t>
+            </w:r>
+          </w:p>
+        </w:tc>
+        <w:tc>
+          <w:tcPr>
+            <w:tcW w:type="dxa" w:w="1440"/>
+            <w:tcMar>
+              <w:top w:type="dxa" w:w="50"/>
+              <w:left w:type="dxa" w:w="80"/>
+              <w:bottom w:type="dxa" w:w="50"/>
+              <w:right w:type="dxa" w:w="80"/>
+            </w:tcMar>
+          </w:tcPr>
+          <w:p>
+            <w:pPr>
+              <w:spacing w:after="0" w:line="240"/>
+              <w:jc w:val="left"/>
+            </w:pPr>
+            <w:r>
+              <w:rPr>
+                <w:b w:val="false"/>
+                <w:bCs w:val="false"/>
+                <w:sz w:val="18"/>
+                <w:szCs w:val="18"/>
+              </w:rPr>
+              <w:t xml:space="preserve">Pass</w:t>
+            </w:r>
+          </w:p>
+        </w:tc>
+      </w:tr>
+    </w:tbl>
+    <w:p>
+      <w:pPr>
+        <w:spacing w:after="120"/>
+      </w:pPr>
+    </w:p>
+    <w:p>
+      <w:pPr>
+        <w:pStyle w:val="Heading2"/>
+        <w:spacing w:after="120" w:before="260"/>
+      </w:pPr>
+      <w:r>
+        <w:t xml:space="preserve">8.5 Deployment</w:t>
+      </w:r>
+    </w:p>
+    <w:p>
+      <w:pPr>
+        <w:spacing w:after="80" w:before="160"/>
+      </w:pPr>
+      <w:r>
+        <w:rPr>
+          <w:i/>
+          <w:iCs/>
+          <w:color w:val="444444"/>
+          <w:sz w:val="19"/>
+          <w:szCs w:val="19"/>
+        </w:rPr>
+        <w:t xml:space="preserve">Table 15. Deployment targets.</w:t>
       </w:r>
     </w:p>
     <w:tbl>
@@ -11223,7 +13064,7 @@
                 <w:sz w:val="18"/>
                 <w:szCs w:val="18"/>
               </w:rPr>
-              <w:t xml:space="preserve">Script</w:t>
+              <w:t xml:space="preserve">Deployed during the project</w:t>
             </w:r>
           </w:p>
         </w:tc>
@@ -11463,7 +13304,7 @@
                 <w:sz w:val="18"/>
                 <w:szCs w:val="18"/>
               </w:rPr>
-              <w:t xml:space="preserve">platform/</w:t>
+              <w:t xml:space="preserve">platform/; verified end to end by the platform workflow</w:t>
             </w:r>
           </w:p>
         </w:tc>
@@ -11512,7 +13353,7 @@
           <w:sz w:val="19"/>
           <w:szCs w:val="19"/>
         </w:rPr>
-        <w:t xml:space="preserve">Table 14. Monthly monitoring.</w:t>
+        <w:t xml:space="preserve">Table 16. Monthly monitoring.</w:t>
       </w:r>
     </w:p>
     <w:tbl>
@@ -13604,7 +15445,7 @@
           <w:sz w:val="22"/>
           <w:szCs w:val="22"/>
         </w:rPr>
-        <w:t xml:space="preserve">Three GitHub Actions workflows: ci (unit and end-to-end tests of the whole lifecycle on synthetic sample data, plus a headless render of the dashboard from the committed bundle), platform (the complete Docker platform on a runner: NiFi ingest, MinIO, Hive Metastore, Trino governance, ClickHouse, MLflow, API, Prometheus, Grafana, Superset, and a second job for OpenMetadata, checked by a smoke test of every component), and deploy (build, smoke-test and publish the application image).</w:t>
+        <w:t xml:space="preserve">Three GitHub Actions workflows: ci (unit and end-to-end tests of the whole lifecycle on synthetic sample data, plus a headless render of the dashboard from the committed bundle), platform (the complete Docker platform on a runner: NiFi ingest, MinIO, Hive Metastore, Trino governance, ClickHouse, MLflow, API, Prometheus, Grafana, Superset, and a second job for OpenMetadata, checked by a smoke test of every component), and deploy (build, smoke-test and publish the application image). In platform run 39430878611 14 of 14 smoke checks passed and the governance job succeeded.</w:t>
       </w:r>
     </w:p>
     <w:p>
@@ -13628,7 +15469,7 @@
           <w:sz w:val="19"/>
           <w:szCs w:val="19"/>
         </w:rPr>
-        <w:t xml:space="preserve">Table 15. Verification checks by lifecycle stage (final run).</w:t>
+        <w:t xml:space="preserve">Table 17. Verification checks by lifecycle stage (final run).</w:t>
       </w:r>
     </w:p>
     <w:tbl>
@@ -14960,7 +16801,7 @@
       <w:pPr>
         <w:spacing w:after="80"/>
       </w:pPr>
-      <w:hyperlink w:history="1" r:id="rIdleuwyjx1t_4ogvarvcpgf">
+      <w:hyperlink w:history="1" r:id="rIdw8wgy1brlcp9buvru44l-">
         <w:r>
           <w:rPr>
             <w:rStyle w:val="Hyperlink"/>
@@ -14997,7 +16838,7 @@
           <w:sz w:val="19"/>
           <w:szCs w:val="19"/>
         </w:rPr>
-        <w:t xml:space="preserve">Table 16. All 56 end-to-end verification checks from the final run.</w:t>
+        <w:t xml:space="preserve">Table 18. All 56 end-to-end verification checks from the final run.</w:t>
       </w:r>
     </w:p>
     <w:tbl>

</xml_diff>

<commit_message>
Point docs and report at the rewritten commit ids
</commit_message>
<xml_diff>
--- a/deliverables/FraudLens_Final_Report.docx
+++ b/deliverables/FraudLens_Final_Report.docx
@@ -102,7 +102,7 @@
           <w:sz w:val="22"/>
           <w:szCs w:val="22"/>
         </w:rPr>
-        <w:t xml:space="preserve">20 October 2026</w:t>
+        <w:t xml:space="preserve">21 October 2026</w:t>
       </w:r>
     </w:p>
     <w:p>
@@ -11615,7 +11615,7 @@
           <w:sz w:val="22"/>
           <w:szCs w:val="22"/>
         </w:rPr>
-        <w:t xml:space="preserve">The platform workflow starts every service on a GitHub runner, runs the whole lifecycle on synthetic sample data through NiFi, the lake, the crawler, Trino and ClickHouse, then checks each component. Run 39430878611 (commit a5c7b0d) passed 14 of 14 smoke checks; its governance job catalogued 13 tables and views in OpenMetadata 1.13.4, tagged 29 PII columns and recorded 9 lineage edges from raw to gold.</w:t>
+        <w:t xml:space="preserve">The platform workflow starts every service on a GitHub runner, runs the whole lifecycle on synthetic sample data through NiFi, the lake, the crawler, Trino and ClickHouse, then checks each component. Run 39430878611 (commit 992cdc8) passed 14 of 14 smoke checks; its governance job catalogued 13 tables and views in OpenMetadata 1.13.4, tagged 29 PII columns and recorded 9 lineage edges from raw to gold.</w:t>
       </w:r>
     </w:p>
     <w:p>
@@ -16801,7 +16801,7 @@
       <w:pPr>
         <w:spacing w:after="80"/>
       </w:pPr>
-      <w:hyperlink w:history="1" r:id="rIdw8wgy1brlcp9buvru44l-">
+      <w:hyperlink w:history="1" r:id="rId4qfejet93xujtngl49_gj">
         <w:r>
           <w:rPr>
             <w:rStyle w:val="Hyperlink"/>

</xml_diff>

<commit_message>
Supervisor feedback: live decision path, analyst workflow, access control, stability and transferability
- Every scored transaction becomes a case; alerts wait in a review queue (API /alerts, dashboard Case review)
- Analyst decisions are audited and feed live monitoring (live precision vs floor, backlog) and retraining data
- Role-based API keys and a dashboard sign-in; Prometheus rules for low live precision, backlog, refused calls
- Net benefit shown as an estimate under stated review-cost and recovery assumptions
- Monthly stability with Wilson intervals, precision under other fraud rates, SHAP faithfulness checks, counterfactual amounts
- Docs, report, deck and notebooks 07-08 updated
</commit_message>
<xml_diff>
--- a/deliverables/FraudLens_Final_Report.docx
+++ b/deliverables/FraudLens_Final_Report.docx
@@ -280,7 +280,7 @@
           <w:sz w:val="22"/>
           <w:szCs w:val="22"/>
         </w:rPr>
-        <w:t xml:space="preserve"> after review costs. All four success criteria set before modelling are met, and all 56 automated end-to-end verification checks pass.</w:t>
+        <w:t xml:space="preserve"> (an estimate assuming $15 per review and 90% of caught fraud value recovered, on simulated data, not demonstrated savings). All four success criteria set before modelling are met, and all 56 automated end-to-end verification checks pass.</w:t>
       </w:r>
     </w:p>
     <w:p>
@@ -8726,7 +8726,7 @@
                 <w:sz w:val="18"/>
                 <w:szCs w:val="18"/>
               </w:rPr>
-              <w:t xml:space="preserve">Net benefit</w:t>
+              <w:t xml:space="preserve">Estimated net benefit (assumes $15/review, 90% recovered)</w:t>
             </w:r>
           </w:p>
         </w:tc>
@@ -8869,7 +8869,7 @@
           <w:sz w:val="22"/>
           <w:szCs w:val="22"/>
         </w:rPr>
-        <w:t xml:space="preserve">At 14.7 alerts a day the champion catches 98.7% of the fraud value in the test period ($1,118,830 of $1,133,325); recovering 90% of it and paying $15 per review leaves a net benefit of $964,182. Roughly 1.4 alerts are reviewed per fraud caught. Lowering the threshold to the alert-budget point would only pay if a review cost less than $2.02. Missed fraud is concentrated in small transactions, where an alert costs more than it recovers.</w:t>
+        <w:t xml:space="preserve">At 14.7 alerts a day the champion catches 98.7% of the fraud value in the test period ($1,118,830 of $1,133,325); assuming 90% of it is recovered and a review costs $15, the estimated net benefit is $964,182. This is an estimate under those two assumptions on simulated transactions, used to compare operating points; it is not a demonstrated saving, which would need a trial on real transactions with measured review costs and recoveries. Roughly 1.4 alerts are reviewed per fraud caught. Lowering the threshold to the alert-budget point would only pay if a review cost less than $2.02. Missed fraud is concentrated in small transactions, where an alert costs more than it recovers.</w:t>
       </w:r>
     </w:p>
     <w:p>
@@ -8905,7 +8905,1543 @@
           <w:sz w:val="19"/>
           <w:szCs w:val="19"/>
         </w:rPr>
-        <w:t xml:space="preserve">Table 12. Performance by group on the test period.</w:t>
+        <w:t xml:space="preserve">Table 12. Monthly stability on the test period at the deployed threshold (Wilson 95% intervals).</w:t>
+      </w:r>
+    </w:p>
+    <w:tbl>
+      <w:tblPr>
+        <w:tblW w:type="dxa" w:w="9360"/>
+        <w:tblBorders>
+          <w:top w:val="single" w:color="auto" w:sz="4"/>
+          <w:left w:val="single" w:color="auto" w:sz="4"/>
+          <w:bottom w:val="single" w:color="auto" w:sz="4"/>
+          <w:right w:val="single" w:color="auto" w:sz="4"/>
+          <w:insideH w:val="single" w:color="auto" w:sz="4"/>
+          <w:insideV w:val="single" w:color="auto" w:sz="4"/>
+        </w:tblBorders>
+      </w:tblPr>
+      <w:tblGrid>
+        <w:gridCol w:w="1170"/>
+        <w:gridCol w:w="1170"/>
+        <w:gridCol w:w="1170"/>
+        <w:gridCol w:w="1755"/>
+        <w:gridCol w:w="1170"/>
+        <w:gridCol w:w="1755"/>
+        <w:gridCol w:w="1170"/>
+      </w:tblGrid>
+      <w:tr>
+        <w:trPr>
+          <w:tblHeader/>
+        </w:trPr>
+        <w:tc>
+          <w:tcPr>
+            <w:tcW w:type="dxa" w:w="1170"/>
+            <w:shd w:fill="DCE6F1" w:color="auto" w:val="clear"/>
+            <w:tcMar>
+              <w:top w:type="dxa" w:w="50"/>
+              <w:left w:type="dxa" w:w="80"/>
+              <w:bottom w:type="dxa" w:w="50"/>
+              <w:right w:type="dxa" w:w="80"/>
+            </w:tcMar>
+          </w:tcPr>
+          <w:p>
+            <w:pPr>
+              <w:spacing w:after="0" w:line="240"/>
+              <w:jc w:val="left"/>
+            </w:pPr>
+            <w:r>
+              <w:rPr>
+                <w:b/>
+                <w:bCs/>
+                <w:sz w:val="18"/>
+                <w:szCs w:val="18"/>
+              </w:rPr>
+              <w:t xml:space="preserve">Month</w:t>
+            </w:r>
+          </w:p>
+        </w:tc>
+        <w:tc>
+          <w:tcPr>
+            <w:tcW w:type="dxa" w:w="1170"/>
+            <w:shd w:fill="DCE6F1" w:color="auto" w:val="clear"/>
+            <w:tcMar>
+              <w:top w:type="dxa" w:w="50"/>
+              <w:left w:type="dxa" w:w="80"/>
+              <w:bottom w:type="dxa" w:w="50"/>
+              <w:right w:type="dxa" w:w="80"/>
+            </w:tcMar>
+          </w:tcPr>
+          <w:p>
+            <w:pPr>
+              <w:spacing w:after="0" w:line="240"/>
+              <w:jc w:val="left"/>
+            </w:pPr>
+            <w:r>
+              <w:rPr>
+                <w:b/>
+                <w:bCs/>
+                <w:sz w:val="18"/>
+                <w:szCs w:val="18"/>
+              </w:rPr>
+              <w:t xml:space="preserve">Frauds</w:t>
+            </w:r>
+          </w:p>
+        </w:tc>
+        <w:tc>
+          <w:tcPr>
+            <w:tcW w:type="dxa" w:w="1170"/>
+            <w:shd w:fill="DCE6F1" w:color="auto" w:val="clear"/>
+            <w:tcMar>
+              <w:top w:type="dxa" w:w="50"/>
+              <w:left w:type="dxa" w:w="80"/>
+              <w:bottom w:type="dxa" w:w="50"/>
+              <w:right w:type="dxa" w:w="80"/>
+            </w:tcMar>
+          </w:tcPr>
+          <w:p>
+            <w:pPr>
+              <w:spacing w:after="0" w:line="240"/>
+              <w:jc w:val="left"/>
+            </w:pPr>
+            <w:r>
+              <w:rPr>
+                <w:b/>
+                <w:bCs/>
+                <w:sz w:val="18"/>
+                <w:szCs w:val="18"/>
+              </w:rPr>
+              <w:t xml:space="preserve">Recall</w:t>
+            </w:r>
+          </w:p>
+        </w:tc>
+        <w:tc>
+          <w:tcPr>
+            <w:tcW w:type="dxa" w:w="1755"/>
+            <w:shd w:fill="DCE6F1" w:color="auto" w:val="clear"/>
+            <w:tcMar>
+              <w:top w:type="dxa" w:w="50"/>
+              <w:left w:type="dxa" w:w="80"/>
+              <w:bottom w:type="dxa" w:w="50"/>
+              <w:right w:type="dxa" w:w="80"/>
+            </w:tcMar>
+          </w:tcPr>
+          <w:p>
+            <w:pPr>
+              <w:spacing w:after="0" w:line="240"/>
+              <w:jc w:val="left"/>
+            </w:pPr>
+            <w:r>
+              <w:rPr>
+                <w:b/>
+                <w:bCs/>
+                <w:sz w:val="18"/>
+                <w:szCs w:val="18"/>
+              </w:rPr>
+              <w:t xml:space="preserve">95% CI</w:t>
+            </w:r>
+          </w:p>
+        </w:tc>
+        <w:tc>
+          <w:tcPr>
+            <w:tcW w:type="dxa" w:w="1170"/>
+            <w:shd w:fill="DCE6F1" w:color="auto" w:val="clear"/>
+            <w:tcMar>
+              <w:top w:type="dxa" w:w="50"/>
+              <w:left w:type="dxa" w:w="80"/>
+              <w:bottom w:type="dxa" w:w="50"/>
+              <w:right w:type="dxa" w:w="80"/>
+            </w:tcMar>
+          </w:tcPr>
+          <w:p>
+            <w:pPr>
+              <w:spacing w:after="0" w:line="240"/>
+              <w:jc w:val="left"/>
+            </w:pPr>
+            <w:r>
+              <w:rPr>
+                <w:b/>
+                <w:bCs/>
+                <w:sz w:val="18"/>
+                <w:szCs w:val="18"/>
+              </w:rPr>
+              <w:t xml:space="preserve">Precision</w:t>
+            </w:r>
+          </w:p>
+        </w:tc>
+        <w:tc>
+          <w:tcPr>
+            <w:tcW w:type="dxa" w:w="1755"/>
+            <w:shd w:fill="DCE6F1" w:color="auto" w:val="clear"/>
+            <w:tcMar>
+              <w:top w:type="dxa" w:w="50"/>
+              <w:left w:type="dxa" w:w="80"/>
+              <w:bottom w:type="dxa" w:w="50"/>
+              <w:right w:type="dxa" w:w="80"/>
+            </w:tcMar>
+          </w:tcPr>
+          <w:p>
+            <w:pPr>
+              <w:spacing w:after="0" w:line="240"/>
+              <w:jc w:val="left"/>
+            </w:pPr>
+            <w:r>
+              <w:rPr>
+                <w:b/>
+                <w:bCs/>
+                <w:sz w:val="18"/>
+                <w:szCs w:val="18"/>
+              </w:rPr>
+              <w:t xml:space="preserve">95% CI</w:t>
+            </w:r>
+          </w:p>
+        </w:tc>
+        <w:tc>
+          <w:tcPr>
+            <w:tcW w:type="dxa" w:w="1170"/>
+            <w:shd w:fill="DCE6F1" w:color="auto" w:val="clear"/>
+            <w:tcMar>
+              <w:top w:type="dxa" w:w="50"/>
+              <w:left w:type="dxa" w:w="80"/>
+              <w:bottom w:type="dxa" w:w="50"/>
+              <w:right w:type="dxa" w:w="80"/>
+            </w:tcMar>
+          </w:tcPr>
+          <w:p>
+            <w:pPr>
+              <w:spacing w:after="0" w:line="240"/>
+              <w:jc w:val="left"/>
+            </w:pPr>
+            <w:r>
+              <w:rPr>
+                <w:b/>
+                <w:bCs/>
+                <w:sz w:val="18"/>
+                <w:szCs w:val="18"/>
+              </w:rPr>
+              <w:t xml:space="preserve">Alerts/day</w:t>
+            </w:r>
+          </w:p>
+        </w:tc>
+      </w:tr>
+      <w:tr>
+        <w:tc>
+          <w:tcPr>
+            <w:tcW w:type="dxa" w:w="1170"/>
+            <w:tcMar>
+              <w:top w:type="dxa" w:w="50"/>
+              <w:left w:type="dxa" w:w="80"/>
+              <w:bottom w:type="dxa" w:w="50"/>
+              <w:right w:type="dxa" w:w="80"/>
+            </w:tcMar>
+          </w:tcPr>
+          <w:p>
+            <w:pPr>
+              <w:spacing w:after="0" w:line="240"/>
+              <w:jc w:val="left"/>
+            </w:pPr>
+            <w:r>
+              <w:rPr>
+                <w:b w:val="false"/>
+                <w:bCs w:val="false"/>
+                <w:sz w:val="18"/>
+                <w:szCs w:val="18"/>
+              </w:rPr>
+              <w:t xml:space="preserve">2020-06</w:t>
+            </w:r>
+          </w:p>
+        </w:tc>
+        <w:tc>
+          <w:tcPr>
+            <w:tcW w:type="dxa" w:w="1170"/>
+            <w:tcMar>
+              <w:top w:type="dxa" w:w="50"/>
+              <w:left w:type="dxa" w:w="80"/>
+              <w:bottom w:type="dxa" w:w="50"/>
+              <w:right w:type="dxa" w:w="80"/>
+            </w:tcMar>
+          </w:tcPr>
+          <w:p>
+            <w:pPr>
+              <w:spacing w:after="0" w:line="240"/>
+              <w:jc w:val="right"/>
+            </w:pPr>
+            <w:r>
+              <w:rPr>
+                <w:b w:val="false"/>
+                <w:bCs w:val="false"/>
+                <w:sz w:val="18"/>
+                <w:szCs w:val="18"/>
+              </w:rPr>
+              <w:t xml:space="preserve">133</w:t>
+            </w:r>
+          </w:p>
+        </w:tc>
+        <w:tc>
+          <w:tcPr>
+            <w:tcW w:type="dxa" w:w="1170"/>
+            <w:tcMar>
+              <w:top w:type="dxa" w:w="50"/>
+              <w:left w:type="dxa" w:w="80"/>
+              <w:bottom w:type="dxa" w:w="50"/>
+              <w:right w:type="dxa" w:w="80"/>
+            </w:tcMar>
+          </w:tcPr>
+          <w:p>
+            <w:pPr>
+              <w:spacing w:after="0" w:line="240"/>
+              <w:jc w:val="right"/>
+            </w:pPr>
+            <w:r>
+              <w:rPr>
+                <w:b w:val="false"/>
+                <w:bCs w:val="false"/>
+                <w:sz w:val="18"/>
+                <w:szCs w:val="18"/>
+              </w:rPr>
+              <w:t xml:space="preserve">0.970</w:t>
+            </w:r>
+          </w:p>
+        </w:tc>
+        <w:tc>
+          <w:tcPr>
+            <w:tcW w:type="dxa" w:w="1755"/>
+            <w:tcMar>
+              <w:top w:type="dxa" w:w="50"/>
+              <w:left w:type="dxa" w:w="80"/>
+              <w:bottom w:type="dxa" w:w="50"/>
+              <w:right w:type="dxa" w:w="80"/>
+            </w:tcMar>
+          </w:tcPr>
+          <w:p>
+            <w:pPr>
+              <w:spacing w:after="0" w:line="240"/>
+              <w:jc w:val="left"/>
+            </w:pPr>
+            <w:r>
+              <w:rPr>
+                <w:b w:val="false"/>
+                <w:bCs w:val="false"/>
+                <w:sz w:val="18"/>
+                <w:szCs w:val="18"/>
+              </w:rPr>
+              <w:t xml:space="preserve">0.925-0.988</w:t>
+            </w:r>
+          </w:p>
+        </w:tc>
+        <w:tc>
+          <w:tcPr>
+            <w:tcW w:type="dxa" w:w="1170"/>
+            <w:tcMar>
+              <w:top w:type="dxa" w:w="50"/>
+              <w:left w:type="dxa" w:w="80"/>
+              <w:bottom w:type="dxa" w:w="50"/>
+              <w:right w:type="dxa" w:w="80"/>
+            </w:tcMar>
+          </w:tcPr>
+          <w:p>
+            <w:pPr>
+              <w:spacing w:after="0" w:line="240"/>
+              <w:jc w:val="right"/>
+            </w:pPr>
+            <w:r>
+              <w:rPr>
+                <w:b w:val="false"/>
+                <w:bCs w:val="false"/>
+                <w:sz w:val="18"/>
+                <w:szCs w:val="18"/>
+              </w:rPr>
+              <w:t xml:space="preserve">0.746</w:t>
+            </w:r>
+          </w:p>
+        </w:tc>
+        <w:tc>
+          <w:tcPr>
+            <w:tcW w:type="dxa" w:w="1755"/>
+            <w:tcMar>
+              <w:top w:type="dxa" w:w="50"/>
+              <w:left w:type="dxa" w:w="80"/>
+              <w:bottom w:type="dxa" w:w="50"/>
+              <w:right w:type="dxa" w:w="80"/>
+            </w:tcMar>
+          </w:tcPr>
+          <w:p>
+            <w:pPr>
+              <w:spacing w:after="0" w:line="240"/>
+              <w:jc w:val="left"/>
+            </w:pPr>
+            <w:r>
+              <w:rPr>
+                <w:b w:val="false"/>
+                <w:bCs w:val="false"/>
+                <w:sz w:val="18"/>
+                <w:szCs w:val="18"/>
+              </w:rPr>
+              <w:t xml:space="preserve">0.676-0.805</w:t>
+            </w:r>
+          </w:p>
+        </w:tc>
+        <w:tc>
+          <w:tcPr>
+            <w:tcW w:type="dxa" w:w="1170"/>
+            <w:tcMar>
+              <w:top w:type="dxa" w:w="50"/>
+              <w:left w:type="dxa" w:w="80"/>
+              <w:bottom w:type="dxa" w:w="50"/>
+              <w:right w:type="dxa" w:w="80"/>
+            </w:tcMar>
+          </w:tcPr>
+          <w:p>
+            <w:pPr>
+              <w:spacing w:after="0" w:line="240"/>
+              <w:jc w:val="right"/>
+            </w:pPr>
+            <w:r>
+              <w:rPr>
+                <w:b w:val="false"/>
+                <w:bCs w:val="false"/>
+                <w:sz w:val="18"/>
+                <w:szCs w:val="18"/>
+              </w:rPr>
+              <w:t xml:space="preserve">18.2</w:t>
+            </w:r>
+          </w:p>
+        </w:tc>
+      </w:tr>
+      <w:tr>
+        <w:tc>
+          <w:tcPr>
+            <w:tcW w:type="dxa" w:w="1170"/>
+            <w:tcMar>
+              <w:top w:type="dxa" w:w="50"/>
+              <w:left w:type="dxa" w:w="80"/>
+              <w:bottom w:type="dxa" w:w="50"/>
+              <w:right w:type="dxa" w:w="80"/>
+            </w:tcMar>
+          </w:tcPr>
+          <w:p>
+            <w:pPr>
+              <w:spacing w:after="0" w:line="240"/>
+              <w:jc w:val="left"/>
+            </w:pPr>
+            <w:r>
+              <w:rPr>
+                <w:b w:val="false"/>
+                <w:bCs w:val="false"/>
+                <w:sz w:val="18"/>
+                <w:szCs w:val="18"/>
+              </w:rPr>
+              <w:t xml:space="preserve">2020-07</w:t>
+            </w:r>
+          </w:p>
+        </w:tc>
+        <w:tc>
+          <w:tcPr>
+            <w:tcW w:type="dxa" w:w="1170"/>
+            <w:tcMar>
+              <w:top w:type="dxa" w:w="50"/>
+              <w:left w:type="dxa" w:w="80"/>
+              <w:bottom w:type="dxa" w:w="50"/>
+              <w:right w:type="dxa" w:w="80"/>
+            </w:tcMar>
+          </w:tcPr>
+          <w:p>
+            <w:pPr>
+              <w:spacing w:after="0" w:line="240"/>
+              <w:jc w:val="right"/>
+            </w:pPr>
+            <w:r>
+              <w:rPr>
+                <w:b w:val="false"/>
+                <w:bCs w:val="false"/>
+                <w:sz w:val="18"/>
+                <w:szCs w:val="18"/>
+              </w:rPr>
+              <w:t xml:space="preserve">321</w:t>
+            </w:r>
+          </w:p>
+        </w:tc>
+        <w:tc>
+          <w:tcPr>
+            <w:tcW w:type="dxa" w:w="1170"/>
+            <w:tcMar>
+              <w:top w:type="dxa" w:w="50"/>
+              <w:left w:type="dxa" w:w="80"/>
+              <w:bottom w:type="dxa" w:w="50"/>
+              <w:right w:type="dxa" w:w="80"/>
+            </w:tcMar>
+          </w:tcPr>
+          <w:p>
+            <w:pPr>
+              <w:spacing w:after="0" w:line="240"/>
+              <w:jc w:val="right"/>
+            </w:pPr>
+            <w:r>
+              <w:rPr>
+                <w:b w:val="false"/>
+                <w:bCs w:val="false"/>
+                <w:sz w:val="18"/>
+                <w:szCs w:val="18"/>
+              </w:rPr>
+              <w:t xml:space="preserve">0.944</w:t>
+            </w:r>
+          </w:p>
+        </w:tc>
+        <w:tc>
+          <w:tcPr>
+            <w:tcW w:type="dxa" w:w="1755"/>
+            <w:tcMar>
+              <w:top w:type="dxa" w:w="50"/>
+              <w:left w:type="dxa" w:w="80"/>
+              <w:bottom w:type="dxa" w:w="50"/>
+              <w:right w:type="dxa" w:w="80"/>
+            </w:tcMar>
+          </w:tcPr>
+          <w:p>
+            <w:pPr>
+              <w:spacing w:after="0" w:line="240"/>
+              <w:jc w:val="left"/>
+            </w:pPr>
+            <w:r>
+              <w:rPr>
+                <w:b w:val="false"/>
+                <w:bCs w:val="false"/>
+                <w:sz w:val="18"/>
+                <w:szCs w:val="18"/>
+              </w:rPr>
+              <w:t xml:space="preserve">0.913-0.964</w:t>
+            </w:r>
+          </w:p>
+        </w:tc>
+        <w:tc>
+          <w:tcPr>
+            <w:tcW w:type="dxa" w:w="1170"/>
+            <w:tcMar>
+              <w:top w:type="dxa" w:w="50"/>
+              <w:left w:type="dxa" w:w="80"/>
+              <w:bottom w:type="dxa" w:w="50"/>
+              <w:right w:type="dxa" w:w="80"/>
+            </w:tcMar>
+          </w:tcPr>
+          <w:p>
+            <w:pPr>
+              <w:spacing w:after="0" w:line="240"/>
+              <w:jc w:val="right"/>
+            </w:pPr>
+            <w:r>
+              <w:rPr>
+                <w:b w:val="false"/>
+                <w:bCs w:val="false"/>
+                <w:sz w:val="18"/>
+                <w:szCs w:val="18"/>
+              </w:rPr>
+              <w:t xml:space="preserve">0.715</w:t>
+            </w:r>
+          </w:p>
+        </w:tc>
+        <w:tc>
+          <w:tcPr>
+            <w:tcW w:type="dxa" w:w="1755"/>
+            <w:tcMar>
+              <w:top w:type="dxa" w:w="50"/>
+              <w:left w:type="dxa" w:w="80"/>
+              <w:bottom w:type="dxa" w:w="50"/>
+              <w:right w:type="dxa" w:w="80"/>
+            </w:tcMar>
+          </w:tcPr>
+          <w:p>
+            <w:pPr>
+              <w:spacing w:after="0" w:line="240"/>
+              <w:jc w:val="left"/>
+            </w:pPr>
+            <w:r>
+              <w:rPr>
+                <w:b w:val="false"/>
+                <w:bCs w:val="false"/>
+                <w:sz w:val="18"/>
+                <w:szCs w:val="18"/>
+              </w:rPr>
+              <w:t xml:space="preserve">0.670-0.755</w:t>
+            </w:r>
+          </w:p>
+        </w:tc>
+        <w:tc>
+          <w:tcPr>
+            <w:tcW w:type="dxa" w:w="1170"/>
+            <w:tcMar>
+              <w:top w:type="dxa" w:w="50"/>
+              <w:left w:type="dxa" w:w="80"/>
+              <w:bottom w:type="dxa" w:w="50"/>
+              <w:right w:type="dxa" w:w="80"/>
+            </w:tcMar>
+          </w:tcPr>
+          <w:p>
+            <w:pPr>
+              <w:spacing w:after="0" w:line="240"/>
+              <w:jc w:val="right"/>
+            </w:pPr>
+            <w:r>
+              <w:rPr>
+                <w:b w:val="false"/>
+                <w:bCs w:val="false"/>
+                <w:sz w:val="18"/>
+                <w:szCs w:val="18"/>
+              </w:rPr>
+              <w:t xml:space="preserve">13.7</w:t>
+            </w:r>
+          </w:p>
+        </w:tc>
+      </w:tr>
+      <w:tr>
+        <w:tc>
+          <w:tcPr>
+            <w:tcW w:type="dxa" w:w="1170"/>
+            <w:tcMar>
+              <w:top w:type="dxa" w:w="50"/>
+              <w:left w:type="dxa" w:w="80"/>
+              <w:bottom w:type="dxa" w:w="50"/>
+              <w:right w:type="dxa" w:w="80"/>
+            </w:tcMar>
+          </w:tcPr>
+          <w:p>
+            <w:pPr>
+              <w:spacing w:after="0" w:line="240"/>
+              <w:jc w:val="left"/>
+            </w:pPr>
+            <w:r>
+              <w:rPr>
+                <w:b w:val="false"/>
+                <w:bCs w:val="false"/>
+                <w:sz w:val="18"/>
+                <w:szCs w:val="18"/>
+              </w:rPr>
+              <w:t xml:space="preserve">2020-08</w:t>
+            </w:r>
+          </w:p>
+        </w:tc>
+        <w:tc>
+          <w:tcPr>
+            <w:tcW w:type="dxa" w:w="1170"/>
+            <w:tcMar>
+              <w:top w:type="dxa" w:w="50"/>
+              <w:left w:type="dxa" w:w="80"/>
+              <w:bottom w:type="dxa" w:w="50"/>
+              <w:right w:type="dxa" w:w="80"/>
+            </w:tcMar>
+          </w:tcPr>
+          <w:p>
+            <w:pPr>
+              <w:spacing w:after="0" w:line="240"/>
+              <w:jc w:val="right"/>
+            </w:pPr>
+            <w:r>
+              <w:rPr>
+                <w:b w:val="false"/>
+                <w:bCs w:val="false"/>
+                <w:sz w:val="18"/>
+                <w:szCs w:val="18"/>
+              </w:rPr>
+              <w:t xml:space="preserve">415</w:t>
+            </w:r>
+          </w:p>
+        </w:tc>
+        <w:tc>
+          <w:tcPr>
+            <w:tcW w:type="dxa" w:w="1170"/>
+            <w:tcMar>
+              <w:top w:type="dxa" w:w="50"/>
+              <w:left w:type="dxa" w:w="80"/>
+              <w:bottom w:type="dxa" w:w="50"/>
+              <w:right w:type="dxa" w:w="80"/>
+            </w:tcMar>
+          </w:tcPr>
+          <w:p>
+            <w:pPr>
+              <w:spacing w:after="0" w:line="240"/>
+              <w:jc w:val="right"/>
+            </w:pPr>
+            <w:r>
+              <w:rPr>
+                <w:b w:val="false"/>
+                <w:bCs w:val="false"/>
+                <w:sz w:val="18"/>
+                <w:szCs w:val="18"/>
+              </w:rPr>
+              <w:t xml:space="preserve">0.969</w:t>
+            </w:r>
+          </w:p>
+        </w:tc>
+        <w:tc>
+          <w:tcPr>
+            <w:tcW w:type="dxa" w:w="1755"/>
+            <w:tcMar>
+              <w:top w:type="dxa" w:w="50"/>
+              <w:left w:type="dxa" w:w="80"/>
+              <w:bottom w:type="dxa" w:w="50"/>
+              <w:right w:type="dxa" w:w="80"/>
+            </w:tcMar>
+          </w:tcPr>
+          <w:p>
+            <w:pPr>
+              <w:spacing w:after="0" w:line="240"/>
+              <w:jc w:val="left"/>
+            </w:pPr>
+            <w:r>
+              <w:rPr>
+                <w:b w:val="false"/>
+                <w:bCs w:val="false"/>
+                <w:sz w:val="18"/>
+                <w:szCs w:val="18"/>
+              </w:rPr>
+              <w:t xml:space="preserve">0.947-0.982</w:t>
+            </w:r>
+          </w:p>
+        </w:tc>
+        <w:tc>
+          <w:tcPr>
+            <w:tcW w:type="dxa" w:w="1170"/>
+            <w:tcMar>
+              <w:top w:type="dxa" w:w="50"/>
+              <w:left w:type="dxa" w:w="80"/>
+              <w:bottom w:type="dxa" w:w="50"/>
+              <w:right w:type="dxa" w:w="80"/>
+            </w:tcMar>
+          </w:tcPr>
+          <w:p>
+            <w:pPr>
+              <w:spacing w:after="0" w:line="240"/>
+              <w:jc w:val="right"/>
+            </w:pPr>
+            <w:r>
+              <w:rPr>
+                <w:b w:val="false"/>
+                <w:bCs w:val="false"/>
+                <w:sz w:val="18"/>
+                <w:szCs w:val="18"/>
+              </w:rPr>
+              <w:t xml:space="preserve">0.756</w:t>
+            </w:r>
+          </w:p>
+        </w:tc>
+        <w:tc>
+          <w:tcPr>
+            <w:tcW w:type="dxa" w:w="1755"/>
+            <w:tcMar>
+              <w:top w:type="dxa" w:w="50"/>
+              <w:left w:type="dxa" w:w="80"/>
+              <w:bottom w:type="dxa" w:w="50"/>
+              <w:right w:type="dxa" w:w="80"/>
+            </w:tcMar>
+          </w:tcPr>
+          <w:p>
+            <w:pPr>
+              <w:spacing w:after="0" w:line="240"/>
+              <w:jc w:val="left"/>
+            </w:pPr>
+            <w:r>
+              <w:rPr>
+                <w:b w:val="false"/>
+                <w:bCs w:val="false"/>
+                <w:sz w:val="18"/>
+                <w:szCs w:val="18"/>
+              </w:rPr>
+              <w:t xml:space="preserve">0.717-0.790</w:t>
+            </w:r>
+          </w:p>
+        </w:tc>
+        <w:tc>
+          <w:tcPr>
+            <w:tcW w:type="dxa" w:w="1170"/>
+            <w:tcMar>
+              <w:top w:type="dxa" w:w="50"/>
+              <w:left w:type="dxa" w:w="80"/>
+              <w:bottom w:type="dxa" w:w="50"/>
+              <w:right w:type="dxa" w:w="80"/>
+            </w:tcMar>
+          </w:tcPr>
+          <w:p>
+            <w:pPr>
+              <w:spacing w:after="0" w:line="240"/>
+              <w:jc w:val="right"/>
+            </w:pPr>
+            <w:r>
+              <w:rPr>
+                <w:b w:val="false"/>
+                <w:bCs w:val="false"/>
+                <w:sz w:val="18"/>
+                <w:szCs w:val="18"/>
+              </w:rPr>
+              <w:t xml:space="preserve">17.2</w:t>
+            </w:r>
+          </w:p>
+        </w:tc>
+      </w:tr>
+      <w:tr>
+        <w:tc>
+          <w:tcPr>
+            <w:tcW w:type="dxa" w:w="1170"/>
+            <w:tcMar>
+              <w:top w:type="dxa" w:w="50"/>
+              <w:left w:type="dxa" w:w="80"/>
+              <w:bottom w:type="dxa" w:w="50"/>
+              <w:right w:type="dxa" w:w="80"/>
+            </w:tcMar>
+          </w:tcPr>
+          <w:p>
+            <w:pPr>
+              <w:spacing w:after="0" w:line="240"/>
+              <w:jc w:val="left"/>
+            </w:pPr>
+            <w:r>
+              <w:rPr>
+                <w:b w:val="false"/>
+                <w:bCs w:val="false"/>
+                <w:sz w:val="18"/>
+                <w:szCs w:val="18"/>
+              </w:rPr>
+              <w:t xml:space="preserve">2020-09</w:t>
+            </w:r>
+          </w:p>
+        </w:tc>
+        <w:tc>
+          <w:tcPr>
+            <w:tcW w:type="dxa" w:w="1170"/>
+            <w:tcMar>
+              <w:top w:type="dxa" w:w="50"/>
+              <w:left w:type="dxa" w:w="80"/>
+              <w:bottom w:type="dxa" w:w="50"/>
+              <w:right w:type="dxa" w:w="80"/>
+            </w:tcMar>
+          </w:tcPr>
+          <w:p>
+            <w:pPr>
+              <w:spacing w:after="0" w:line="240"/>
+              <w:jc w:val="right"/>
+            </w:pPr>
+            <w:r>
+              <w:rPr>
+                <w:b w:val="false"/>
+                <w:bCs w:val="false"/>
+                <w:sz w:val="18"/>
+                <w:szCs w:val="18"/>
+              </w:rPr>
+              <w:t xml:space="preserve">340</w:t>
+            </w:r>
+          </w:p>
+        </w:tc>
+        <w:tc>
+          <w:tcPr>
+            <w:tcW w:type="dxa" w:w="1170"/>
+            <w:tcMar>
+              <w:top w:type="dxa" w:w="50"/>
+              <w:left w:type="dxa" w:w="80"/>
+              <w:bottom w:type="dxa" w:w="50"/>
+              <w:right w:type="dxa" w:w="80"/>
+            </w:tcMar>
+          </w:tcPr>
+          <w:p>
+            <w:pPr>
+              <w:spacing w:after="0" w:line="240"/>
+              <w:jc w:val="right"/>
+            </w:pPr>
+            <w:r>
+              <w:rPr>
+                <w:b w:val="false"/>
+                <w:bCs w:val="false"/>
+                <w:sz w:val="18"/>
+                <w:szCs w:val="18"/>
+              </w:rPr>
+              <w:t xml:space="preserve">0.959</w:t>
+            </w:r>
+          </w:p>
+        </w:tc>
+        <w:tc>
+          <w:tcPr>
+            <w:tcW w:type="dxa" w:w="1755"/>
+            <w:tcMar>
+              <w:top w:type="dxa" w:w="50"/>
+              <w:left w:type="dxa" w:w="80"/>
+              <w:bottom w:type="dxa" w:w="50"/>
+              <w:right w:type="dxa" w:w="80"/>
+            </w:tcMar>
+          </w:tcPr>
+          <w:p>
+            <w:pPr>
+              <w:spacing w:after="0" w:line="240"/>
+              <w:jc w:val="left"/>
+            </w:pPr>
+            <w:r>
+              <w:rPr>
+                <w:b w:val="false"/>
+                <w:bCs w:val="false"/>
+                <w:sz w:val="18"/>
+                <w:szCs w:val="18"/>
+              </w:rPr>
+              <w:t xml:space="preserve">0.932-0.975</w:t>
+            </w:r>
+          </w:p>
+        </w:tc>
+        <w:tc>
+          <w:tcPr>
+            <w:tcW w:type="dxa" w:w="1170"/>
+            <w:tcMar>
+              <w:top w:type="dxa" w:w="50"/>
+              <w:left w:type="dxa" w:w="80"/>
+              <w:bottom w:type="dxa" w:w="50"/>
+              <w:right w:type="dxa" w:w="80"/>
+            </w:tcMar>
+          </w:tcPr>
+          <w:p>
+            <w:pPr>
+              <w:spacing w:after="0" w:line="240"/>
+              <w:jc w:val="right"/>
+            </w:pPr>
+            <w:r>
+              <w:rPr>
+                <w:b w:val="false"/>
+                <w:bCs w:val="false"/>
+                <w:sz w:val="18"/>
+                <w:szCs w:val="18"/>
+              </w:rPr>
+              <w:t xml:space="preserve">0.738</w:t>
+            </w:r>
+          </w:p>
+        </w:tc>
+        <w:tc>
+          <w:tcPr>
+            <w:tcW w:type="dxa" w:w="1755"/>
+            <w:tcMar>
+              <w:top w:type="dxa" w:w="50"/>
+              <w:left w:type="dxa" w:w="80"/>
+              <w:bottom w:type="dxa" w:w="50"/>
+              <w:right w:type="dxa" w:w="80"/>
+            </w:tcMar>
+          </w:tcPr>
+          <w:p>
+            <w:pPr>
+              <w:spacing w:after="0" w:line="240"/>
+              <w:jc w:val="left"/>
+            </w:pPr>
+            <w:r>
+              <w:rPr>
+                <w:b w:val="false"/>
+                <w:bCs w:val="false"/>
+                <w:sz w:val="18"/>
+                <w:szCs w:val="18"/>
+              </w:rPr>
+              <w:t xml:space="preserve">0.695-0.776</w:t>
+            </w:r>
+          </w:p>
+        </w:tc>
+        <w:tc>
+          <w:tcPr>
+            <w:tcW w:type="dxa" w:w="1170"/>
+            <w:tcMar>
+              <w:top w:type="dxa" w:w="50"/>
+              <w:left w:type="dxa" w:w="80"/>
+              <w:bottom w:type="dxa" w:w="50"/>
+              <w:right w:type="dxa" w:w="80"/>
+            </w:tcMar>
+          </w:tcPr>
+          <w:p>
+            <w:pPr>
+              <w:spacing w:after="0" w:line="240"/>
+              <w:jc w:val="right"/>
+            </w:pPr>
+            <w:r>
+              <w:rPr>
+                <w:b w:val="false"/>
+                <w:bCs w:val="false"/>
+                <w:sz w:val="18"/>
+                <w:szCs w:val="18"/>
+              </w:rPr>
+              <w:t xml:space="preserve">14.7</w:t>
+            </w:r>
+          </w:p>
+        </w:tc>
+      </w:tr>
+      <w:tr>
+        <w:tc>
+          <w:tcPr>
+            <w:tcW w:type="dxa" w:w="1170"/>
+            <w:tcMar>
+              <w:top w:type="dxa" w:w="50"/>
+              <w:left w:type="dxa" w:w="80"/>
+              <w:bottom w:type="dxa" w:w="50"/>
+              <w:right w:type="dxa" w:w="80"/>
+            </w:tcMar>
+          </w:tcPr>
+          <w:p>
+            <w:pPr>
+              <w:spacing w:after="0" w:line="240"/>
+              <w:jc w:val="left"/>
+            </w:pPr>
+            <w:r>
+              <w:rPr>
+                <w:b w:val="false"/>
+                <w:bCs w:val="false"/>
+                <w:sz w:val="18"/>
+                <w:szCs w:val="18"/>
+              </w:rPr>
+              <w:t xml:space="preserve">2020-10</w:t>
+            </w:r>
+          </w:p>
+        </w:tc>
+        <w:tc>
+          <w:tcPr>
+            <w:tcW w:type="dxa" w:w="1170"/>
+            <w:tcMar>
+              <w:top w:type="dxa" w:w="50"/>
+              <w:left w:type="dxa" w:w="80"/>
+              <w:bottom w:type="dxa" w:w="50"/>
+              <w:right w:type="dxa" w:w="80"/>
+            </w:tcMar>
+          </w:tcPr>
+          <w:p>
+            <w:pPr>
+              <w:spacing w:after="0" w:line="240"/>
+              <w:jc w:val="right"/>
+            </w:pPr>
+            <w:r>
+              <w:rPr>
+                <w:b w:val="false"/>
+                <w:bCs w:val="false"/>
+                <w:sz w:val="18"/>
+                <w:szCs w:val="18"/>
+              </w:rPr>
+              <w:t xml:space="preserve">384</w:t>
+            </w:r>
+          </w:p>
+        </w:tc>
+        <w:tc>
+          <w:tcPr>
+            <w:tcW w:type="dxa" w:w="1170"/>
+            <w:tcMar>
+              <w:top w:type="dxa" w:w="50"/>
+              <w:left w:type="dxa" w:w="80"/>
+              <w:bottom w:type="dxa" w:w="50"/>
+              <w:right w:type="dxa" w:w="80"/>
+            </w:tcMar>
+          </w:tcPr>
+          <w:p>
+            <w:pPr>
+              <w:spacing w:after="0" w:line="240"/>
+              <w:jc w:val="right"/>
+            </w:pPr>
+            <w:r>
+              <w:rPr>
+                <w:b w:val="false"/>
+                <w:bCs w:val="false"/>
+                <w:sz w:val="18"/>
+                <w:szCs w:val="18"/>
+              </w:rPr>
+              <w:t xml:space="preserve">0.966</w:t>
+            </w:r>
+          </w:p>
+        </w:tc>
+        <w:tc>
+          <w:tcPr>
+            <w:tcW w:type="dxa" w:w="1755"/>
+            <w:tcMar>
+              <w:top w:type="dxa" w:w="50"/>
+              <w:left w:type="dxa" w:w="80"/>
+              <w:bottom w:type="dxa" w:w="50"/>
+              <w:right w:type="dxa" w:w="80"/>
+            </w:tcMar>
+          </w:tcPr>
+          <w:p>
+            <w:pPr>
+              <w:spacing w:after="0" w:line="240"/>
+              <w:jc w:val="left"/>
+            </w:pPr>
+            <w:r>
+              <w:rPr>
+                <w:b w:val="false"/>
+                <w:bCs w:val="false"/>
+                <w:sz w:val="18"/>
+                <w:szCs w:val="18"/>
+              </w:rPr>
+              <w:t xml:space="preserve">0.943-0.980</w:t>
+            </w:r>
+          </w:p>
+        </w:tc>
+        <w:tc>
+          <w:tcPr>
+            <w:tcW w:type="dxa" w:w="1170"/>
+            <w:tcMar>
+              <w:top w:type="dxa" w:w="50"/>
+              <w:left w:type="dxa" w:w="80"/>
+              <w:bottom w:type="dxa" w:w="50"/>
+              <w:right w:type="dxa" w:w="80"/>
+            </w:tcMar>
+          </w:tcPr>
+          <w:p>
+            <w:pPr>
+              <w:spacing w:after="0" w:line="240"/>
+              <w:jc w:val="right"/>
+            </w:pPr>
+            <w:r>
+              <w:rPr>
+                <w:b w:val="false"/>
+                <w:bCs w:val="false"/>
+                <w:sz w:val="18"/>
+                <w:szCs w:val="18"/>
+              </w:rPr>
+              <w:t xml:space="preserve">0.726</w:t>
+            </w:r>
+          </w:p>
+        </w:tc>
+        <w:tc>
+          <w:tcPr>
+            <w:tcW w:type="dxa" w:w="1755"/>
+            <w:tcMar>
+              <w:top w:type="dxa" w:w="50"/>
+              <w:left w:type="dxa" w:w="80"/>
+              <w:bottom w:type="dxa" w:w="50"/>
+              <w:right w:type="dxa" w:w="80"/>
+            </w:tcMar>
+          </w:tcPr>
+          <w:p>
+            <w:pPr>
+              <w:spacing w:after="0" w:line="240"/>
+              <w:jc w:val="left"/>
+            </w:pPr>
+            <w:r>
+              <w:rPr>
+                <w:b w:val="false"/>
+                <w:bCs w:val="false"/>
+                <w:sz w:val="18"/>
+                <w:szCs w:val="18"/>
+              </w:rPr>
+              <w:t xml:space="preserve">0.686-0.763</w:t>
+            </w:r>
+          </w:p>
+        </w:tc>
+        <w:tc>
+          <w:tcPr>
+            <w:tcW w:type="dxa" w:w="1170"/>
+            <w:tcMar>
+              <w:top w:type="dxa" w:w="50"/>
+              <w:left w:type="dxa" w:w="80"/>
+              <w:bottom w:type="dxa" w:w="50"/>
+              <w:right w:type="dxa" w:w="80"/>
+            </w:tcMar>
+          </w:tcPr>
+          <w:p>
+            <w:pPr>
+              <w:spacing w:after="0" w:line="240"/>
+              <w:jc w:val="right"/>
+            </w:pPr>
+            <w:r>
+              <w:rPr>
+                <w:b w:val="false"/>
+                <w:bCs w:val="false"/>
+                <w:sz w:val="18"/>
+                <w:szCs w:val="18"/>
+              </w:rPr>
+              <w:t xml:space="preserve">16.5</w:t>
+            </w:r>
+          </w:p>
+        </w:tc>
+      </w:tr>
+      <w:tr>
+        <w:tc>
+          <w:tcPr>
+            <w:tcW w:type="dxa" w:w="1170"/>
+            <w:tcMar>
+              <w:top w:type="dxa" w:w="50"/>
+              <w:left w:type="dxa" w:w="80"/>
+              <w:bottom w:type="dxa" w:w="50"/>
+              <w:right w:type="dxa" w:w="80"/>
+            </w:tcMar>
+          </w:tcPr>
+          <w:p>
+            <w:pPr>
+              <w:spacing w:after="0" w:line="240"/>
+              <w:jc w:val="left"/>
+            </w:pPr>
+            <w:r>
+              <w:rPr>
+                <w:b w:val="false"/>
+                <w:bCs w:val="false"/>
+                <w:sz w:val="18"/>
+                <w:szCs w:val="18"/>
+              </w:rPr>
+              <w:t xml:space="preserve">2020-11</w:t>
+            </w:r>
+          </w:p>
+        </w:tc>
+        <w:tc>
+          <w:tcPr>
+            <w:tcW w:type="dxa" w:w="1170"/>
+            <w:tcMar>
+              <w:top w:type="dxa" w:w="50"/>
+              <w:left w:type="dxa" w:w="80"/>
+              <w:bottom w:type="dxa" w:w="50"/>
+              <w:right w:type="dxa" w:w="80"/>
+            </w:tcMar>
+          </w:tcPr>
+          <w:p>
+            <w:pPr>
+              <w:spacing w:after="0" w:line="240"/>
+              <w:jc w:val="right"/>
+            </w:pPr>
+            <w:r>
+              <w:rPr>
+                <w:b w:val="false"/>
+                <w:bCs w:val="false"/>
+                <w:sz w:val="18"/>
+                <w:szCs w:val="18"/>
+              </w:rPr>
+              <w:t xml:space="preserve">294</w:t>
+            </w:r>
+          </w:p>
+        </w:tc>
+        <w:tc>
+          <w:tcPr>
+            <w:tcW w:type="dxa" w:w="1170"/>
+            <w:tcMar>
+              <w:top w:type="dxa" w:w="50"/>
+              <w:left w:type="dxa" w:w="80"/>
+              <w:bottom w:type="dxa" w:w="50"/>
+              <w:right w:type="dxa" w:w="80"/>
+            </w:tcMar>
+          </w:tcPr>
+          <w:p>
+            <w:pPr>
+              <w:spacing w:after="0" w:line="240"/>
+              <w:jc w:val="right"/>
+            </w:pPr>
+            <w:r>
+              <w:rPr>
+                <w:b w:val="false"/>
+                <w:bCs w:val="false"/>
+                <w:sz w:val="18"/>
+                <w:szCs w:val="18"/>
+              </w:rPr>
+              <w:t xml:space="preserve">0.980</w:t>
+            </w:r>
+          </w:p>
+        </w:tc>
+        <w:tc>
+          <w:tcPr>
+            <w:tcW w:type="dxa" w:w="1755"/>
+            <w:tcMar>
+              <w:top w:type="dxa" w:w="50"/>
+              <w:left w:type="dxa" w:w="80"/>
+              <w:bottom w:type="dxa" w:w="50"/>
+              <w:right w:type="dxa" w:w="80"/>
+            </w:tcMar>
+          </w:tcPr>
+          <w:p>
+            <w:pPr>
+              <w:spacing w:after="0" w:line="240"/>
+              <w:jc w:val="left"/>
+            </w:pPr>
+            <w:r>
+              <w:rPr>
+                <w:b w:val="false"/>
+                <w:bCs w:val="false"/>
+                <w:sz w:val="18"/>
+                <w:szCs w:val="18"/>
+              </w:rPr>
+              <w:t xml:space="preserve">0.956-0.991</w:t>
+            </w:r>
+          </w:p>
+        </w:tc>
+        <w:tc>
+          <w:tcPr>
+            <w:tcW w:type="dxa" w:w="1170"/>
+            <w:tcMar>
+              <w:top w:type="dxa" w:w="50"/>
+              <w:left w:type="dxa" w:w="80"/>
+              <w:bottom w:type="dxa" w:w="50"/>
+              <w:right w:type="dxa" w:w="80"/>
+            </w:tcMar>
+          </w:tcPr>
+          <w:p>
+            <w:pPr>
+              <w:spacing w:after="0" w:line="240"/>
+              <w:jc w:val="right"/>
+            </w:pPr>
+            <w:r>
+              <w:rPr>
+                <w:b w:val="false"/>
+                <w:bCs w:val="false"/>
+                <w:sz w:val="18"/>
+                <w:szCs w:val="18"/>
+              </w:rPr>
+              <w:t xml:space="preserve">0.713</w:t>
+            </w:r>
+          </w:p>
+        </w:tc>
+        <w:tc>
+          <w:tcPr>
+            <w:tcW w:type="dxa" w:w="1755"/>
+            <w:tcMar>
+              <w:top w:type="dxa" w:w="50"/>
+              <w:left w:type="dxa" w:w="80"/>
+              <w:bottom w:type="dxa" w:w="50"/>
+              <w:right w:type="dxa" w:w="80"/>
+            </w:tcMar>
+          </w:tcPr>
+          <w:p>
+            <w:pPr>
+              <w:spacing w:after="0" w:line="240"/>
+              <w:jc w:val="left"/>
+            </w:pPr>
+            <w:r>
+              <w:rPr>
+                <w:b w:val="false"/>
+                <w:bCs w:val="false"/>
+                <w:sz w:val="18"/>
+                <w:szCs w:val="18"/>
+              </w:rPr>
+              <w:t xml:space="preserve">0.667-0.755</w:t>
+            </w:r>
+          </w:p>
+        </w:tc>
+        <w:tc>
+          <w:tcPr>
+            <w:tcW w:type="dxa" w:w="1170"/>
+            <w:tcMar>
+              <w:top w:type="dxa" w:w="50"/>
+              <w:left w:type="dxa" w:w="80"/>
+              <w:bottom w:type="dxa" w:w="50"/>
+              <w:right w:type="dxa" w:w="80"/>
+            </w:tcMar>
+          </w:tcPr>
+          <w:p>
+            <w:pPr>
+              <w:spacing w:after="0" w:line="240"/>
+              <w:jc w:val="right"/>
+            </w:pPr>
+            <w:r>
+              <w:rPr>
+                <w:b w:val="false"/>
+                <w:bCs w:val="false"/>
+                <w:sz w:val="18"/>
+                <w:szCs w:val="18"/>
+              </w:rPr>
+              <w:t xml:space="preserve">13.5</w:t>
+            </w:r>
+          </w:p>
+        </w:tc>
+      </w:tr>
+      <w:tr>
+        <w:tc>
+          <w:tcPr>
+            <w:tcW w:type="dxa" w:w="1170"/>
+            <w:tcMar>
+              <w:top w:type="dxa" w:w="50"/>
+              <w:left w:type="dxa" w:w="80"/>
+              <w:bottom w:type="dxa" w:w="50"/>
+              <w:right w:type="dxa" w:w="80"/>
+            </w:tcMar>
+          </w:tcPr>
+          <w:p>
+            <w:pPr>
+              <w:spacing w:after="0" w:line="240"/>
+              <w:jc w:val="left"/>
+            </w:pPr>
+            <w:r>
+              <w:rPr>
+                <w:b w:val="false"/>
+                <w:bCs w:val="false"/>
+                <w:sz w:val="18"/>
+                <w:szCs w:val="18"/>
+              </w:rPr>
+              <w:t xml:space="preserve">2020-12</w:t>
+            </w:r>
+          </w:p>
+        </w:tc>
+        <w:tc>
+          <w:tcPr>
+            <w:tcW w:type="dxa" w:w="1170"/>
+            <w:tcMar>
+              <w:top w:type="dxa" w:w="50"/>
+              <w:left w:type="dxa" w:w="80"/>
+              <w:bottom w:type="dxa" w:w="50"/>
+              <w:right w:type="dxa" w:w="80"/>
+            </w:tcMar>
+          </w:tcPr>
+          <w:p>
+            <w:pPr>
+              <w:spacing w:after="0" w:line="240"/>
+              <w:jc w:val="right"/>
+            </w:pPr>
+            <w:r>
+              <w:rPr>
+                <w:b w:val="false"/>
+                <w:bCs w:val="false"/>
+                <w:sz w:val="18"/>
+                <w:szCs w:val="18"/>
+              </w:rPr>
+              <w:t xml:space="preserve">258</w:t>
+            </w:r>
+          </w:p>
+        </w:tc>
+        <w:tc>
+          <w:tcPr>
+            <w:tcW w:type="dxa" w:w="1170"/>
+            <w:tcMar>
+              <w:top w:type="dxa" w:w="50"/>
+              <w:left w:type="dxa" w:w="80"/>
+              <w:bottom w:type="dxa" w:w="50"/>
+              <w:right w:type="dxa" w:w="80"/>
+            </w:tcMar>
+          </w:tcPr>
+          <w:p>
+            <w:pPr>
+              <w:spacing w:after="0" w:line="240"/>
+              <w:jc w:val="right"/>
+            </w:pPr>
+            <w:r>
+              <w:rPr>
+                <w:b w:val="false"/>
+                <w:bCs w:val="false"/>
+                <w:sz w:val="18"/>
+                <w:szCs w:val="18"/>
+              </w:rPr>
+              <w:t xml:space="preserve">0.950</w:t>
+            </w:r>
+          </w:p>
+        </w:tc>
+        <w:tc>
+          <w:tcPr>
+            <w:tcW w:type="dxa" w:w="1755"/>
+            <w:tcMar>
+              <w:top w:type="dxa" w:w="50"/>
+              <w:left w:type="dxa" w:w="80"/>
+              <w:bottom w:type="dxa" w:w="50"/>
+              <w:right w:type="dxa" w:w="80"/>
+            </w:tcMar>
+          </w:tcPr>
+          <w:p>
+            <w:pPr>
+              <w:spacing w:after="0" w:line="240"/>
+              <w:jc w:val="left"/>
+            </w:pPr>
+            <w:r>
+              <w:rPr>
+                <w:b w:val="false"/>
+                <w:bCs w:val="false"/>
+                <w:sz w:val="18"/>
+                <w:szCs w:val="18"/>
+              </w:rPr>
+              <w:t xml:space="preserve">0.916-0.970</w:t>
+            </w:r>
+          </w:p>
+        </w:tc>
+        <w:tc>
+          <w:tcPr>
+            <w:tcW w:type="dxa" w:w="1170"/>
+            <w:tcMar>
+              <w:top w:type="dxa" w:w="50"/>
+              <w:left w:type="dxa" w:w="80"/>
+              <w:bottom w:type="dxa" w:w="50"/>
+              <w:right w:type="dxa" w:w="80"/>
+            </w:tcMar>
+          </w:tcPr>
+          <w:p>
+            <w:pPr>
+              <w:spacing w:after="0" w:line="240"/>
+              <w:jc w:val="right"/>
+            </w:pPr>
+            <w:r>
+              <w:rPr>
+                <w:b w:val="false"/>
+                <w:bCs w:val="false"/>
+                <w:sz w:val="18"/>
+                <w:szCs w:val="18"/>
+              </w:rPr>
+              <w:t xml:space="preserve">0.671</w:t>
+            </w:r>
+          </w:p>
+        </w:tc>
+        <w:tc>
+          <w:tcPr>
+            <w:tcW w:type="dxa" w:w="1755"/>
+            <w:tcMar>
+              <w:top w:type="dxa" w:w="50"/>
+              <w:left w:type="dxa" w:w="80"/>
+              <w:bottom w:type="dxa" w:w="50"/>
+              <w:right w:type="dxa" w:w="80"/>
+            </w:tcMar>
+          </w:tcPr>
+          <w:p>
+            <w:pPr>
+              <w:spacing w:after="0" w:line="240"/>
+              <w:jc w:val="left"/>
+            </w:pPr>
+            <w:r>
+              <w:rPr>
+                <w:b w:val="false"/>
+                <w:bCs w:val="false"/>
+                <w:sz w:val="18"/>
+                <w:szCs w:val="18"/>
+              </w:rPr>
+              <w:t xml:space="preserve">0.622-0.717</w:t>
+            </w:r>
+          </w:p>
+        </w:tc>
+        <w:tc>
+          <w:tcPr>
+            <w:tcW w:type="dxa" w:w="1170"/>
+            <w:tcMar>
+              <w:top w:type="dxa" w:w="50"/>
+              <w:left w:type="dxa" w:w="80"/>
+              <w:bottom w:type="dxa" w:w="50"/>
+              <w:right w:type="dxa" w:w="80"/>
+            </w:tcMar>
+          </w:tcPr>
+          <w:p>
+            <w:pPr>
+              <w:spacing w:after="0" w:line="240"/>
+              <w:jc w:val="right"/>
+            </w:pPr>
+            <w:r>
+              <w:rPr>
+                <w:b w:val="false"/>
+                <w:bCs w:val="false"/>
+                <w:sz w:val="18"/>
+                <w:szCs w:val="18"/>
+              </w:rPr>
+              <w:t xml:space="preserve">11.8</w:t>
+            </w:r>
+          </w:p>
+        </w:tc>
+      </w:tr>
+    </w:tbl>
+    <w:p>
+      <w:pPr>
+        <w:spacing w:after="120"/>
+      </w:pPr>
+    </w:p>
+    <w:p>
+      <w:pPr>
+        <w:spacing w:after="140" w:line="276"/>
+      </w:pPr>
+      <w:r>
+        <w:rPr>
+          <w:sz w:val="22"/>
+          <w:szCs w:val="22"/>
+        </w:rPr>
+        <w:t xml:space="preserve">Every month stays above the policy floors (recall 85%, precision 40%), and a chi-square test finds no more variation between months than chance (recall p = 0.28, precision p = 0.17). The same check runs after every monitoring cycle (fraudlens.stability).</w:t>
+      </w:r>
+    </w:p>
+    <w:p>
+      <w:pPr>
+        <w:spacing w:after="80" w:before="160"/>
+      </w:pPr>
+      <w:r>
+        <w:rPr>
+          <w:i/>
+          <w:iCs/>
+          <w:color w:val="444444"/>
+          <w:sz w:val="19"/>
+          <w:szCs w:val="19"/>
+        </w:rPr>
+        <w:t xml:space="preserve">Table 13. Performance by group on the test period.</w:t>
       </w:r>
     </w:p>
     <w:tbl>
@@ -10632,6 +12168,27 @@
           <w:szCs w:val="22"/>
         </w:rPr>
         <w:t xml:space="preserve">SHAP explains every score in log-odds contributions. For this champion's native categorical splits TreeSHAP's values did not reproduce the model output, so the pipeline automatically switched to SHAP's permutation explainer on the same output, which is exactly additive. The largest average contributions are amount (2.83), category (1.22), amt_sum_24h (1.16), is_night (0.66), txn_count_7d (0.55), consistent with the EDA. Every alert carries its top three reasons into the dashboard and the API. ELI5 weights of the logistic baseline and a Yellowbrick precision-recall curve of the champion (notebook 06) give independent views of the same picture.</w:t>
+      </w:r>
+    </w:p>
+    <w:p>
+      <w:pPr>
+        <w:spacing w:after="140" w:line="276"/>
+      </w:pPr>
+      <w:r>
+        <w:rPr>
+          <w:b/>
+          <w:bCs/>
+          <w:sz w:val="22"/>
+          <w:szCs w:val="22"/>
+        </w:rPr>
+        <w:t xml:space="preserve">Are the explanations faithful?</w:t>
+      </w:r>
+      <w:r>
+        <w:rPr>
+          <w:sz w:val="22"/>
+          <w:szCs w:val="22"/>
+        </w:rPr>
+        <w:t xml:space="preserve"> On 200 sampled test-period alerts, replacing each alert's top-3 SHAP features with typical values lowers its score by 0.946 on average, against 0.200 when 3 random features are replaced (4.7× more), and clears 100% of the alerts against 51%. Explaining the same alerts with a different random seed gives a top-3 overlap (Jaccard) of 0.893; the median additivity error is 0 log-odds. The reasons analysts see therefore point at what the model actually used. Each live alert also carries a counterfactual: a lower amount at which it would have been approved with the same card history.</w:t>
       </w:r>
     </w:p>
     <w:p>
@@ -10694,6 +12251,1011 @@
           <w:szCs w:val="19"/>
         </w:rPr>
         <w:t xml:space="preserve">Figure 7. SHAP beeswarm: how each feature's value moves the score (test period).</w:t>
+      </w:r>
+    </w:p>
+    <w:p>
+      <w:pPr>
+        <w:pStyle w:val="Heading2"/>
+        <w:spacing w:after="120" w:before="260"/>
+      </w:pPr>
+      <w:r>
+        <w:t xml:space="preserve">7.5 How far the results transfer to real transactions</w:t>
+      </w:r>
+    </w:p>
+    <w:p>
+      <w:pPr>
+        <w:spacing w:after="140" w:line="276"/>
+      </w:pPr>
+      <w:r>
+        <w:rPr>
+          <w:sz w:val="22"/>
+          <w:szCs w:val="22"/>
+        </w:rPr>
+        <w:t xml:space="preserve">The data are simulated, so the test metrics are an optimistic guide. Precision depends on how common fraud is and on how many false alarms real customers trigger. The table carries the test recall (96.2%) and false-positive rate (0.142%) over to other fraud rates and to two and five times as many false alarms, at 2,875 transactions a day.</w:t>
+      </w:r>
+    </w:p>
+    <w:p>
+      <w:pPr>
+        <w:spacing w:after="80" w:before="160"/>
+      </w:pPr>
+      <w:r>
+        <w:rPr>
+          <w:i/>
+          <w:iCs/>
+          <w:color w:val="444444"/>
+          <w:sz w:val="19"/>
+          <w:szCs w:val="19"/>
+        </w:rPr>
+        <w:t xml:space="preserve">Table 14. Precision and alert volume under other conditions (same recall).</w:t>
+      </w:r>
+    </w:p>
+    <w:tbl>
+      <w:tblPr>
+        <w:tblW w:type="dxa" w:w="9360"/>
+        <w:tblBorders>
+          <w:top w:val="single" w:color="auto" w:sz="4"/>
+          <w:left w:val="single" w:color="auto" w:sz="4"/>
+          <w:bottom w:val="single" w:color="auto" w:sz="4"/>
+          <w:right w:val="single" w:color="auto" w:sz="4"/>
+          <w:insideH w:val="single" w:color="auto" w:sz="4"/>
+          <w:insideV w:val="single" w:color="auto" w:sz="4"/>
+        </w:tblBorders>
+      </w:tblPr>
+      <w:tblGrid>
+        <w:gridCol w:w="2160"/>
+        <w:gridCol w:w="1440"/>
+        <w:gridCol w:w="1440"/>
+        <w:gridCol w:w="2160"/>
+        <w:gridCol w:w="2160"/>
+      </w:tblGrid>
+      <w:tr>
+        <w:trPr>
+          <w:tblHeader/>
+        </w:trPr>
+        <w:tc>
+          <w:tcPr>
+            <w:tcW w:type="dxa" w:w="2160"/>
+            <w:shd w:fill="DCE6F1" w:color="auto" w:val="clear"/>
+            <w:tcMar>
+              <w:top w:type="dxa" w:w="50"/>
+              <w:left w:type="dxa" w:w="80"/>
+              <w:bottom w:type="dxa" w:w="50"/>
+              <w:right w:type="dxa" w:w="80"/>
+            </w:tcMar>
+          </w:tcPr>
+          <w:p>
+            <w:pPr>
+              <w:spacing w:after="0" w:line="240"/>
+              <w:jc w:val="left"/>
+            </w:pPr>
+            <w:r>
+              <w:rPr>
+                <w:b/>
+                <w:bCs/>
+                <w:sz w:val="18"/>
+                <w:szCs w:val="18"/>
+              </w:rPr>
+              <w:t xml:space="preserve">Fraud rate</w:t>
+            </w:r>
+          </w:p>
+        </w:tc>
+        <w:tc>
+          <w:tcPr>
+            <w:tcW w:type="dxa" w:w="1440"/>
+            <w:shd w:fill="DCE6F1" w:color="auto" w:val="clear"/>
+            <w:tcMar>
+              <w:top w:type="dxa" w:w="50"/>
+              <w:left w:type="dxa" w:w="80"/>
+              <w:bottom w:type="dxa" w:w="50"/>
+              <w:right w:type="dxa" w:w="80"/>
+            </w:tcMar>
+          </w:tcPr>
+          <w:p>
+            <w:pPr>
+              <w:spacing w:after="0" w:line="240"/>
+              <w:jc w:val="left"/>
+            </w:pPr>
+            <w:r>
+              <w:rPr>
+                <w:b/>
+                <w:bCs/>
+                <w:sz w:val="18"/>
+                <w:szCs w:val="18"/>
+              </w:rPr>
+              <w:t xml:space="preserve">Precision</w:t>
+            </w:r>
+          </w:p>
+        </w:tc>
+        <w:tc>
+          <w:tcPr>
+            <w:tcW w:type="dxa" w:w="1440"/>
+            <w:shd w:fill="DCE6F1" w:color="auto" w:val="clear"/>
+            <w:tcMar>
+              <w:top w:type="dxa" w:w="50"/>
+              <w:left w:type="dxa" w:w="80"/>
+              <w:bottom w:type="dxa" w:w="50"/>
+              <w:right w:type="dxa" w:w="80"/>
+            </w:tcMar>
+          </w:tcPr>
+          <w:p>
+            <w:pPr>
+              <w:spacing w:after="0" w:line="240"/>
+              <w:jc w:val="left"/>
+            </w:pPr>
+            <w:r>
+              <w:rPr>
+                <w:b/>
+                <w:bCs/>
+                <w:sz w:val="18"/>
+                <w:szCs w:val="18"/>
+              </w:rPr>
+              <w:t xml:space="preserve">Alerts/day</w:t>
+            </w:r>
+          </w:p>
+        </w:tc>
+        <w:tc>
+          <w:tcPr>
+            <w:tcW w:type="dxa" w:w="2160"/>
+            <w:shd w:fill="DCE6F1" w:color="auto" w:val="clear"/>
+            <w:tcMar>
+              <w:top w:type="dxa" w:w="50"/>
+              <w:left w:type="dxa" w:w="80"/>
+              <w:bottom w:type="dxa" w:w="50"/>
+              <w:right w:type="dxa" w:w="80"/>
+            </w:tcMar>
+          </w:tcPr>
+          <w:p>
+            <w:pPr>
+              <w:spacing w:after="0" w:line="240"/>
+              <w:jc w:val="left"/>
+            </w:pPr>
+            <w:r>
+              <w:rPr>
+                <w:b/>
+                <w:bCs/>
+                <w:sz w:val="18"/>
+                <w:szCs w:val="18"/>
+              </w:rPr>
+              <w:t xml:space="preserve">Precision, 2× false alarms</w:t>
+            </w:r>
+          </w:p>
+        </w:tc>
+        <w:tc>
+          <w:tcPr>
+            <w:tcW w:type="dxa" w:w="2160"/>
+            <w:shd w:fill="DCE6F1" w:color="auto" w:val="clear"/>
+            <w:tcMar>
+              <w:top w:type="dxa" w:w="50"/>
+              <w:left w:type="dxa" w:w="80"/>
+              <w:bottom w:type="dxa" w:w="50"/>
+              <w:right w:type="dxa" w:w="80"/>
+            </w:tcMar>
+          </w:tcPr>
+          <w:p>
+            <w:pPr>
+              <w:spacing w:after="0" w:line="240"/>
+              <w:jc w:val="left"/>
+            </w:pPr>
+            <w:r>
+              <w:rPr>
+                <w:b/>
+                <w:bCs/>
+                <w:sz w:val="18"/>
+                <w:szCs w:val="18"/>
+              </w:rPr>
+              <w:t xml:space="preserve">Precision, 5× false alarms</w:t>
+            </w:r>
+          </w:p>
+        </w:tc>
+      </w:tr>
+      <w:tr>
+        <w:tc>
+          <w:tcPr>
+            <w:tcW w:type="dxa" w:w="2160"/>
+            <w:tcMar>
+              <w:top w:type="dxa" w:w="50"/>
+              <w:left w:type="dxa" w:w="80"/>
+              <w:bottom w:type="dxa" w:w="50"/>
+              <w:right w:type="dxa" w:w="80"/>
+            </w:tcMar>
+          </w:tcPr>
+          <w:p>
+            <w:pPr>
+              <w:spacing w:after="0" w:line="240"/>
+              <w:jc w:val="left"/>
+            </w:pPr>
+            <w:r>
+              <w:rPr>
+                <w:b w:val="false"/>
+                <w:bCs w:val="false"/>
+                <w:sz w:val="18"/>
+                <w:szCs w:val="18"/>
+              </w:rPr>
+              <w:t xml:space="preserve">0.05%</w:t>
+            </w:r>
+          </w:p>
+        </w:tc>
+        <w:tc>
+          <w:tcPr>
+            <w:tcW w:type="dxa" w:w="1440"/>
+            <w:tcMar>
+              <w:top w:type="dxa" w:w="50"/>
+              <w:left w:type="dxa" w:w="80"/>
+              <w:bottom w:type="dxa" w:w="50"/>
+              <w:right w:type="dxa" w:w="80"/>
+            </w:tcMar>
+          </w:tcPr>
+          <w:p>
+            <w:pPr>
+              <w:spacing w:after="0" w:line="240"/>
+              <w:jc w:val="right"/>
+            </w:pPr>
+            <w:r>
+              <w:rPr>
+                <w:b w:val="false"/>
+                <w:bCs w:val="false"/>
+                <w:sz w:val="18"/>
+                <w:szCs w:val="18"/>
+              </w:rPr>
+              <w:t xml:space="preserve">25%</w:t>
+            </w:r>
+          </w:p>
+        </w:tc>
+        <w:tc>
+          <w:tcPr>
+            <w:tcW w:type="dxa" w:w="1440"/>
+            <w:tcMar>
+              <w:top w:type="dxa" w:w="50"/>
+              <w:left w:type="dxa" w:w="80"/>
+              <w:bottom w:type="dxa" w:w="50"/>
+              <w:right w:type="dxa" w:w="80"/>
+            </w:tcMar>
+          </w:tcPr>
+          <w:p>
+            <w:pPr>
+              <w:spacing w:after="0" w:line="240"/>
+              <w:jc w:val="right"/>
+            </w:pPr>
+            <w:r>
+              <w:rPr>
+                <w:b w:val="false"/>
+                <w:bCs w:val="false"/>
+                <w:sz w:val="18"/>
+                <w:szCs w:val="18"/>
+              </w:rPr>
+              <w:t xml:space="preserve">5.5</w:t>
+            </w:r>
+          </w:p>
+        </w:tc>
+        <w:tc>
+          <w:tcPr>
+            <w:tcW w:type="dxa" w:w="2160"/>
+            <w:tcMar>
+              <w:top w:type="dxa" w:w="50"/>
+              <w:left w:type="dxa" w:w="80"/>
+              <w:bottom w:type="dxa" w:w="50"/>
+              <w:right w:type="dxa" w:w="80"/>
+            </w:tcMar>
+          </w:tcPr>
+          <w:p>
+            <w:pPr>
+              <w:spacing w:after="0" w:line="240"/>
+              <w:jc w:val="right"/>
+            </w:pPr>
+            <w:r>
+              <w:rPr>
+                <w:b w:val="false"/>
+                <w:bCs w:val="false"/>
+                <w:sz w:val="18"/>
+                <w:szCs w:val="18"/>
+              </w:rPr>
+              <w:t xml:space="preserve">14%</w:t>
+            </w:r>
+          </w:p>
+        </w:tc>
+        <w:tc>
+          <w:tcPr>
+            <w:tcW w:type="dxa" w:w="2160"/>
+            <w:tcMar>
+              <w:top w:type="dxa" w:w="50"/>
+              <w:left w:type="dxa" w:w="80"/>
+              <w:bottom w:type="dxa" w:w="50"/>
+              <w:right w:type="dxa" w:w="80"/>
+            </w:tcMar>
+          </w:tcPr>
+          <w:p>
+            <w:pPr>
+              <w:spacing w:after="0" w:line="240"/>
+              <w:jc w:val="right"/>
+            </w:pPr>
+            <w:r>
+              <w:rPr>
+                <w:b w:val="false"/>
+                <w:bCs w:val="false"/>
+                <w:sz w:val="18"/>
+                <w:szCs w:val="18"/>
+              </w:rPr>
+              <w:t xml:space="preserve">6%</w:t>
+            </w:r>
+          </w:p>
+        </w:tc>
+      </w:tr>
+      <w:tr>
+        <w:tc>
+          <w:tcPr>
+            <w:tcW w:type="dxa" w:w="2160"/>
+            <w:tcMar>
+              <w:top w:type="dxa" w:w="50"/>
+              <w:left w:type="dxa" w:w="80"/>
+              <w:bottom w:type="dxa" w:w="50"/>
+              <w:right w:type="dxa" w:w="80"/>
+            </w:tcMar>
+          </w:tcPr>
+          <w:p>
+            <w:pPr>
+              <w:spacing w:after="0" w:line="240"/>
+              <w:jc w:val="left"/>
+            </w:pPr>
+            <w:r>
+              <w:rPr>
+                <w:b w:val="false"/>
+                <w:bCs w:val="false"/>
+                <w:sz w:val="18"/>
+                <w:szCs w:val="18"/>
+              </w:rPr>
+              <w:t xml:space="preserve">0.10%</w:t>
+            </w:r>
+          </w:p>
+        </w:tc>
+        <w:tc>
+          <w:tcPr>
+            <w:tcW w:type="dxa" w:w="1440"/>
+            <w:tcMar>
+              <w:top w:type="dxa" w:w="50"/>
+              <w:left w:type="dxa" w:w="80"/>
+              <w:bottom w:type="dxa" w:w="50"/>
+              <w:right w:type="dxa" w:w="80"/>
+            </w:tcMar>
+          </w:tcPr>
+          <w:p>
+            <w:pPr>
+              <w:spacing w:after="0" w:line="240"/>
+              <w:jc w:val="right"/>
+            </w:pPr>
+            <w:r>
+              <w:rPr>
+                <w:b w:val="false"/>
+                <w:bCs w:val="false"/>
+                <w:sz w:val="18"/>
+                <w:szCs w:val="18"/>
+              </w:rPr>
+              <w:t xml:space="preserve">40%</w:t>
+            </w:r>
+          </w:p>
+        </w:tc>
+        <w:tc>
+          <w:tcPr>
+            <w:tcW w:type="dxa" w:w="1440"/>
+            <w:tcMar>
+              <w:top w:type="dxa" w:w="50"/>
+              <w:left w:type="dxa" w:w="80"/>
+              <w:bottom w:type="dxa" w:w="50"/>
+              <w:right w:type="dxa" w:w="80"/>
+            </w:tcMar>
+          </w:tcPr>
+          <w:p>
+            <w:pPr>
+              <w:spacing w:after="0" w:line="240"/>
+              <w:jc w:val="right"/>
+            </w:pPr>
+            <w:r>
+              <w:rPr>
+                <w:b w:val="false"/>
+                <w:bCs w:val="false"/>
+                <w:sz w:val="18"/>
+                <w:szCs w:val="18"/>
+              </w:rPr>
+              <w:t xml:space="preserve">6.9</w:t>
+            </w:r>
+          </w:p>
+        </w:tc>
+        <w:tc>
+          <w:tcPr>
+            <w:tcW w:type="dxa" w:w="2160"/>
+            <w:tcMar>
+              <w:top w:type="dxa" w:w="50"/>
+              <w:left w:type="dxa" w:w="80"/>
+              <w:bottom w:type="dxa" w:w="50"/>
+              <w:right w:type="dxa" w:w="80"/>
+            </w:tcMar>
+          </w:tcPr>
+          <w:p>
+            <w:pPr>
+              <w:spacing w:after="0" w:line="240"/>
+              <w:jc w:val="right"/>
+            </w:pPr>
+            <w:r>
+              <w:rPr>
+                <w:b w:val="false"/>
+                <w:bCs w:val="false"/>
+                <w:sz w:val="18"/>
+                <w:szCs w:val="18"/>
+              </w:rPr>
+              <w:t xml:space="preserve">25%</w:t>
+            </w:r>
+          </w:p>
+        </w:tc>
+        <w:tc>
+          <w:tcPr>
+            <w:tcW w:type="dxa" w:w="2160"/>
+            <w:tcMar>
+              <w:top w:type="dxa" w:w="50"/>
+              <w:left w:type="dxa" w:w="80"/>
+              <w:bottom w:type="dxa" w:w="50"/>
+              <w:right w:type="dxa" w:w="80"/>
+            </w:tcMar>
+          </w:tcPr>
+          <w:p>
+            <w:pPr>
+              <w:spacing w:after="0" w:line="240"/>
+              <w:jc w:val="right"/>
+            </w:pPr>
+            <w:r>
+              <w:rPr>
+                <w:b w:val="false"/>
+                <w:bCs w:val="false"/>
+                <w:sz w:val="18"/>
+                <w:szCs w:val="18"/>
+              </w:rPr>
+              <w:t xml:space="preserve">12%</w:t>
+            </w:r>
+          </w:p>
+        </w:tc>
+      </w:tr>
+      <w:tr>
+        <w:tc>
+          <w:tcPr>
+            <w:tcW w:type="dxa" w:w="2160"/>
+            <w:tcMar>
+              <w:top w:type="dxa" w:w="50"/>
+              <w:left w:type="dxa" w:w="80"/>
+              <w:bottom w:type="dxa" w:w="50"/>
+              <w:right w:type="dxa" w:w="80"/>
+            </w:tcMar>
+          </w:tcPr>
+          <w:p>
+            <w:pPr>
+              <w:spacing w:after="0" w:line="240"/>
+              <w:jc w:val="left"/>
+            </w:pPr>
+            <w:r>
+              <w:rPr>
+                <w:b w:val="false"/>
+                <w:bCs w:val="false"/>
+                <w:sz w:val="18"/>
+                <w:szCs w:val="18"/>
+              </w:rPr>
+              <w:t xml:space="preserve">0.20%</w:t>
+            </w:r>
+          </w:p>
+        </w:tc>
+        <w:tc>
+          <w:tcPr>
+            <w:tcW w:type="dxa" w:w="1440"/>
+            <w:tcMar>
+              <w:top w:type="dxa" w:w="50"/>
+              <w:left w:type="dxa" w:w="80"/>
+              <w:bottom w:type="dxa" w:w="50"/>
+              <w:right w:type="dxa" w:w="80"/>
+            </w:tcMar>
+          </w:tcPr>
+          <w:p>
+            <w:pPr>
+              <w:spacing w:after="0" w:line="240"/>
+              <w:jc w:val="right"/>
+            </w:pPr>
+            <w:r>
+              <w:rPr>
+                <w:b w:val="false"/>
+                <w:bCs w:val="false"/>
+                <w:sz w:val="18"/>
+                <w:szCs w:val="18"/>
+              </w:rPr>
+              <w:t xml:space="preserve">58%</w:t>
+            </w:r>
+          </w:p>
+        </w:tc>
+        <w:tc>
+          <w:tcPr>
+            <w:tcW w:type="dxa" w:w="1440"/>
+            <w:tcMar>
+              <w:top w:type="dxa" w:w="50"/>
+              <w:left w:type="dxa" w:w="80"/>
+              <w:bottom w:type="dxa" w:w="50"/>
+              <w:right w:type="dxa" w:w="80"/>
+            </w:tcMar>
+          </w:tcPr>
+          <w:p>
+            <w:pPr>
+              <w:spacing w:after="0" w:line="240"/>
+              <w:jc w:val="right"/>
+            </w:pPr>
+            <w:r>
+              <w:rPr>
+                <w:b w:val="false"/>
+                <w:bCs w:val="false"/>
+                <w:sz w:val="18"/>
+                <w:szCs w:val="18"/>
+              </w:rPr>
+              <w:t xml:space="preserve">9.6</w:t>
+            </w:r>
+          </w:p>
+        </w:tc>
+        <w:tc>
+          <w:tcPr>
+            <w:tcW w:type="dxa" w:w="2160"/>
+            <w:tcMar>
+              <w:top w:type="dxa" w:w="50"/>
+              <w:left w:type="dxa" w:w="80"/>
+              <w:bottom w:type="dxa" w:w="50"/>
+              <w:right w:type="dxa" w:w="80"/>
+            </w:tcMar>
+          </w:tcPr>
+          <w:p>
+            <w:pPr>
+              <w:spacing w:after="0" w:line="240"/>
+              <w:jc w:val="right"/>
+            </w:pPr>
+            <w:r>
+              <w:rPr>
+                <w:b w:val="false"/>
+                <w:bCs w:val="false"/>
+                <w:sz w:val="18"/>
+                <w:szCs w:val="18"/>
+              </w:rPr>
+              <w:t xml:space="preserve">40%</w:t>
+            </w:r>
+          </w:p>
+        </w:tc>
+        <w:tc>
+          <w:tcPr>
+            <w:tcW w:type="dxa" w:w="2160"/>
+            <w:tcMar>
+              <w:top w:type="dxa" w:w="50"/>
+              <w:left w:type="dxa" w:w="80"/>
+              <w:bottom w:type="dxa" w:w="50"/>
+              <w:right w:type="dxa" w:w="80"/>
+            </w:tcMar>
+          </w:tcPr>
+          <w:p>
+            <w:pPr>
+              <w:spacing w:after="0" w:line="240"/>
+              <w:jc w:val="right"/>
+            </w:pPr>
+            <w:r>
+              <w:rPr>
+                <w:b w:val="false"/>
+                <w:bCs w:val="false"/>
+                <w:sz w:val="18"/>
+                <w:szCs w:val="18"/>
+              </w:rPr>
+              <w:t xml:space="preserve">21%</w:t>
+            </w:r>
+          </w:p>
+        </w:tc>
+      </w:tr>
+      <w:tr>
+        <w:tc>
+          <w:tcPr>
+            <w:tcW w:type="dxa" w:w="2160"/>
+            <w:tcMar>
+              <w:top w:type="dxa" w:w="50"/>
+              <w:left w:type="dxa" w:w="80"/>
+              <w:bottom w:type="dxa" w:w="50"/>
+              <w:right w:type="dxa" w:w="80"/>
+            </w:tcMar>
+          </w:tcPr>
+          <w:p>
+            <w:pPr>
+              <w:spacing w:after="0" w:line="240"/>
+              <w:jc w:val="left"/>
+            </w:pPr>
+            <w:r>
+              <w:rPr>
+                <w:b w:val="false"/>
+                <w:bCs w:val="false"/>
+                <w:sz w:val="18"/>
+                <w:szCs w:val="18"/>
+              </w:rPr>
+              <w:t xml:space="preserve">0.39% (test)</w:t>
+            </w:r>
+          </w:p>
+        </w:tc>
+        <w:tc>
+          <w:tcPr>
+            <w:tcW w:type="dxa" w:w="1440"/>
+            <w:tcMar>
+              <w:top w:type="dxa" w:w="50"/>
+              <w:left w:type="dxa" w:w="80"/>
+              <w:bottom w:type="dxa" w:w="50"/>
+              <w:right w:type="dxa" w:w="80"/>
+            </w:tcMar>
+          </w:tcPr>
+          <w:p>
+            <w:pPr>
+              <w:spacing w:after="0" w:line="240"/>
+              <w:jc w:val="right"/>
+            </w:pPr>
+            <w:r>
+              <w:rPr>
+                <w:b w:val="false"/>
+                <w:bCs w:val="false"/>
+                <w:sz w:val="18"/>
+                <w:szCs w:val="18"/>
+              </w:rPr>
+              <w:t xml:space="preserve">72%</w:t>
+            </w:r>
+          </w:p>
+        </w:tc>
+        <w:tc>
+          <w:tcPr>
+            <w:tcW w:type="dxa" w:w="1440"/>
+            <w:tcMar>
+              <w:top w:type="dxa" w:w="50"/>
+              <w:left w:type="dxa" w:w="80"/>
+              <w:bottom w:type="dxa" w:w="50"/>
+              <w:right w:type="dxa" w:w="80"/>
+            </w:tcMar>
+          </w:tcPr>
+          <w:p>
+            <w:pPr>
+              <w:spacing w:after="0" w:line="240"/>
+              <w:jc w:val="right"/>
+            </w:pPr>
+            <w:r>
+              <w:rPr>
+                <w:b w:val="false"/>
+                <w:bCs w:val="false"/>
+                <w:sz w:val="18"/>
+                <w:szCs w:val="18"/>
+              </w:rPr>
+              <w:t xml:space="preserve">14.8</w:t>
+            </w:r>
+          </w:p>
+        </w:tc>
+        <w:tc>
+          <w:tcPr>
+            <w:tcW w:type="dxa" w:w="2160"/>
+            <w:tcMar>
+              <w:top w:type="dxa" w:w="50"/>
+              <w:left w:type="dxa" w:w="80"/>
+              <w:bottom w:type="dxa" w:w="50"/>
+              <w:right w:type="dxa" w:w="80"/>
+            </w:tcMar>
+          </w:tcPr>
+          <w:p>
+            <w:pPr>
+              <w:spacing w:after="0" w:line="240"/>
+              <w:jc w:val="right"/>
+            </w:pPr>
+            <w:r>
+              <w:rPr>
+                <w:b w:val="false"/>
+                <w:bCs w:val="false"/>
+                <w:sz w:val="18"/>
+                <w:szCs w:val="18"/>
+              </w:rPr>
+              <w:t xml:space="preserve">57%</w:t>
+            </w:r>
+          </w:p>
+        </w:tc>
+        <w:tc>
+          <w:tcPr>
+            <w:tcW w:type="dxa" w:w="2160"/>
+            <w:tcMar>
+              <w:top w:type="dxa" w:w="50"/>
+              <w:left w:type="dxa" w:w="80"/>
+              <w:bottom w:type="dxa" w:w="50"/>
+              <w:right w:type="dxa" w:w="80"/>
+            </w:tcMar>
+          </w:tcPr>
+          <w:p>
+            <w:pPr>
+              <w:spacing w:after="0" w:line="240"/>
+              <w:jc w:val="right"/>
+            </w:pPr>
+            <w:r>
+              <w:rPr>
+                <w:b w:val="false"/>
+                <w:bCs w:val="false"/>
+                <w:sz w:val="18"/>
+                <w:szCs w:val="18"/>
+              </w:rPr>
+              <w:t xml:space="preserve">34%</w:t>
+            </w:r>
+          </w:p>
+        </w:tc>
+      </w:tr>
+      <w:tr>
+        <w:tc>
+          <w:tcPr>
+            <w:tcW w:type="dxa" w:w="2160"/>
+            <w:tcMar>
+              <w:top w:type="dxa" w:w="50"/>
+              <w:left w:type="dxa" w:w="80"/>
+              <w:bottom w:type="dxa" w:w="50"/>
+              <w:right w:type="dxa" w:w="80"/>
+            </w:tcMar>
+          </w:tcPr>
+          <w:p>
+            <w:pPr>
+              <w:spacing w:after="0" w:line="240"/>
+              <w:jc w:val="left"/>
+            </w:pPr>
+            <w:r>
+              <w:rPr>
+                <w:b w:val="false"/>
+                <w:bCs w:val="false"/>
+                <w:sz w:val="18"/>
+                <w:szCs w:val="18"/>
+              </w:rPr>
+              <w:t xml:space="preserve">0.50%</w:t>
+            </w:r>
+          </w:p>
+        </w:tc>
+        <w:tc>
+          <w:tcPr>
+            <w:tcW w:type="dxa" w:w="1440"/>
+            <w:tcMar>
+              <w:top w:type="dxa" w:w="50"/>
+              <w:left w:type="dxa" w:w="80"/>
+              <w:bottom w:type="dxa" w:w="50"/>
+              <w:right w:type="dxa" w:w="80"/>
+            </w:tcMar>
+          </w:tcPr>
+          <w:p>
+            <w:pPr>
+              <w:spacing w:after="0" w:line="240"/>
+              <w:jc w:val="right"/>
+            </w:pPr>
+            <w:r>
+              <w:rPr>
+                <w:b w:val="false"/>
+                <w:bCs w:val="false"/>
+                <w:sz w:val="18"/>
+                <w:szCs w:val="18"/>
+              </w:rPr>
+              <w:t xml:space="preserve">77%</w:t>
+            </w:r>
+          </w:p>
+        </w:tc>
+        <w:tc>
+          <w:tcPr>
+            <w:tcW w:type="dxa" w:w="1440"/>
+            <w:tcMar>
+              <w:top w:type="dxa" w:w="50"/>
+              <w:left w:type="dxa" w:w="80"/>
+              <w:bottom w:type="dxa" w:w="50"/>
+              <w:right w:type="dxa" w:w="80"/>
+            </w:tcMar>
+          </w:tcPr>
+          <w:p>
+            <w:pPr>
+              <w:spacing w:after="0" w:line="240"/>
+              <w:jc w:val="right"/>
+            </w:pPr>
+            <w:r>
+              <w:rPr>
+                <w:b w:val="false"/>
+                <w:bCs w:val="false"/>
+                <w:sz w:val="18"/>
+                <w:szCs w:val="18"/>
+              </w:rPr>
+              <w:t xml:space="preserve">17.9</w:t>
+            </w:r>
+          </w:p>
+        </w:tc>
+        <w:tc>
+          <w:tcPr>
+            <w:tcW w:type="dxa" w:w="2160"/>
+            <w:tcMar>
+              <w:top w:type="dxa" w:w="50"/>
+              <w:left w:type="dxa" w:w="80"/>
+              <w:bottom w:type="dxa" w:w="50"/>
+              <w:right w:type="dxa" w:w="80"/>
+            </w:tcMar>
+          </w:tcPr>
+          <w:p>
+            <w:pPr>
+              <w:spacing w:after="0" w:line="240"/>
+              <w:jc w:val="right"/>
+            </w:pPr>
+            <w:r>
+              <w:rPr>
+                <w:b w:val="false"/>
+                <w:bCs w:val="false"/>
+                <w:sz w:val="18"/>
+                <w:szCs w:val="18"/>
+              </w:rPr>
+              <w:t xml:space="preserve">63%</w:t>
+            </w:r>
+          </w:p>
+        </w:tc>
+        <w:tc>
+          <w:tcPr>
+            <w:tcW w:type="dxa" w:w="2160"/>
+            <w:tcMar>
+              <w:top w:type="dxa" w:w="50"/>
+              <w:left w:type="dxa" w:w="80"/>
+              <w:bottom w:type="dxa" w:w="50"/>
+              <w:right w:type="dxa" w:w="80"/>
+            </w:tcMar>
+          </w:tcPr>
+          <w:p>
+            <w:pPr>
+              <w:spacing w:after="0" w:line="240"/>
+              <w:jc w:val="right"/>
+            </w:pPr>
+            <w:r>
+              <w:rPr>
+                <w:b w:val="false"/>
+                <w:bCs w:val="false"/>
+                <w:sz w:val="18"/>
+                <w:szCs w:val="18"/>
+              </w:rPr>
+              <w:t xml:space="preserve">40%</w:t>
+            </w:r>
+          </w:p>
+        </w:tc>
+      </w:tr>
+      <w:tr>
+        <w:tc>
+          <w:tcPr>
+            <w:tcW w:type="dxa" w:w="2160"/>
+            <w:tcMar>
+              <w:top w:type="dxa" w:w="50"/>
+              <w:left w:type="dxa" w:w="80"/>
+              <w:bottom w:type="dxa" w:w="50"/>
+              <w:right w:type="dxa" w:w="80"/>
+            </w:tcMar>
+          </w:tcPr>
+          <w:p>
+            <w:pPr>
+              <w:spacing w:after="0" w:line="240"/>
+              <w:jc w:val="left"/>
+            </w:pPr>
+            <w:r>
+              <w:rPr>
+                <w:b w:val="false"/>
+                <w:bCs w:val="false"/>
+                <w:sz w:val="18"/>
+                <w:szCs w:val="18"/>
+              </w:rPr>
+              <w:t xml:space="preserve">1.00%</w:t>
+            </w:r>
+          </w:p>
+        </w:tc>
+        <w:tc>
+          <w:tcPr>
+            <w:tcW w:type="dxa" w:w="1440"/>
+            <w:tcMar>
+              <w:top w:type="dxa" w:w="50"/>
+              <w:left w:type="dxa" w:w="80"/>
+              <w:bottom w:type="dxa" w:w="50"/>
+              <w:right w:type="dxa" w:w="80"/>
+            </w:tcMar>
+          </w:tcPr>
+          <w:p>
+            <w:pPr>
+              <w:spacing w:after="0" w:line="240"/>
+              <w:jc w:val="right"/>
+            </w:pPr>
+            <w:r>
+              <w:rPr>
+                <w:b w:val="false"/>
+                <w:bCs w:val="false"/>
+                <w:sz w:val="18"/>
+                <w:szCs w:val="18"/>
+              </w:rPr>
+              <w:t xml:space="preserve">87%</w:t>
+            </w:r>
+          </w:p>
+        </w:tc>
+        <w:tc>
+          <w:tcPr>
+            <w:tcW w:type="dxa" w:w="1440"/>
+            <w:tcMar>
+              <w:top w:type="dxa" w:w="50"/>
+              <w:left w:type="dxa" w:w="80"/>
+              <w:bottom w:type="dxa" w:w="50"/>
+              <w:right w:type="dxa" w:w="80"/>
+            </w:tcMar>
+          </w:tcPr>
+          <w:p>
+            <w:pPr>
+              <w:spacing w:after="0" w:line="240"/>
+              <w:jc w:val="right"/>
+            </w:pPr>
+            <w:r>
+              <w:rPr>
+                <w:b w:val="false"/>
+                <w:bCs w:val="false"/>
+                <w:sz w:val="18"/>
+                <w:szCs w:val="18"/>
+              </w:rPr>
+              <w:t xml:space="preserve">31.7</w:t>
+            </w:r>
+          </w:p>
+        </w:tc>
+        <w:tc>
+          <w:tcPr>
+            <w:tcW w:type="dxa" w:w="2160"/>
+            <w:tcMar>
+              <w:top w:type="dxa" w:w="50"/>
+              <w:left w:type="dxa" w:w="80"/>
+              <w:bottom w:type="dxa" w:w="50"/>
+              <w:right w:type="dxa" w:w="80"/>
+            </w:tcMar>
+          </w:tcPr>
+          <w:p>
+            <w:pPr>
+              <w:spacing w:after="0" w:line="240"/>
+              <w:jc w:val="right"/>
+            </w:pPr>
+            <w:r>
+              <w:rPr>
+                <w:b w:val="false"/>
+                <w:bCs w:val="false"/>
+                <w:sz w:val="18"/>
+                <w:szCs w:val="18"/>
+              </w:rPr>
+              <w:t xml:space="preserve">77%</w:t>
+            </w:r>
+          </w:p>
+        </w:tc>
+        <w:tc>
+          <w:tcPr>
+            <w:tcW w:type="dxa" w:w="2160"/>
+            <w:tcMar>
+              <w:top w:type="dxa" w:w="50"/>
+              <w:left w:type="dxa" w:w="80"/>
+              <w:bottom w:type="dxa" w:w="50"/>
+              <w:right w:type="dxa" w:w="80"/>
+            </w:tcMar>
+          </w:tcPr>
+          <w:p>
+            <w:pPr>
+              <w:spacing w:after="0" w:line="240"/>
+              <w:jc w:val="right"/>
+            </w:pPr>
+            <w:r>
+              <w:rPr>
+                <w:b w:val="false"/>
+                <w:bCs w:val="false"/>
+                <w:sz w:val="18"/>
+                <w:szCs w:val="18"/>
+              </w:rPr>
+              <w:t xml:space="preserve">58%</w:t>
+            </w:r>
+          </w:p>
+        </w:tc>
+      </w:tr>
+    </w:tbl>
+    <w:p>
+      <w:pPr>
+        <w:spacing w:after="120"/>
+      </w:pPr>
+    </w:p>
+    <w:p>
+      <w:pPr>
+        <w:spacing w:after="140" w:line="276"/>
+      </w:pPr>
+      <w:r>
+        <w:rPr>
+          <w:sz w:val="22"/>
+          <w:szCs w:val="22"/>
+        </w:rPr>
+        <w:t xml:space="preserve">Before relying on the model with real customers it would run in shadow mode (scoring without blocking) and be compared with chargebacks, the threshold would be re-chosen on real validation data, the monthly and per-segment stability checks would be repeated, and the real review cost and recovery rate would be measured before any savings are claimed.</w:t>
       </w:r>
     </w:p>
     <w:p>
@@ -10790,7 +13352,7 @@
           <w:sz w:val="22"/>
           <w:szCs w:val="22"/>
         </w:rPr>
-        <w:t xml:space="preserve">The FastAPI service scores raw transactions in real time: an online feature store keeps each card's running statistics and recent window and computes the same features as the batch pipeline (a verification check compares 2,000 test transactions), the champion scores them, and alerts come with SHAP and plain-language reasons. Endpoints: /score, /score/batch, /feedback (analyst verdicts), /metrics (Prometheus), /health and /model; invalid inputs are rejected by schema validation.</w:t>
+        <w:t xml:space="preserve">The FastAPI service scores raw transactions in real time: an online feature store keeps each card's running statistics and recent window and computes the same features as the batch pipeline (a verification check compares 2,000 test transactions), the champion scores them, and alerts come with SHAP and plain-language reasons and a counterfactual amount. Endpoints: /score and /score/batch (payment system), /alerts, /alerts/{id} and /alerts/{id}/decision (review queue and decisions), /feedback (verdicts by transaction id, e.g. chargebacks), /monitoring/feedback, /metrics (Prometheus), /health and /model; invalid inputs are rejected by schema validation.</w:t>
       </w:r>
     </w:p>
     <w:p>
@@ -10799,7 +13361,7 @@
         <w:spacing w:after="120" w:before="260"/>
       </w:pPr>
       <w:r>
-        <w:t xml:space="preserve">8.2 Dashboard</w:t>
+        <w:t xml:space="preserve">8.2 A new transaction, from features to an analyst decision</w:t>
       </w:r>
     </w:p>
     <w:p>
@@ -10811,7 +13373,752 @@
           <w:sz w:val="22"/>
           <w:szCs w:val="22"/>
         </w:rPr>
-        <w:t xml:space="preserve">The Streamlit dashboard has nine tabs: Overview (KPIs, daily outcomes, money caught and missed), Alert queue (ranked cards, reasons, feedback), Live scoring (the API's runtime in the browser, including a simulated card-testing burst), Threshold &amp; cost (what-if trade-off), Patterns, Monitoring, Model, Data pipeline and Report. All views recompute from the sidebar filters, threshold and cost assumptions.</w:t>
+        <w:t xml:space="preserve">The complete path of a newly received transaction is implemented and tested end to end (tests/test_serving.py and the platform smoke test):</w:t>
+      </w:r>
+    </w:p>
+    <w:p>
+      <w:pPr>
+        <w:pStyle w:val="ListParagraph"/>
+        <w:numPr>
+          <w:ilvl w:val="0"/>
+          <w:numId w:val="3"/>
+        </w:numPr>
+        <w:spacing w:after="80" w:line="276"/>
+      </w:pPr>
+      <w:r>
+        <w:rPr>
+          <w:b/>
+          <w:bCs/>
+          <w:sz w:val="22"/>
+          <w:szCs w:val="22"/>
+        </w:rPr>
+        <w:t xml:space="preserve">Received.</w:t>
+      </w:r>
+      <w:r>
+        <w:rPr>
+          <w:sz w:val="22"/>
+          <w:szCs w:val="22"/>
+        </w:rPr>
+        <w:t xml:space="preserve"> The payment system sends the raw transaction to POST /score (or an analyst enters it in the dashboard's Live transaction tab, which runs the same code).</w:t>
+      </w:r>
+    </w:p>
+    <w:p>
+      <w:pPr>
+        <w:pStyle w:val="ListParagraph"/>
+        <w:numPr>
+          <w:ilvl w:val="0"/>
+          <w:numId w:val="3"/>
+        </w:numPr>
+        <w:spacing w:after="80" w:line="276"/>
+      </w:pPr>
+      <w:r>
+        <w:rPr>
+          <w:b/>
+          <w:bCs/>
+          <w:sz w:val="22"/>
+          <w:szCs w:val="22"/>
+        </w:rPr>
+        <w:t xml:space="preserve">Feature generation.</w:t>
+      </w:r>
+      <w:r>
+        <w:rPr>
+          <w:sz w:val="22"/>
+          <w:szCs w:val="22"/>
+        </w:rPr>
+        <w:t xml:space="preserve"> The online feature store derives the card-history features from the card's earlier transactions: count and average spend, amount relative to the average, z-score, time since the last transaction, velocity over 1 hour, 24 hours and 7 days, new merchant and night-time.</w:t>
+      </w:r>
+    </w:p>
+    <w:p>
+      <w:pPr>
+        <w:pStyle w:val="ListParagraph"/>
+        <w:numPr>
+          <w:ilvl w:val="0"/>
+          <w:numId w:val="3"/>
+        </w:numPr>
+        <w:spacing w:after="80" w:line="276"/>
+      </w:pPr>
+      <w:r>
+        <w:rPr>
+          <w:b/>
+          <w:bCs/>
+          <w:sz w:val="22"/>
+          <w:szCs w:val="22"/>
+        </w:rPr>
+        <w:t xml:space="preserve">Model inference.</w:t>
+      </w:r>
+      <w:r>
+        <w:rPr>
+          <w:sz w:val="22"/>
+          <w:szCs w:val="22"/>
+        </w:rPr>
+        <w:t xml:space="preserve"> The champion scores the features against the validation-chosen threshold; SHAP gives the top contributions and, for an alert, a counterfactual amount at which it would have been approved.</w:t>
+      </w:r>
+    </w:p>
+    <w:p>
+      <w:pPr>
+        <w:pStyle w:val="ListParagraph"/>
+        <w:numPr>
+          <w:ilvl w:val="0"/>
+          <w:numId w:val="3"/>
+        </w:numPr>
+        <w:spacing w:after="80" w:line="276"/>
+      </w:pPr>
+      <w:r>
+        <w:rPr>
+          <w:b/>
+          <w:bCs/>
+          <w:sz w:val="22"/>
+          <w:szCs w:val="22"/>
+        </w:rPr>
+        <w:t xml:space="preserve">Routing.</w:t>
+      </w:r>
+      <w:r>
+        <w:rPr>
+          <w:sz w:val="22"/>
+          <w:szCs w:val="22"/>
+        </w:rPr>
+        <w:t xml:space="preserve"> Every scored transaction is stored as a case with its features, score, threshold and explanation (fraudlens.casework). An alert opens the case in the review queue; other transactions are approved and logged.</w:t>
+      </w:r>
+    </w:p>
+    <w:p>
+      <w:pPr>
+        <w:pStyle w:val="ListParagraph"/>
+        <w:numPr>
+          <w:ilvl w:val="0"/>
+          <w:numId w:val="3"/>
+        </w:numPr>
+        <w:spacing w:after="80" w:line="276"/>
+      </w:pPr>
+      <w:r>
+        <w:rPr>
+          <w:b/>
+          <w:bCs/>
+          <w:sz w:val="22"/>
+          <w:szCs w:val="22"/>
+        </w:rPr>
+        <w:t xml:space="preserve">Analyst decision.</w:t>
+      </w:r>
+      <w:r>
+        <w:rPr>
+          <w:sz w:val="22"/>
+          <w:szCs w:val="22"/>
+        </w:rPr>
+        <w:t xml:space="preserve"> In the dashboard's Case review tab (or GET /alerts and POST /alerts/{id}/decision) the analyst sees what the model saw and records Confirmed fraud or Legitimate with a note; the case closes and the decision is written to an audit log with the analyst's name.</w:t>
+      </w:r>
+    </w:p>
+    <w:p>
+      <w:pPr>
+        <w:spacing w:after="140" w:line="276"/>
+      </w:pPr>
+      <w:r>
+        <w:rPr>
+          <w:b/>
+          <w:bCs/>
+          <w:sz w:val="22"/>
+          <w:szCs w:val="22"/>
+        </w:rPr>
+        <w:t xml:space="preserve">How the decisions inform monitoring.</w:t>
+      </w:r>
+      <w:r>
+        <w:rPr>
+          <w:sz w:val="22"/>
+          <w:szCs w:val="22"/>
+        </w:rPr>
+        <w:t xml:space="preserve"> Decisions are labels, used in three ways. Live precision (confirmed ÷ reviewed alerts) is tracked with a Wilson 95% interval against the 40% policy floor; if the whole interval falls below it (with at least 20 decisions) monitoring raises a threshold/model review, which appears in the monitoring summary, the Prometheus gauge fraudlens_live_precision and an alert rule. Fraud labels on approved transactions (disputes) count as misses, the live counterpart of recall. And every decided case keeps the exact model inputs, so monitoring exports them as labelled examples for the next champion/challenger comparison; the backlog and time to decision show whether the alert volume is manageable.</w:t>
+      </w:r>
+    </w:p>
+    <w:p>
+      <w:pPr>
+        <w:spacing w:after="60" w:before="120"/>
+        <w:jc w:val="center"/>
+      </w:pPr>
+      <w:r>
+        <w:drawing>
+          <wp:inline distT="0" distB="0" distL="0" distR="0">
+            <wp:extent cx="4191000" cy="4972050"/>
+            <wp:effectExtent t="0" r="0" b="0" l="0"/>
+            <wp:docPr id="1" name="" descr="" title=""/>
+            <wp:cNvGraphicFramePr>
+              <a:graphicFrameLocks xmlns:a="http://schemas.openxmlformats.org/drawingml/2006/main" noChangeAspect="1"/>
+            </wp:cNvGraphicFramePr>
+            <a:graphic xmlns:a="http://schemas.openxmlformats.org/drawingml/2006/main">
+              <a:graphicData uri="http://schemas.openxmlformats.org/drawingml/2006/picture">
+                <pic:pic xmlns:pic="http://schemas.openxmlformats.org/drawingml/2006/picture">
+                  <pic:nvPicPr>
+                    <pic:cNvPr id="0" name="" descr=""/>
+                    <pic:cNvPicPr>
+                      <a:picLocks noChangeAspect="1" noChangeArrowheads="1"/>
+                    </pic:cNvPicPr>
+                  </pic:nvPicPr>
+                  <pic:blipFill>
+                    <a:blip r:embed="rId16" cstate="none"/>
+                    <a:srcRect/>
+                    <a:stretch>
+                      <a:fillRect/>
+                    </a:stretch>
+                  </pic:blipFill>
+                  <pic:spPr bwMode="auto">
+                    <a:xfrm>
+                      <a:off x="0" y="0"/>
+                      <a:ext cx="4191000" cy="4972050"/>
+                    </a:xfrm>
+                    <a:prstGeom prst="rect">
+                      <a:avLst/>
+                    </a:prstGeom>
+                  </pic:spPr>
+                </pic:pic>
+              </a:graphicData>
+            </a:graphic>
+          </wp:inline>
+        </w:drawing>
+      </w:r>
+    </w:p>
+    <w:p>
+      <w:pPr>
+        <w:spacing w:after="200"/>
+        <w:jc w:val="center"/>
+      </w:pPr>
+      <w:r>
+        <w:rPr>
+          <w:i/>
+          <w:iCs/>
+          <w:color w:val="444444"/>
+          <w:sz w:val="19"/>
+          <w:szCs w:val="19"/>
+        </w:rPr>
+        <w:t xml:space="preserve">Figure 9. Live transaction tab: received, features generated, model inference with explanation, routed to the review queue.</w:t>
+      </w:r>
+    </w:p>
+    <w:p>
+      <w:pPr>
+        <w:spacing w:after="60" w:before="120"/>
+        <w:jc w:val="center"/>
+      </w:pPr>
+      <w:r>
+        <w:drawing>
+          <wp:inline distT="0" distB="0" distL="0" distR="0">
+            <wp:extent cx="4191000" cy="5534025"/>
+            <wp:effectExtent t="0" r="0" b="0" l="0"/>
+            <wp:docPr id="1" name="" descr="" title=""/>
+            <wp:cNvGraphicFramePr>
+              <a:graphicFrameLocks xmlns:a="http://schemas.openxmlformats.org/drawingml/2006/main" noChangeAspect="1"/>
+            </wp:cNvGraphicFramePr>
+            <a:graphic xmlns:a="http://schemas.openxmlformats.org/drawingml/2006/main">
+              <a:graphicData uri="http://schemas.openxmlformats.org/drawingml/2006/picture">
+                <pic:pic xmlns:pic="http://schemas.openxmlformats.org/drawingml/2006/picture">
+                  <pic:nvPicPr>
+                    <pic:cNvPr id="0" name="" descr=""/>
+                    <pic:cNvPicPr>
+                      <a:picLocks noChangeAspect="1" noChangeArrowheads="1"/>
+                    </pic:cNvPicPr>
+                  </pic:nvPicPr>
+                  <pic:blipFill>
+                    <a:blip r:embed="rId17" cstate="none"/>
+                    <a:srcRect/>
+                    <a:stretch>
+                      <a:fillRect/>
+                    </a:stretch>
+                  </pic:blipFill>
+                  <pic:spPr bwMode="auto">
+                    <a:xfrm>
+                      <a:off x="0" y="0"/>
+                      <a:ext cx="4191000" cy="5534025"/>
+                    </a:xfrm>
+                    <a:prstGeom prst="rect">
+                      <a:avLst/>
+                    </a:prstGeom>
+                  </pic:spPr>
+                </pic:pic>
+              </a:graphicData>
+            </a:graphic>
+          </wp:inline>
+        </w:drawing>
+      </w:r>
+    </w:p>
+    <w:p>
+      <w:pPr>
+        <w:spacing w:after="200"/>
+        <w:jc w:val="center"/>
+      </w:pPr>
+      <w:r>
+        <w:rPr>
+          <w:i/>
+          <w:iCs/>
+          <w:color w:val="444444"/>
+          <w:sz w:val="19"/>
+          <w:szCs w:val="19"/>
+        </w:rPr>
+        <w:t xml:space="preserve">Figure 10. Case review tab: the open case, the decision form and how decisions feed monitoring.</w:t>
+      </w:r>
+    </w:p>
+    <w:p>
+      <w:pPr>
+        <w:pStyle w:val="Heading2"/>
+        <w:spacing w:after="120" w:before="260"/>
+      </w:pPr>
+      <w:r>
+        <w:t xml:space="preserve">8.3 Access control</w:t>
+      </w:r>
+    </w:p>
+    <w:p>
+      <w:pPr>
+        <w:spacing w:after="80" w:before="160"/>
+      </w:pPr>
+      <w:r>
+        <w:rPr>
+          <w:i/>
+          <w:iCs/>
+          <w:color w:val="444444"/>
+          <w:sz w:val="19"/>
+          <w:szCs w:val="19"/>
+        </w:rPr>
+        <w:t xml:space="preserve">Table 15. Deployment access controls.</w:t>
+      </w:r>
+    </w:p>
+    <w:tbl>
+      <w:tblPr>
+        <w:tblW w:type="dxa" w:w="9360"/>
+        <w:tblBorders>
+          <w:top w:val="single" w:color="auto" w:sz="4"/>
+          <w:left w:val="single" w:color="auto" w:sz="4"/>
+          <w:bottom w:val="single" w:color="auto" w:sz="4"/>
+          <w:right w:val="single" w:color="auto" w:sz="4"/>
+          <w:insideH w:val="single" w:color="auto" w:sz="4"/>
+          <w:insideV w:val="single" w:color="auto" w:sz="4"/>
+        </w:tblBorders>
+      </w:tblPr>
+      <w:tblGrid>
+        <w:gridCol w:w="2160"/>
+        <w:gridCol w:w="7200"/>
+      </w:tblGrid>
+      <w:tr>
+        <w:trPr>
+          <w:tblHeader/>
+        </w:trPr>
+        <w:tc>
+          <w:tcPr>
+            <w:tcW w:type="dxa" w:w="2160"/>
+            <w:shd w:fill="DCE6F1" w:color="auto" w:val="clear"/>
+            <w:tcMar>
+              <w:top w:type="dxa" w:w="50"/>
+              <w:left w:type="dxa" w:w="80"/>
+              <w:bottom w:type="dxa" w:w="50"/>
+              <w:right w:type="dxa" w:w="80"/>
+            </w:tcMar>
+          </w:tcPr>
+          <w:p>
+            <w:pPr>
+              <w:spacing w:after="0" w:line="240"/>
+              <w:jc w:val="left"/>
+            </w:pPr>
+            <w:r>
+              <w:rPr>
+                <w:b/>
+                <w:bCs/>
+                <w:sz w:val="18"/>
+                <w:szCs w:val="18"/>
+              </w:rPr>
+              <w:t xml:space="preserve">Layer</w:t>
+            </w:r>
+          </w:p>
+        </w:tc>
+        <w:tc>
+          <w:tcPr>
+            <w:tcW w:type="dxa" w:w="7200"/>
+            <w:shd w:fill="DCE6F1" w:color="auto" w:val="clear"/>
+            <w:tcMar>
+              <w:top w:type="dxa" w:w="50"/>
+              <w:left w:type="dxa" w:w="80"/>
+              <w:bottom w:type="dxa" w:w="50"/>
+              <w:right w:type="dxa" w:w="80"/>
+            </w:tcMar>
+          </w:tcPr>
+          <w:p>
+            <w:pPr>
+              <w:spacing w:after="0" w:line="240"/>
+              <w:jc w:val="left"/>
+            </w:pPr>
+            <w:r>
+              <w:rPr>
+                <w:b/>
+                <w:bCs/>
+                <w:sz w:val="18"/>
+                <w:szCs w:val="18"/>
+              </w:rPr>
+              <w:t xml:space="preserve">Control</w:t>
+            </w:r>
+          </w:p>
+        </w:tc>
+      </w:tr>
+      <w:tr>
+        <w:tc>
+          <w:tcPr>
+            <w:tcW w:type="dxa" w:w="2160"/>
+            <w:tcMar>
+              <w:top w:type="dxa" w:w="50"/>
+              <w:left w:type="dxa" w:w="80"/>
+              <w:bottom w:type="dxa" w:w="50"/>
+              <w:right w:type="dxa" w:w="80"/>
+            </w:tcMar>
+          </w:tcPr>
+          <w:p>
+            <w:pPr>
+              <w:spacing w:after="0" w:line="240"/>
+              <w:jc w:val="left"/>
+            </w:pPr>
+            <w:r>
+              <w:rPr>
+                <w:b w:val="false"/>
+                <w:bCs w:val="false"/>
+                <w:sz w:val="18"/>
+                <w:szCs w:val="18"/>
+              </w:rPr>
+              <w:t xml:space="preserve">Scoring API</w:t>
+            </w:r>
+          </w:p>
+        </w:tc>
+        <w:tc>
+          <w:tcPr>
+            <w:tcW w:type="dxa" w:w="7200"/>
+            <w:tcMar>
+              <w:top w:type="dxa" w:w="50"/>
+              <w:left w:type="dxa" w:w="80"/>
+              <w:bottom w:type="dxa" w:w="50"/>
+              <w:right w:type="dxa" w:w="80"/>
+            </w:tcMar>
+          </w:tcPr>
+          <w:p>
+            <w:pPr>
+              <w:spacing w:after="0" w:line="240"/>
+              <w:jc w:val="left"/>
+            </w:pPr>
+            <w:r>
+              <w:rPr>
+                <w:b w:val="false"/>
+                <w:bCs w:val="false"/>
+                <w:sz w:val="18"/>
+                <w:szCs w:val="18"/>
+              </w:rPr>
+              <w:t xml:space="preserve">Role-based API keys in the X-API-Key header: scorer (score), analyst (review queue, decisions, feedback monitoring), admin; 401 without a key, 403 for the wrong role; refusals counted in Prometheus</w:t>
+            </w:r>
+          </w:p>
+        </w:tc>
+      </w:tr>
+      <w:tr>
+        <w:tc>
+          <w:tcPr>
+            <w:tcW w:type="dxa" w:w="2160"/>
+            <w:tcMar>
+              <w:top w:type="dxa" w:w="50"/>
+              <w:left w:type="dxa" w:w="80"/>
+              <w:bottom w:type="dxa" w:w="50"/>
+              <w:right w:type="dxa" w:w="80"/>
+            </w:tcMar>
+          </w:tcPr>
+          <w:p>
+            <w:pPr>
+              <w:spacing w:after="0" w:line="240"/>
+              <w:jc w:val="left"/>
+            </w:pPr>
+            <w:r>
+              <w:rPr>
+                <w:b w:val="false"/>
+                <w:bCs w:val="false"/>
+                <w:sz w:val="18"/>
+                <w:szCs w:val="18"/>
+              </w:rPr>
+              <w:t xml:space="preserve">Dashboard</w:t>
+            </w:r>
+          </w:p>
+        </w:tc>
+        <w:tc>
+          <w:tcPr>
+            <w:tcW w:type="dxa" w:w="7200"/>
+            <w:tcMar>
+              <w:top w:type="dxa" w:w="50"/>
+              <w:left w:type="dxa" w:w="80"/>
+              <w:bottom w:type="dxa" w:w="50"/>
+              <w:right w:type="dxa" w:w="80"/>
+            </w:tcMar>
+          </w:tcPr>
+          <w:p>
+            <w:pPr>
+              <w:spacing w:after="0" w:line="240"/>
+              <w:jc w:val="left"/>
+            </w:pPr>
+            <w:r>
+              <w:rPr>
+                <w:b w:val="false"/>
+                <w:bCs w:val="false"/>
+                <w:sz w:val="18"/>
+                <w:szCs w:val="18"/>
+              </w:rPr>
+              <w:t xml:space="preserve">Sign-in with named users: analysts may record decisions, viewers only explore; the signed-in name is stored with every decision</w:t>
+            </w:r>
+          </w:p>
+        </w:tc>
+      </w:tr>
+      <w:tr>
+        <w:tc>
+          <w:tcPr>
+            <w:tcW w:type="dxa" w:w="2160"/>
+            <w:tcMar>
+              <w:top w:type="dxa" w:w="50"/>
+              <w:left w:type="dxa" w:w="80"/>
+              <w:bottom w:type="dxa" w:w="50"/>
+              <w:right w:type="dxa" w:w="80"/>
+            </w:tcMar>
+          </w:tcPr>
+          <w:p>
+            <w:pPr>
+              <w:spacing w:after="0" w:line="240"/>
+              <w:jc w:val="left"/>
+            </w:pPr>
+            <w:r>
+              <w:rPr>
+                <w:b w:val="false"/>
+                <w:bCs w:val="false"/>
+                <w:sz w:val="18"/>
+                <w:szCs w:val="18"/>
+              </w:rPr>
+              <w:t xml:space="preserve">Audit</w:t>
+            </w:r>
+          </w:p>
+        </w:tc>
+        <w:tc>
+          <w:tcPr>
+            <w:tcW w:type="dxa" w:w="7200"/>
+            <w:tcMar>
+              <w:top w:type="dxa" w:w="50"/>
+              <w:left w:type="dxa" w:w="80"/>
+              <w:bottom w:type="dxa" w:w="50"/>
+              <w:right w:type="dxa" w:w="80"/>
+            </w:tcMar>
+          </w:tcPr>
+          <w:p>
+            <w:pPr>
+              <w:spacing w:after="0" w:line="240"/>
+              <w:jc w:val="left"/>
+            </w:pPr>
+            <w:r>
+              <w:rPr>
+                <w:b w:val="false"/>
+                <w:bCs w:val="false"/>
+                <w:sz w:val="18"/>
+                <w:szCs w:val="18"/>
+              </w:rPr>
+              <w:t xml:space="preserve">Every scoring call and decision is logged in the case store with role, time and a non-secret key id</w:t>
+            </w:r>
+          </w:p>
+        </w:tc>
+      </w:tr>
+      <w:tr>
+        <w:tc>
+          <w:tcPr>
+            <w:tcW w:type="dxa" w:w="2160"/>
+            <w:tcMar>
+              <w:top w:type="dxa" w:w="50"/>
+              <w:left w:type="dxa" w:w="80"/>
+              <w:bottom w:type="dxa" w:w="50"/>
+              <w:right w:type="dxa" w:w="80"/>
+            </w:tcMar>
+          </w:tcPr>
+          <w:p>
+            <w:pPr>
+              <w:spacing w:after="0" w:line="240"/>
+              <w:jc w:val="left"/>
+            </w:pPr>
+            <w:r>
+              <w:rPr>
+                <w:b w:val="false"/>
+                <w:bCs w:val="false"/>
+                <w:sz w:val="18"/>
+                <w:szCs w:val="18"/>
+              </w:rPr>
+              <w:t xml:space="preserve">Network</w:t>
+            </w:r>
+          </w:p>
+        </w:tc>
+        <w:tc>
+          <w:tcPr>
+            <w:tcW w:type="dxa" w:w="7200"/>
+            <w:tcMar>
+              <w:top w:type="dxa" w:w="50"/>
+              <w:left w:type="dxa" w:w="80"/>
+              <w:bottom w:type="dxa" w:w="50"/>
+              <w:right w:type="dxa" w:w="80"/>
+            </w:tcMar>
+          </w:tcPr>
+          <w:p>
+            <w:pPr>
+              <w:spacing w:after="0" w:line="240"/>
+              <w:jc w:val="left"/>
+            </w:pPr>
+            <w:r>
+              <w:rPr>
+                <w:b w:val="false"/>
+                <w:bCs w:val="false"/>
+                <w:sz w:val="18"/>
+                <w:szCs w:val="18"/>
+              </w:rPr>
+              <w:t xml:space="preserve">API and dashboard bind to 127.0.0.1 and are exposed only through the tunnel; /health and /metrics carry no transaction data</w:t>
+            </w:r>
+          </w:p>
+        </w:tc>
+      </w:tr>
+      <w:tr>
+        <w:tc>
+          <w:tcPr>
+            <w:tcW w:type="dxa" w:w="2160"/>
+            <w:tcMar>
+              <w:top w:type="dxa" w:w="50"/>
+              <w:left w:type="dxa" w:w="80"/>
+              <w:bottom w:type="dxa" w:w="50"/>
+              <w:right w:type="dxa" w:w="80"/>
+            </w:tcMar>
+          </w:tcPr>
+          <w:p>
+            <w:pPr>
+              <w:spacing w:after="0" w:line="240"/>
+              <w:jc w:val="left"/>
+            </w:pPr>
+            <w:r>
+              <w:rPr>
+                <w:b w:val="false"/>
+                <w:bCs w:val="false"/>
+                <w:sz w:val="18"/>
+                <w:szCs w:val="18"/>
+              </w:rPr>
+              <w:t xml:space="preserve">Data</w:t>
+            </w:r>
+          </w:p>
+        </w:tc>
+        <w:tc>
+          <w:tcPr>
+            <w:tcW w:type="dxa" w:w="7200"/>
+            <w:tcMar>
+              <w:top w:type="dxa" w:w="50"/>
+              <w:left w:type="dxa" w:w="80"/>
+              <w:bottom w:type="dxa" w:w="50"/>
+              <w:right w:type="dxa" w:w="80"/>
+            </w:tcMar>
+          </w:tcPr>
+          <w:p>
+            <w:pPr>
+              <w:spacing w:after="0" w:line="240"/>
+              <w:jc w:val="left"/>
+            </w:pPr>
+            <w:r>
+              <w:rPr>
+                <w:b w:val="false"/>
+                <w:bCs w:val="false"/>
+                <w:sz w:val="18"/>
+                <w:szCs w:val="18"/>
+              </w:rPr>
+              <w:t xml:space="preserve">Card numbers pseudonymised; Trino masks quasi-identifiers and denies the job column to analysts; least-privilege MinIO accounts</w:t>
+            </w:r>
+          </w:p>
+        </w:tc>
+      </w:tr>
+    </w:tbl>
+    <w:p>
+      <w:pPr>
+        <w:spacing w:after="120"/>
+      </w:pPr>
+    </w:p>
+    <w:p>
+      <w:pPr>
+        <w:spacing w:after="140" w:line="276"/>
+      </w:pPr>
+      <w:r>
+        <w:rPr>
+          <w:sz w:val="22"/>
+          <w:szCs w:val="22"/>
+        </w:rPr>
+        <w:t xml:space="preserve">Public deployments switch access control on automatically (scripts/deploy/run_local.ps1 -Public generates keys and two dashboard accounts, kept out of the repository); without it the services run in a clearly labelled development mode.</w:t>
+      </w:r>
+    </w:p>
+    <w:p>
+      <w:pPr>
+        <w:pStyle w:val="Heading2"/>
+        <w:spacing w:after="120" w:before="260"/>
+      </w:pPr>
+      <w:r>
+        <w:t xml:space="preserve">8.4 Dashboard</w:t>
+      </w:r>
+    </w:p>
+    <w:p>
+      <w:pPr>
+        <w:spacing w:after="140" w:line="276"/>
+      </w:pPr>
+      <w:r>
+        <w:rPr>
+          <w:sz w:val="22"/>
+          <w:szCs w:val="22"/>
+        </w:rPr>
+        <w:t xml:space="preserve">The Streamlit dashboard has ten tabs: Overview (KPIs, daily outcomes, money caught and missed, estimated net benefit with its assumptions), Live transaction (the end-to-end path above), Case review (the analyst workflow and feedback monitoring), Alert history (the replayed test period by card), Threshold &amp; cost (what-if trade-off), Patterns, Monitoring (drift, monthly stability, live feedback), Model (selection, SHAP, explanation quality, transferability), Data pipeline and Report. All views recompute from the sidebar filters, threshold and cost assumptions.</w:t>
+      </w:r>
+    </w:p>
+    <w:p>
+      <w:pPr>
+        <w:spacing w:after="60" w:before="120"/>
+        <w:jc w:val="center"/>
+      </w:pPr>
+      <w:r>
+        <w:drawing>
+          <wp:inline distT="0" distB="0" distL="0" distR="0">
+            <wp:extent cx="4191000" cy="3209925"/>
+            <wp:effectExtent t="0" r="0" b="0" l="0"/>
+            <wp:docPr id="1" name="" descr="" title=""/>
+            <wp:cNvGraphicFramePr>
+              <a:graphicFrameLocks xmlns:a="http://schemas.openxmlformats.org/drawingml/2006/main" noChangeAspect="1"/>
+            </wp:cNvGraphicFramePr>
+            <a:graphic xmlns:a="http://schemas.openxmlformats.org/drawingml/2006/main">
+              <a:graphicData uri="http://schemas.openxmlformats.org/drawingml/2006/picture">
+                <pic:pic xmlns:pic="http://schemas.openxmlformats.org/drawingml/2006/picture">
+                  <pic:nvPicPr>
+                    <pic:cNvPr id="0" name="" descr=""/>
+                    <pic:cNvPicPr>
+                      <a:picLocks noChangeAspect="1" noChangeArrowheads="1"/>
+                    </pic:cNvPicPr>
+                  </pic:nvPicPr>
+                  <pic:blipFill>
+                    <a:blip r:embed="rId18" cstate="none"/>
+                    <a:srcRect/>
+                    <a:stretch>
+                      <a:fillRect/>
+                    </a:stretch>
+                  </pic:blipFill>
+                  <pic:spPr bwMode="auto">
+                    <a:xfrm>
+                      <a:off x="0" y="0"/>
+                      <a:ext cx="4191000" cy="3209925"/>
+                    </a:xfrm>
+                    <a:prstGeom prst="rect">
+                      <a:avLst/>
+                    </a:prstGeom>
+                  </pic:spPr>
+                </pic:pic>
+              </a:graphicData>
+            </a:graphic>
+          </wp:inline>
+        </w:drawing>
+      </w:r>
+    </w:p>
+    <w:p>
+      <w:pPr>
+        <w:spacing w:after="200"/>
+        <w:jc w:val="center"/>
+      </w:pPr>
+      <w:r>
+        <w:rPr>
+          <w:i/>
+          <w:iCs/>
+          <w:color w:val="444444"/>
+          <w:sz w:val="19"/>
+          <w:szCs w:val="19"/>
+        </w:rPr>
+        <w:t xml:space="preserve">Figure 11. Dashboard, Overview tab (test period, deployed threshold).</w:t>
       </w:r>
     </w:p>
     <w:p>
@@ -10838,7 +14145,7 @@
                     </pic:cNvPicPr>
                   </pic:nvPicPr>
                   <pic:blipFill>
-                    <a:blip r:embed="rId16" cstate="none"/>
+                    <a:blip r:embed="rId19" cstate="none"/>
                     <a:srcRect/>
                     <a:stretch>
                       <a:fillRect/>
@@ -10873,131 +14180,7 @@
           <w:sz w:val="19"/>
           <w:szCs w:val="19"/>
         </w:rPr>
-        <w:t xml:space="preserve">Figure 9. Dashboard, Overview tab (test period, deployed threshold).</w:t>
-      </w:r>
-    </w:p>
-    <w:p>
-      <w:pPr>
-        <w:spacing w:after="60" w:before="120"/>
-        <w:jc w:val="center"/>
-      </w:pPr>
-      <w:r>
-        <w:drawing>
-          <wp:inline distT="0" distB="0" distL="0" distR="0">
-            <wp:extent cx="4191000" cy="2619375"/>
-            <wp:effectExtent t="0" r="0" b="0" l="0"/>
-            <wp:docPr id="1" name="" descr="" title=""/>
-            <wp:cNvGraphicFramePr>
-              <a:graphicFrameLocks xmlns:a="http://schemas.openxmlformats.org/drawingml/2006/main" noChangeAspect="1"/>
-            </wp:cNvGraphicFramePr>
-            <a:graphic xmlns:a="http://schemas.openxmlformats.org/drawingml/2006/main">
-              <a:graphicData uri="http://schemas.openxmlformats.org/drawingml/2006/picture">
-                <pic:pic xmlns:pic="http://schemas.openxmlformats.org/drawingml/2006/picture">
-                  <pic:nvPicPr>
-                    <pic:cNvPr id="0" name="" descr=""/>
-                    <pic:cNvPicPr>
-                      <a:picLocks noChangeAspect="1" noChangeArrowheads="1"/>
-                    </pic:cNvPicPr>
-                  </pic:nvPicPr>
-                  <pic:blipFill>
-                    <a:blip r:embed="rId17" cstate="none"/>
-                    <a:srcRect/>
-                    <a:stretch>
-                      <a:fillRect/>
-                    </a:stretch>
-                  </pic:blipFill>
-                  <pic:spPr bwMode="auto">
-                    <a:xfrm>
-                      <a:off x="0" y="0"/>
-                      <a:ext cx="4191000" cy="2619375"/>
-                    </a:xfrm>
-                    <a:prstGeom prst="rect">
-                      <a:avLst/>
-                    </a:prstGeom>
-                  </pic:spPr>
-                </pic:pic>
-              </a:graphicData>
-            </a:graphic>
-          </wp:inline>
-        </w:drawing>
-      </w:r>
-    </w:p>
-    <w:p>
-      <w:pPr>
-        <w:spacing w:after="200"/>
-        <w:jc w:val="center"/>
-      </w:pPr>
-      <w:r>
-        <w:rPr>
-          <w:i/>
-          <w:iCs/>
-          <w:color w:val="444444"/>
-          <w:sz w:val="19"/>
-          <w:szCs w:val="19"/>
-        </w:rPr>
-        <w:t xml:space="preserve">Figure 10. Dashboard, Live scoring tab: a simulated card-testing burst is flagged, with its reasons.</w:t>
-      </w:r>
-    </w:p>
-    <w:p>
-      <w:pPr>
-        <w:spacing w:after="60" w:before="120"/>
-        <w:jc w:val="center"/>
-      </w:pPr>
-      <w:r>
-        <w:drawing>
-          <wp:inline distT="0" distB="0" distL="0" distR="0">
-            <wp:extent cx="4191000" cy="2619375"/>
-            <wp:effectExtent t="0" r="0" b="0" l="0"/>
-            <wp:docPr id="1" name="" descr="" title=""/>
-            <wp:cNvGraphicFramePr>
-              <a:graphicFrameLocks xmlns:a="http://schemas.openxmlformats.org/drawingml/2006/main" noChangeAspect="1"/>
-            </wp:cNvGraphicFramePr>
-            <a:graphic xmlns:a="http://schemas.openxmlformats.org/drawingml/2006/main">
-              <a:graphicData uri="http://schemas.openxmlformats.org/drawingml/2006/picture">
-                <pic:pic xmlns:pic="http://schemas.openxmlformats.org/drawingml/2006/picture">
-                  <pic:nvPicPr>
-                    <pic:cNvPr id="0" name="" descr=""/>
-                    <pic:cNvPicPr>
-                      <a:picLocks noChangeAspect="1" noChangeArrowheads="1"/>
-                    </pic:cNvPicPr>
-                  </pic:nvPicPr>
-                  <pic:blipFill>
-                    <a:blip r:embed="rId18" cstate="none"/>
-                    <a:srcRect/>
-                    <a:stretch>
-                      <a:fillRect/>
-                    </a:stretch>
-                  </pic:blipFill>
-                  <pic:spPr bwMode="auto">
-                    <a:xfrm>
-                      <a:off x="0" y="0"/>
-                      <a:ext cx="4191000" cy="2619375"/>
-                    </a:xfrm>
-                    <a:prstGeom prst="rect">
-                      <a:avLst/>
-                    </a:prstGeom>
-                  </pic:spPr>
-                </pic:pic>
-              </a:graphicData>
-            </a:graphic>
-          </wp:inline>
-        </w:drawing>
-      </w:r>
-    </w:p>
-    <w:p>
-      <w:pPr>
-        <w:spacing w:after="200"/>
-        <w:jc w:val="center"/>
-      </w:pPr>
-      <w:r>
-        <w:rPr>
-          <w:i/>
-          <w:iCs/>
-          <w:color w:val="444444"/>
-          <w:sz w:val="19"/>
-          <w:szCs w:val="19"/>
-        </w:rPr>
-        <w:t xml:space="preserve">Figure 11. Dashboard, Threshold &amp; cost tab: the operating-point trade-off.</w:t>
+        <w:t xml:space="preserve">Figure 12. Dashboard, Threshold &amp; cost tab: the operating-point trade-off.</w:t>
       </w:r>
     </w:p>
     <w:p>
@@ -11006,7 +14189,7 @@
         <w:spacing w:after="120" w:before="260"/>
       </w:pPr>
       <w:r>
-        <w:t xml:space="preserve">8.3 Lake, catalog and BI</w:t>
+        <w:t xml:space="preserve">8.5 Lake, catalog and BI</w:t>
       </w:r>
     </w:p>
     <w:p>
@@ -11033,7 +14216,7 @@
           <w:sz w:val="19"/>
           <w:szCs w:val="19"/>
         </w:rPr>
-        <w:t xml:space="preserve">Table 13. Same questions, two engines (median of five runs; platform workflow run 39430878611, sample data on a GitHub runner).</w:t>
+        <w:t xml:space="preserve">Table 16. Same questions, two engines (median of five runs; platform workflow run 39430878611, sample data on a GitHub runner).</w:t>
       </w:r>
     </w:p>
     <w:tbl>
@@ -11603,7 +14786,7 @@
         <w:spacing w:after="120" w:before="260"/>
       </w:pPr>
       <w:r>
-        <w:t xml:space="preserve">8.4 The platform, verified end to end</w:t>
+        <w:t xml:space="preserve">8.6 The platform, verified end to end</w:t>
       </w:r>
     </w:p>
     <w:p>
@@ -11630,7 +14813,7 @@
           <w:sz w:val="19"/>
           <w:szCs w:val="19"/>
         </w:rPr>
-        <w:t xml:space="preserve">Table 14. Platform smoke checks (platform workflow).</w:t>
+        <w:t xml:space="preserve">Table 17. Platform smoke checks (platform workflow).</w:t>
       </w:r>
     </w:p>
     <w:tbl>
@@ -12868,7 +16051,7 @@
         <w:spacing w:after="120" w:before="260"/>
       </w:pPr>
       <w:r>
-        <w:t xml:space="preserve">8.5 Deployment</w:t>
+        <w:t xml:space="preserve">8.7 Deployment</w:t>
       </w:r>
     </w:p>
     <w:p>
@@ -12883,7 +16066,7 @@
           <w:sz w:val="19"/>
           <w:szCs w:val="19"/>
         </w:rPr>
-        <w:t xml:space="preserve">Table 15. Deployment targets.</w:t>
+        <w:t xml:space="preserve">Table 18. Deployment targets.</w:t>
       </w:r>
     </w:p>
     <w:tbl>
@@ -13353,7 +16536,7 @@
           <w:sz w:val="19"/>
           <w:szCs w:val="19"/>
         </w:rPr>
-        <w:t xml:space="preserve">Table 16. Monthly monitoring.</w:t>
+        <w:t xml:space="preserve">Table 19. Monthly monitoring.</w:t>
       </w:r>
     </w:p>
     <w:tbl>
@@ -15309,7 +18492,7 @@
                     </pic:cNvPicPr>
                   </pic:nvPicPr>
                   <pic:blipFill>
-                    <a:blip r:embed="rId19" cstate="none"/>
+                    <a:blip r:embed="rId20" cstate="none"/>
                     <a:srcRect/>
                     <a:stretch>
                       <a:fillRect/>
@@ -15344,7 +18527,7 @@
           <w:sz w:val="19"/>
           <w:szCs w:val="19"/>
         </w:rPr>
-        <w:t xml:space="preserve">Figure 12. Monthly performance and drift share.</w:t>
+        <w:t xml:space="preserve">Figure 13. Monthly performance and drift share.</w:t>
       </w:r>
     </w:p>
     <w:p>
@@ -15389,7 +18572,7 @@
           <w:sz w:val="22"/>
           <w:szCs w:val="22"/>
         </w:rPr>
-        <w:t xml:space="preserve">Operationally, the API exports Prometheus metrics (transactions, alerts, latency, score distribution, cold-start cards, feedback, monitoring verdict); Prometheus evaluates alert rules (API down, alert-rate spike, slow scoring, retraining recommended) and Grafana shows an operations dashboard and a ClickHouse business dashboard. Analyst verdicts recorded through /feedback close the loop into the next retraining; the runbook (docs/monitoring_runbook.md) describes promotion and rollback.</w:t>
+        <w:t xml:space="preserve">Operationally, the API exports Prometheus metrics (transactions, alerts, latency, score distribution, cold-start cards, feedback, monitoring verdict); Prometheus evaluates alert rules (API down, alert-rate spike, slow scoring, retraining recommended) and Grafana shows an operations dashboard and a ClickHouse business dashboard. In live operation the labels come from analyst decisions in the case store (section 8.2): live precision with its confidence interval, missed fraud reported on approved transactions, the review backlog and the time to decision are added to the monitoring summary and exported to Prometheus (with alert rules for low live precision and a growing backlog), and the decided cases are exported as labelled examples for retraining. Because analysts only label alerted transactions, chargeback labels for non-alerted transactions are combined with them before retraining. The runbook (docs/monitoring_runbook.md) describes promotion and rollback.</w:t>
       </w:r>
     </w:p>
     <w:p>
@@ -15469,7 +18652,7 @@
           <w:sz w:val="19"/>
           <w:szCs w:val="19"/>
         </w:rPr>
-        <w:t xml:space="preserve">Table 17. Verification checks by lifecycle stage (final run).</w:t>
+        <w:t xml:space="preserve">Table 20. Verification checks by lifecycle stage (final run).</w:t>
       </w:r>
     </w:p>
     <w:tbl>
@@ -16374,7 +19557,33 @@
           <w:sz w:val="22"/>
           <w:szCs w:val="22"/>
         </w:rPr>
-        <w:t xml:space="preserve"> Sparkov's fraud patterns are cleaner than real ones, so absolute results are optimistic. The method, evaluation protocol and platform are what transfer.</w:t>
+        <w:t xml:space="preserve"> Sparkov's fraud patterns are cleaner than real ones, so absolute results are optimistic; at a real-world fraud rate of 0.1% the same recall and false-alarm rate would give about 40% precision (section 7.5). The method, evaluation protocol and platform are what transfer, and a shadow-mode trial on real transactions comes before any savings claim.</w:t>
+      </w:r>
+    </w:p>
+    <w:p>
+      <w:pPr>
+        <w:pStyle w:val="ListParagraph"/>
+        <w:numPr>
+          <w:ilvl w:val="0"/>
+          <w:numId w:val="3"/>
+        </w:numPr>
+        <w:spacing w:after="80" w:line="276"/>
+      </w:pPr>
+      <w:r>
+        <w:rPr>
+          <w:b/>
+          <w:bCs/>
+          <w:sz w:val="22"/>
+          <w:szCs w:val="22"/>
+        </w:rPr>
+        <w:t xml:space="preserve">Estimated, not demonstrated, savings.</w:t>
+      </w:r>
+      <w:r>
+        <w:rPr>
+          <w:sz w:val="22"/>
+          <w:szCs w:val="22"/>
+        </w:rPr>
+        <w:t xml:space="preserve"> The net benefit rests on an assumed $15 review cost and 90% recovery rate; it ranks operating points but is not a measured saving.</w:t>
       </w:r>
     </w:p>
     <w:p>
@@ -16801,7 +20010,7 @@
       <w:pPr>
         <w:spacing w:after="80"/>
       </w:pPr>
-      <w:hyperlink w:history="1" r:id="rId4qfejet93xujtngl49_gj">
+      <w:hyperlink w:history="1" r:id="rIdzo83ildhch0xsoim_fddq">
         <w:r>
           <w:rPr>
             <w:rStyle w:val="Hyperlink"/>
@@ -16838,7 +20047,7 @@
           <w:sz w:val="19"/>
           <w:szCs w:val="19"/>
         </w:rPr>
-        <w:t xml:space="preserve">Table 18. All 56 end-to-end verification checks from the final run.</w:t>
+        <w:t xml:space="preserve">Table 21. All 56 end-to-end verification checks from the final run.</w:t>
       </w:r>
     </w:p>
     <w:tbl>

</xml_diff>

<commit_message>
Record the 16-check platform run and the feedback items in the project plan
</commit_message>
<xml_diff>
--- a/deliverables/FraudLens_Final_Report.docx
+++ b/deliverables/FraudLens_Final_Report.docx
@@ -14216,7 +14216,7 @@
           <w:sz w:val="19"/>
           <w:szCs w:val="19"/>
         </w:rPr>
-        <w:t xml:space="preserve">Table 16. Same questions, two engines (median of five runs; platform workflow run 39430878611, sample data on a GitHub runner).</w:t>
+        <w:t xml:space="preserve">Table 16. Same questions, two engines (median of five runs; platform workflow run 39545146510, sample data on a GitHub runner).</w:t>
       </w:r>
     </w:p>
     <w:tbl>
@@ -14399,7 +14399,7 @@
                 <w:sz w:val="18"/>
                 <w:szCs w:val="18"/>
               </w:rPr>
-              <w:t xml:space="preserve">292.6</w:t>
+              <w:t xml:space="preserve">227</w:t>
             </w:r>
           </w:p>
         </w:tc>
@@ -14425,7 +14425,7 @@
                 <w:sz w:val="18"/>
                 <w:szCs w:val="18"/>
               </w:rPr>
-              <w:t xml:space="preserve">14.8</w:t>
+              <w:t xml:space="preserve">8.5</w:t>
             </w:r>
           </w:p>
         </w:tc>
@@ -14505,7 +14505,7 @@
                 <w:sz w:val="18"/>
                 <w:szCs w:val="18"/>
               </w:rPr>
-              <w:t xml:space="preserve">225.6</w:t>
+              <w:t xml:space="preserve">180.2</w:t>
             </w:r>
           </w:p>
         </w:tc>
@@ -14531,7 +14531,7 @@
                 <w:sz w:val="18"/>
                 <w:szCs w:val="18"/>
               </w:rPr>
-              <w:t xml:space="preserve">16.3</w:t>
+              <w:t xml:space="preserve">10.2</w:t>
             </w:r>
           </w:p>
         </w:tc>
@@ -14611,7 +14611,7 @@
                 <w:sz w:val="18"/>
                 <w:szCs w:val="18"/>
               </w:rPr>
-              <w:t xml:space="preserve">212</w:t>
+              <w:t xml:space="preserve">200</w:t>
             </w:r>
           </w:p>
         </w:tc>
@@ -14637,7 +14637,7 @@
                 <w:sz w:val="18"/>
                 <w:szCs w:val="18"/>
               </w:rPr>
-              <w:t xml:space="preserve">10.6</w:t>
+              <w:t xml:space="preserve">6.4</w:t>
             </w:r>
           </w:p>
         </w:tc>
@@ -14717,7 +14717,7 @@
                 <w:sz w:val="18"/>
                 <w:szCs w:val="18"/>
               </w:rPr>
-              <w:t xml:space="preserve">232.3</w:t>
+              <w:t xml:space="preserve">168.7</w:t>
             </w:r>
           </w:p>
         </w:tc>
@@ -14743,7 +14743,7 @@
                 <w:sz w:val="18"/>
                 <w:szCs w:val="18"/>
               </w:rPr>
-              <w:t xml:space="preserve">9.9</w:t>
+              <w:t xml:space="preserve">5.4</w:t>
             </w:r>
           </w:p>
         </w:tc>
@@ -14798,7 +14798,7 @@
           <w:sz w:val="22"/>
           <w:szCs w:val="22"/>
         </w:rPr>
-        <w:t xml:space="preserve">The platform workflow starts every service on a GitHub runner, runs the whole lifecycle on synthetic sample data through NiFi, the lake, the crawler, Trino and ClickHouse, then checks each component. Run 39430878611 (commit 992cdc8) passed 14 of 14 smoke checks; its governance job catalogued 13 tables and views in OpenMetadata 1.13.4, tagged 29 PII columns and recorded 9 lineage edges from raw to gold.</w:t>
+        <w:t xml:space="preserve">The platform workflow starts every service on a GitHub runner, runs the whole lifecycle on synthetic sample data through NiFi, the lake, the crawler, Trino and ClickHouse, then checks each component. Run 39545146510 (commit 0bf9d69) passed 16 of 16 smoke checks; its governance job catalogued 13 tables and views in OpenMetadata 1.13.4, tagged 29 PII columns and recorded 9 lineage edges from raw to gold.</w:t>
       </w:r>
     </w:p>
     <w:p>
@@ -15769,6 +15769,166 @@
                 <w:szCs w:val="18"/>
               </w:rPr>
               <w:t xml:space="preserve">scoring API is healthy and scores a transaction</w:t>
+            </w:r>
+          </w:p>
+        </w:tc>
+        <w:tc>
+          <w:tcPr>
+            <w:tcW w:type="dxa" w:w="1440"/>
+            <w:tcMar>
+              <w:top w:type="dxa" w:w="50"/>
+              <w:left w:type="dxa" w:w="80"/>
+              <w:bottom w:type="dxa" w:w="50"/>
+              <w:right w:type="dxa" w:w="80"/>
+            </w:tcMar>
+          </w:tcPr>
+          <w:p>
+            <w:pPr>
+              <w:spacing w:after="0" w:line="240"/>
+              <w:jc w:val="left"/>
+            </w:pPr>
+            <w:r>
+              <w:rPr>
+                <w:b w:val="false"/>
+                <w:bCs w:val="false"/>
+                <w:sz w:val="18"/>
+                <w:szCs w:val="18"/>
+              </w:rPr>
+              <w:t xml:space="preserve">Pass</w:t>
+            </w:r>
+          </w:p>
+        </w:tc>
+      </w:tr>
+      <w:tr>
+        <w:tc>
+          <w:tcPr>
+            <w:tcW w:type="dxa" w:w="1440"/>
+            <w:tcMar>
+              <w:top w:type="dxa" w:w="50"/>
+              <w:left w:type="dxa" w:w="80"/>
+              <w:bottom w:type="dxa" w:w="50"/>
+              <w:right w:type="dxa" w:w="80"/>
+            </w:tcMar>
+          </w:tcPr>
+          <w:p>
+            <w:pPr>
+              <w:spacing w:after="0" w:line="240"/>
+              <w:jc w:val="left"/>
+            </w:pPr>
+            <w:r>
+              <w:rPr>
+                <w:b w:val="false"/>
+                <w:bCs w:val="false"/>
+                <w:sz w:val="18"/>
+                <w:szCs w:val="18"/>
+              </w:rPr>
+              <w:t xml:space="preserve">api</w:t>
+            </w:r>
+          </w:p>
+        </w:tc>
+        <w:tc>
+          <w:tcPr>
+            <w:tcW w:type="dxa" w:w="6480"/>
+            <w:tcMar>
+              <w:top w:type="dxa" w:w="50"/>
+              <w:left w:type="dxa" w:w="80"/>
+              <w:bottom w:type="dxa" w:w="50"/>
+              <w:right w:type="dxa" w:w="80"/>
+            </w:tcMar>
+          </w:tcPr>
+          <w:p>
+            <w:pPr>
+              <w:spacing w:after="0" w:line="240"/>
+              <w:jc w:val="left"/>
+            </w:pPr>
+            <w:r>
+              <w:rPr>
+                <w:b w:val="false"/>
+                <w:bCs w:val="false"/>
+                <w:sz w:val="18"/>
+                <w:szCs w:val="18"/>
+              </w:rPr>
+              <w:t xml:space="preserve">access control: no key is refused, a scorer cannot review</w:t>
+            </w:r>
+          </w:p>
+        </w:tc>
+        <w:tc>
+          <w:tcPr>
+            <w:tcW w:type="dxa" w:w="1440"/>
+            <w:tcMar>
+              <w:top w:type="dxa" w:w="50"/>
+              <w:left w:type="dxa" w:w="80"/>
+              <w:bottom w:type="dxa" w:w="50"/>
+              <w:right w:type="dxa" w:w="80"/>
+            </w:tcMar>
+          </w:tcPr>
+          <w:p>
+            <w:pPr>
+              <w:spacing w:after="0" w:line="240"/>
+              <w:jc w:val="left"/>
+            </w:pPr>
+            <w:r>
+              <w:rPr>
+                <w:b w:val="false"/>
+                <w:bCs w:val="false"/>
+                <w:sz w:val="18"/>
+                <w:szCs w:val="18"/>
+              </w:rPr>
+              <w:t xml:space="preserve">Pass</w:t>
+            </w:r>
+          </w:p>
+        </w:tc>
+      </w:tr>
+      <w:tr>
+        <w:tc>
+          <w:tcPr>
+            <w:tcW w:type="dxa" w:w="1440"/>
+            <w:tcMar>
+              <w:top w:type="dxa" w:w="50"/>
+              <w:left w:type="dxa" w:w="80"/>
+              <w:bottom w:type="dxa" w:w="50"/>
+              <w:right w:type="dxa" w:w="80"/>
+            </w:tcMar>
+          </w:tcPr>
+          <w:p>
+            <w:pPr>
+              <w:spacing w:after="0" w:line="240"/>
+              <w:jc w:val="left"/>
+            </w:pPr>
+            <w:r>
+              <w:rPr>
+                <w:b w:val="false"/>
+                <w:bCs w:val="false"/>
+                <w:sz w:val="18"/>
+                <w:szCs w:val="18"/>
+              </w:rPr>
+              <w:t xml:space="preserve">api</w:t>
+            </w:r>
+          </w:p>
+        </w:tc>
+        <w:tc>
+          <w:tcPr>
+            <w:tcW w:type="dxa" w:w="6480"/>
+            <w:tcMar>
+              <w:top w:type="dxa" w:w="50"/>
+              <w:left w:type="dxa" w:w="80"/>
+              <w:bottom w:type="dxa" w:w="50"/>
+              <w:right w:type="dxa" w:w="80"/>
+            </w:tcMar>
+          </w:tcPr>
+          <w:p>
+            <w:pPr>
+              <w:spacing w:after="0" w:line="240"/>
+              <w:jc w:val="left"/>
+            </w:pPr>
+            <w:r>
+              <w:rPr>
+                <w:b w:val="false"/>
+                <w:bCs w:val="false"/>
+                <w:sz w:val="18"/>
+                <w:szCs w:val="18"/>
+              </w:rPr>
+              <w:t xml:space="preserve">a new alert reaches the review queue and its decision reaches monitoring</w:t>
             </w:r>
           </w:p>
         </w:tc>
@@ -18628,7 +18788,7 @@
           <w:sz w:val="22"/>
           <w:szCs w:val="22"/>
         </w:rPr>
-        <w:t xml:space="preserve">Three GitHub Actions workflows: ci (unit and end-to-end tests of the whole lifecycle on synthetic sample data, plus a headless render of the dashboard from the committed bundle), platform (the complete Docker platform on a runner: NiFi ingest, MinIO, Hive Metastore, Trino governance, ClickHouse, MLflow, API, Prometheus, Grafana, Superset, and a second job for OpenMetadata, checked by a smoke test of every component), and deploy (build, smoke-test and publish the application image). In platform run 39430878611 14 of 14 smoke checks passed and the governance job succeeded.</w:t>
+        <w:t xml:space="preserve">Three GitHub Actions workflows: ci (unit and end-to-end tests of the whole lifecycle on synthetic sample data, plus a headless render of the dashboard from the committed bundle), platform (the complete Docker platform on a runner: NiFi ingest, MinIO, Hive Metastore, Trino governance, ClickHouse, MLflow, API, Prometheus, Grafana, Superset, and a second job for OpenMetadata, checked by a smoke test of every component), and deploy (build, smoke-test and publish the application image). In platform run 39545146510 16 of 16 smoke checks passed and the governance job succeeded.</w:t>
       </w:r>
     </w:p>
     <w:p>
@@ -20010,7 +20170,7 @@
       <w:pPr>
         <w:spacing w:after="80"/>
       </w:pPr>
-      <w:hyperlink w:history="1" r:id="rIdzo83ildhch0xsoim_fddq">
+      <w:hyperlink w:history="1" r:id="rIdr3h6ikwb1atmqo9d2a_kw">
         <w:r>
           <w:rPr>
             <w:rStyle w:val="Hyperlink"/>

</xml_diff>